<commit_message>
Simplify course branding and separate website title and subtitle
</commit_message>
<xml_diff>
--- a/src/achprak/web/static/materials/protokollvorlage.docx
+++ b/src/achprak/web/static/materials/protokollvorlage.docx
@@ -7,12 +7,25 @@
         <w:pStyle w:val="Title"/>
       </w:pPr>
       <w:r>
-        <w:t>Photoschalter</w:t>
+        <w:t>Molekulare Photoschalter</w:t>
+      </w:r>
+    </w:p>
+    <w:p>
+      <w:pPr>
+        <w:pStyle w:val="Subtitle"/>
+      </w:pPr>
+      <w:r>
+        <w:t>Wie Licht die Struktur von Molekülen verändert</w:t>
       </w:r>
     </w:p>
     <w:p>
       <w:r>
-        <w:t>Praktikumsprotokoll · AChPrak</w:t>
+        <w:t>ACh-Pr · TC Versuch</w:t>
+      </w:r>
+    </w:p>
+    <w:p>
+      <w:r>
+        <w:t>Praktikumsprotokoll</w:t>
       </w:r>
     </w:p>
     <w:p>
@@ -3867,7 +3880,7 @@
         <w:color w:val="586B80"/>
         <w:sz w:val="18"/>
       </w:rPr>
-      <w:t xml:space="preserve">AChPrak · Photoschalter    |    </w:t>
+      <w:t xml:space="preserve">ACh-Pr · TC Versuch    |    </w:t>
     </w:r>
     <w:fldSimple w:instr="PAGE"/>
   </w:p>
@@ -4627,14 +4640,15 @@
       <w:numPr>
         <w:ilvl w:val="1"/>
       </w:numPr>
+      <w:spacing w:after="200"/>
     </w:pPr>
     <w:rPr>
-      <w:rFonts w:asciiTheme="majorHAnsi" w:eastAsiaTheme="majorEastAsia" w:hAnsiTheme="majorHAnsi" w:cstheme="majorBidi"/>
+      <w:rFonts w:asciiTheme="majorHAnsi" w:eastAsiaTheme="majorEastAsia" w:hAnsiTheme="majorHAnsi" w:cstheme="majorBidi" w:ascii="Arial" w:hAnsi="Arial"/>
       <w:i/>
       <w:iCs/>
-      <w:color w:val="4F81BD" w:themeColor="accent1"/>
+      <w:color w:val="586B80"/>
       <w:spacing w:val="15"/>
-      <w:sz w:val="24"/>
+      <w:sz w:val="28"/>
       <w:szCs w:val="24"/>
     </w:rPr>
   </w:style>

</xml_diff>

<commit_message>
Condense practical tasks and protocol
</commit_message>
<xml_diff>
--- a/src/achprak/web/static/materials/protokollvorlage.docx
+++ b/src/achprak/web/static/materials/protokollvorlage.docx
@@ -15,7 +15,7 @@
         <w:pStyle w:val="Subtitle"/>
       </w:pPr>
       <w:r>
-        <w:t>Wie Licht die Struktur von Molekülen verändert</w:t>
+        <w:t>Struktur, Energie und Absorption im Vergleich</w:t>
       </w:r>
     </w:p>
     <w:p>
@@ -48,7 +48,7 @@
         <w:pStyle w:val="Heading1"/>
       </w:pPr>
       <w:r>
-        <w:t>Struktur erstellen</w:t>
+        <w:t>Strukturen erstellen</w:t>
       </w:r>
     </w:p>
     <w:p>
@@ -56,12 +56,12 @@
         <w:pStyle w:val="Heading2"/>
       </w:pPr>
       <w:r>
-        <w:t>Substituenten setzen</w:t>
+        <w:t>Konfigurationen erkennen</w:t>
       </w:r>
     </w:p>
     <w:p>
       <w:r>
-        <w:t>Speichern Sie jede Strukturformel mit „Bild speichern“ und fügen Sie das Bild in Ihr Protokoll ein. Beschriften Sie jedes Bild mit dem entsprechenden Namen.</w:t>
+        <w:t>Notieren Sie den Namen Ihres Derivats. Erklären Sie in höchstens zwei Sätzen, ob sich Zusammensetzung, die Verknüpfung der Atome oder die räumliche Anordnung zwischen cis- und trans-Azobenzol unterscheiden und warum eine Drehung des gesamten Modells sie nicht ineinander überführt.</w:t>
       </w:r>
     </w:p>
     <w:p>
@@ -69,7 +69,7 @@
         <w:rPr>
           <w:color w:val="586B80"/>
         </w:rPr>
-        <w:t>trans-4-Nitroazobenzol: [Strukturformel einfügen]</w:t>
+        <w:t>Name des selbst gewählten Derivats: [Name einschließlich Konfiguration]</w:t>
       </w:r>
     </w:p>
     <w:p>
@@ -77,52 +77,7 @@
         <w:rPr>
           <w:color w:val="586B80"/>
         </w:rPr>
-        <w:t>cis-4,4′-Dimethylazobenzol: [Strukturformel einfügen]</w:t>
-      </w:r>
-    </w:p>
-    <w:p>
-      <w:r>
-        <w:rPr>
-          <w:color w:val="586B80"/>
-        </w:rPr>
-        <w:t>trans-2-Methyl-4-methoxy-4′-nitroazobenzol: [Strukturformel einfügen]</w:t>
-      </w:r>
-    </w:p>
-    <w:p>
-      <w:pPr>
-        <w:pStyle w:val="Heading2"/>
-      </w:pPr>
-      <w:r>
-        <w:t>Räumliche Anordnung der Substituenten</w:t>
-      </w:r>
-    </w:p>
-    <w:p>
-      <w:r>
-        <w:t>Benennen Sie das vierfach mit Methoxygruppen substituierte Molekül. Fügen Sie die cis- und trans-Strukturformeln ein. Was ändert sich beim Wechsel zwischen cis und trans: die Zusammensetzung, die Verknüpfung der Atome oder ihre räumliche Anordnung? Beschreiben Sie Überlagerungen in der Zeichnung und erläutern Sie, was daraus über die räumliche Anordnung folgt und was nicht.</w:t>
-      </w:r>
-    </w:p>
-    <w:p>
-      <w:r>
-        <w:rPr>
-          <w:color w:val="586B80"/>
-        </w:rPr>
-        <w:t>[Name und zwei Strukturformeln]</w:t>
-      </w:r>
-    </w:p>
-    <w:p>
-      <w:r>
-        <w:rPr>
-          <w:color w:val="586B80"/>
-        </w:rPr>
-        <w:t>Änderung beim Wechsel zwischen cis und trans: [Text]</w:t>
-      </w:r>
-    </w:p>
-    <w:p>
-      <w:r>
-        <w:rPr>
-          <w:color w:val="586B80"/>
-        </w:rPr>
-        <w:t>Überlagerungen in der Zeichnung und räumliche Anordnung: [Text]</w:t>
+        <w:t>Unterschied zwischen cis und trans: [höchstens zwei Sätze]</w:t>
       </w:r>
     </w:p>
     <w:p>
@@ -135,7 +90,7 @@
         <w:pStyle w:val="Heading1"/>
       </w:pPr>
       <w:r>
-        <w:t>Startstrukturen untersuchen</w:t>
+        <w:t>Geometrien und Energiebarrieren untersuchen</w:t>
       </w:r>
     </w:p>
     <w:p>
@@ -143,660 +98,12 @@
         <w:pStyle w:val="Heading2"/>
       </w:pPr>
       <w:r>
-        <w:t>Planarität</w:t>
+        <w:t>Minimumstrukturen vergleichen</w:t>
       </w:r>
     </w:p>
     <w:p>
       <w:r>
-        <w:t>Beschreiben Sie für beide Startstrukturen, welche Atome in einer Ebene liegen. Belegen Sie Ihre Beobachtung mit geeigneten 3D-Ansichten.</w:t>
-      </w:r>
-    </w:p>
-    <w:p>
-      <w:r>
-        <w:rPr>
-          <w:color w:val="586B80"/>
-        </w:rPr>
-        <w:t>[Beobachtung und 3D-Ansicht]</w:t>
-      </w:r>
-    </w:p>
-    <w:p>
-      <w:pPr>
-        <w:pStyle w:val="Heading2"/>
-      </w:pPr>
-      <w:r>
-        <w:t>Räumlicher Einfluss der Substituenten</w:t>
-      </w:r>
-    </w:p>
-    <w:p>
-      <w:r>
-        <w:t>Beschreiben Sie, welche Methoxygruppen außerhalb der Ringebenen liegen und wo sich Atome besonders nahe kommen. Vergleichen Sie Ihre Beobachtung mit der Strukturformel und fügen Sie eine geeignete 3D-Ansicht ein.</w:t>
-      </w:r>
-    </w:p>
-    <w:p>
-      <w:r>
-        <w:rPr>
-          <w:color w:val="586B80"/>
-        </w:rPr>
-        <w:t>[Beobachtung und 3D-Ansicht]</w:t>
-      </w:r>
-    </w:p>
-    <w:p>
-      <w:pPr>
-        <w:pStyle w:val="Heading2"/>
-      </w:pPr>
-      <w:r>
-        <w:t>Energieunterschied der Startstrukturen</w:t>
-      </w:r>
-    </w:p>
-    <w:p>
-      <w:r>
-        <w:t xml:space="preserve">Notieren Sie die elektronischen Energien der cis- und trans-Startstruktur in eV (Elektronenvolt). Berechnen Sie ΔE = </w:t>
-      </w:r>
-      <w:r>
-        <w:t>E</w:t>
-      </w:r>
-      <w:r>
-        <w:rPr>
-          <w:vertAlign w:val="subscript"/>
-        </w:rPr>
-        <w:t>trans</w:t>
-      </w:r>
-      <w:r>
-        <w:t xml:space="preserve"> − </w:t>
-      </w:r>
-      <w:r>
-        <w:t>E</w:t>
-      </w:r>
-      <w:r>
-        <w:rPr>
-          <w:vertAlign w:val="subscript"/>
-        </w:rPr>
-        <w:t>cis</w:t>
-      </w:r>
-      <w:r>
-        <w:t xml:space="preserve"> in kJ/mol (Kilojoule pro Mol), erläutern Sie das Vorzeichen und nennen Sie die energieärmere Startstruktur. Nutzen Sie „Einheiten umrechnen“. Diese Werte beschreiben noch keine optimierten Minima.</w:t>
-      </w:r>
-    </w:p>
-    <w:tbl>
-      <w:tblPr>
-        <w:tblW w:type="auto" w:w="0"/>
-        <w:tblLayout w:type="fixed"/>
-        <w:tblLook w:firstColumn="1" w:firstRow="1" w:lastColumn="0" w:lastRow="0" w:noHBand="0" w:noVBand="1" w:val="04A0"/>
-      </w:tblPr>
-      <w:tblGrid>
-        <w:gridCol w:w="3402"/>
-        <w:gridCol w:w="6236"/>
-      </w:tblGrid>
-      <w:tr>
-        <w:trPr>
-          <w:cantSplit/>
-          <w:tblHeader/>
-        </w:trPr>
-        <w:tc>
-          <w:tcPr>
-            <w:tcW w:type="dxa" w:w="3402"/>
-            <w:shd w:fill="102238"/>
-            <w:tcMar>
-              <w:top w:w="90" w:type="dxa"/>
-              <w:left w:w="90" w:type="dxa"/>
-              <w:bottom w:w="90" w:type="dxa"/>
-              <w:right w:w="90" w:type="dxa"/>
-            </w:tcMar>
-            <w:tcBorders>
-              <w:top w:val="single" w:sz="4" w:color="D9D9D9"/>
-              <w:left w:val="single" w:sz="4" w:color="D9D9D9"/>
-              <w:bottom w:val="single" w:sz="4" w:color="D9D9D9"/>
-              <w:right w:val="single" w:sz="4" w:color="D9D9D9"/>
-            </w:tcBorders>
-            <w:vAlign w:val="center"/>
-          </w:tcPr>
-          <w:p>
-            <w:pPr>
-              <w:spacing w:after="40"/>
-            </w:pPr>
-            <w:r>
-              <w:rPr>
-                <w:b/>
-                <w:color w:val="FFFFFF"/>
-                <w:sz w:val="18"/>
-              </w:rPr>
-              <w:t>Startstruktur</w:t>
-            </w:r>
-          </w:p>
-        </w:tc>
-        <w:tc>
-          <w:tcPr>
-            <w:tcW w:type="dxa" w:w="6236"/>
-            <w:shd w:fill="102238"/>
-            <w:tcMar>
-              <w:top w:w="90" w:type="dxa"/>
-              <w:left w:w="90" w:type="dxa"/>
-              <w:bottom w:w="90" w:type="dxa"/>
-              <w:right w:w="90" w:type="dxa"/>
-            </w:tcMar>
-            <w:tcBorders>
-              <w:top w:val="single" w:sz="4" w:color="D9D9D9"/>
-              <w:left w:val="single" w:sz="4" w:color="D9D9D9"/>
-              <w:bottom w:val="single" w:sz="4" w:color="D9D9D9"/>
-              <w:right w:val="single" w:sz="4" w:color="D9D9D9"/>
-            </w:tcBorders>
-            <w:vAlign w:val="center"/>
-          </w:tcPr>
-          <w:p>
-            <w:pPr>
-              <w:spacing w:after="40"/>
-            </w:pPr>
-            <w:r>
-              <w:rPr>
-                <w:b/>
-                <w:color w:val="FFFFFF"/>
-                <w:sz w:val="18"/>
-              </w:rPr>
-              <w:t>Elektronische Energie / eV</w:t>
-            </w:r>
-          </w:p>
-        </w:tc>
-      </w:tr>
-      <w:tr>
-        <w:trPr>
-          <w:cantSplit/>
-        </w:trPr>
-        <w:tc>
-          <w:tcPr>
-            <w:tcW w:type="dxa" w:w="3402"/>
-            <w:shd w:fill="F3F6FA"/>
-            <w:tcMar>
-              <w:top w:w="90" w:type="dxa"/>
-              <w:left w:w="90" w:type="dxa"/>
-              <w:bottom w:w="90" w:type="dxa"/>
-              <w:right w:w="90" w:type="dxa"/>
-            </w:tcMar>
-            <w:tcBorders>
-              <w:top w:val="single" w:sz="4" w:color="D9D9D9"/>
-              <w:left w:val="single" w:sz="4" w:color="D9D9D9"/>
-              <w:bottom w:val="single" w:sz="4" w:color="D9D9D9"/>
-              <w:right w:val="single" w:sz="4" w:color="D9D9D9"/>
-            </w:tcBorders>
-            <w:vAlign w:val="center"/>
-          </w:tcPr>
-          <w:p>
-            <w:pPr>
-              <w:spacing w:after="40"/>
-            </w:pPr>
-            <w:r>
-              <w:rPr>
-                <w:sz w:val="18"/>
-              </w:rPr>
-              <w:t>cis</w:t>
-            </w:r>
-          </w:p>
-        </w:tc>
-        <w:tc>
-          <w:tcPr>
-            <w:tcW w:type="dxa" w:w="6236"/>
-            <w:shd w:fill="F3F6FA"/>
-            <w:tcMar>
-              <w:top w:w="90" w:type="dxa"/>
-              <w:left w:w="90" w:type="dxa"/>
-              <w:bottom w:w="90" w:type="dxa"/>
-              <w:right w:w="90" w:type="dxa"/>
-            </w:tcMar>
-            <w:tcBorders>
-              <w:top w:val="single" w:sz="4" w:color="D9D9D9"/>
-              <w:left w:val="single" w:sz="4" w:color="D9D9D9"/>
-              <w:bottom w:val="single" w:sz="4" w:color="D9D9D9"/>
-              <w:right w:val="single" w:sz="4" w:color="D9D9D9"/>
-            </w:tcBorders>
-            <w:vAlign w:val="center"/>
-          </w:tcPr>
-          <w:p>
-            <w:pPr>
-              <w:spacing w:after="40"/>
-            </w:pPr>
-            <w:r>
-              <w:rPr>
-                <w:sz w:val="18"/>
-              </w:rPr>
-              <w:t>[Wert]</w:t>
-            </w:r>
-          </w:p>
-        </w:tc>
-      </w:tr>
-      <w:tr>
-        <w:trPr>
-          <w:cantSplit/>
-        </w:trPr>
-        <w:tc>
-          <w:tcPr>
-            <w:tcW w:type="dxa" w:w="3402"/>
-            <w:shd w:fill="FFFFFF"/>
-            <w:tcMar>
-              <w:top w:w="90" w:type="dxa"/>
-              <w:left w:w="90" w:type="dxa"/>
-              <w:bottom w:w="90" w:type="dxa"/>
-              <w:right w:w="90" w:type="dxa"/>
-            </w:tcMar>
-            <w:tcBorders>
-              <w:top w:val="single" w:sz="4" w:color="D9D9D9"/>
-              <w:left w:val="single" w:sz="4" w:color="D9D9D9"/>
-              <w:bottom w:val="single" w:sz="4" w:color="D9D9D9"/>
-              <w:right w:val="single" w:sz="4" w:color="D9D9D9"/>
-            </w:tcBorders>
-            <w:vAlign w:val="center"/>
-          </w:tcPr>
-          <w:p>
-            <w:pPr>
-              <w:spacing w:after="40"/>
-            </w:pPr>
-            <w:r>
-              <w:rPr>
-                <w:sz w:val="18"/>
-              </w:rPr>
-              <w:t>trans</w:t>
-            </w:r>
-          </w:p>
-        </w:tc>
-        <w:tc>
-          <w:tcPr>
-            <w:tcW w:type="dxa" w:w="6236"/>
-            <w:shd w:fill="FFFFFF"/>
-            <w:tcMar>
-              <w:top w:w="90" w:type="dxa"/>
-              <w:left w:w="90" w:type="dxa"/>
-              <w:bottom w:w="90" w:type="dxa"/>
-              <w:right w:w="90" w:type="dxa"/>
-            </w:tcMar>
-            <w:tcBorders>
-              <w:top w:val="single" w:sz="4" w:color="D9D9D9"/>
-              <w:left w:val="single" w:sz="4" w:color="D9D9D9"/>
-              <w:bottom w:val="single" w:sz="4" w:color="D9D9D9"/>
-              <w:right w:val="single" w:sz="4" w:color="D9D9D9"/>
-            </w:tcBorders>
-            <w:vAlign w:val="center"/>
-          </w:tcPr>
-          <w:p>
-            <w:pPr>
-              <w:spacing w:after="40"/>
-            </w:pPr>
-            <w:r>
-              <w:rPr>
-                <w:sz w:val="18"/>
-              </w:rPr>
-              <w:t>[Wert]</w:t>
-            </w:r>
-          </w:p>
-        </w:tc>
-      </w:tr>
-    </w:tbl>
-    <w:p>
-      <w:r/>
-    </w:p>
-    <w:p>
-      <w:r>
-        <w:rPr>
-          <w:color w:val="586B80"/>
-        </w:rPr>
-        <w:t>ΔE / (kJ/mol): [Wert]</w:t>
-        <w:br/>
-        <w:t>Vorzeichen und energieärmere Startstruktur: [Text]</w:t>
-      </w:r>
-    </w:p>
-    <w:p>
-      <w:pPr>
-        <w:pStyle w:val="Heading2"/>
-      </w:pPr>
-      <w:r>
-        <w:t>Diederwinkel</w:t>
-      </w:r>
-    </w:p>
-    <w:p>
-      <w:r>
-        <w:t>Notieren Sie den geschätzten und den berechneten C–N=N–C-Diederwinkel der trans-Startstruktur sowie den berechneten Winkel der cis-Startstruktur in Grad (°). Vergleichen Sie Ihre Schätzung mit dem berechneten Wert.</w:t>
-      </w:r>
-    </w:p>
-    <w:p>
-      <w:r>
-        <w:rPr>
-          <w:color w:val="586B80"/>
-        </w:rPr>
-        <w:t>trans geschätzt: [Wert] °    trans berechnet: [Wert] °    cis berechnet: [Wert] °</w:t>
-      </w:r>
-    </w:p>
-    <w:p>
-      <w:pPr>
-        <w:pStyle w:val="Heading2"/>
-      </w:pPr>
-      <w:r>
-        <w:t>Ringabstand</w:t>
-      </w:r>
-    </w:p>
-    <w:p>
-      <w:r>
-        <w:t>Notieren Sie die Ringabstände beider Startstrukturen in pm (Pikometer). Beschreiben Sie, zwischen welchen Punkten der Abstand gemessen wird.</w:t>
-      </w:r>
-    </w:p>
-    <w:p>
-      <w:r>
-        <w:rPr>
-          <w:color w:val="586B80"/>
-        </w:rPr>
-        <w:t>cis: [Wert] pm    trans: [Wert] pm</w:t>
-        <w:br/>
-        <w:t>Definition des Ringabstands: [Text]</w:t>
-      </w:r>
-    </w:p>
-    <w:p>
-      <w:r>
-        <w:br w:type="page"/>
-      </w:r>
-    </w:p>
-    <w:p>
-      <w:pPr>
-        <w:pStyle w:val="Heading1"/>
-      </w:pPr>
-      <w:r>
-        <w:t>Minima und Übergangszustand</w:t>
-      </w:r>
-    </w:p>
-    <w:p>
-      <w:pPr>
-        <w:pStyle w:val="Heading2"/>
-      </w:pPr>
-      <w:r>
-        <w:t>Optimierte Strukturen vergleichen</w:t>
-      </w:r>
-    </w:p>
-    <w:p>
-      <w:r>
-        <w:t xml:space="preserve">Notieren Sie die elektronischen Energien der optimierten cis- und trans-Minima in eV und ΔE = </w:t>
-      </w:r>
-      <w:r>
-        <w:t>E</w:t>
-      </w:r>
-      <w:r>
-        <w:rPr>
-          <w:vertAlign w:val="subscript"/>
-        </w:rPr>
-        <w:t>trans</w:t>
-      </w:r>
-      <w:r>
-        <w:t xml:space="preserve"> − </w:t>
-      </w:r>
-      <w:r>
-        <w:t>E</w:t>
-      </w:r>
-      <w:r>
-        <w:rPr>
-          <w:vertAlign w:val="subscript"/>
-        </w:rPr>
-        <w:t>cis</w:t>
-      </w:r>
-      <w:r>
-        <w:t xml:space="preserve"> in kJ/mol. Vergleichen Sie Planarität und Energieunterschied mit den Startstrukturen. Geben Sie an, welches Minimum die niedrigere Energie hat. Die gefundenen lokalen Minima sind nicht notwendigerweise globale Minima.</w:t>
-      </w:r>
-    </w:p>
-    <w:p>
-      <w:r>
-        <w:rPr>
-          <w:color w:val="586B80"/>
-        </w:rPr>
-      </w:r>
-      <w:r>
-        <w:rPr>
-          <w:color w:val="586B80"/>
-        </w:rPr>
-        <w:t>E</w:t>
-      </w:r>
-      <w:r>
-        <w:rPr>
-          <w:color w:val="586B80"/>
-          <w:vertAlign w:val="subscript"/>
-        </w:rPr>
-        <w:t>cis</w:t>
-      </w:r>
-      <w:r>
-        <w:rPr>
-          <w:color w:val="586B80"/>
-        </w:rPr>
-        <w:t xml:space="preserve">: [Wert] eV    </w:t>
-      </w:r>
-      <w:r>
-        <w:rPr>
-          <w:color w:val="586B80"/>
-        </w:rPr>
-        <w:t>E</w:t>
-      </w:r>
-      <w:r>
-        <w:rPr>
-          <w:color w:val="586B80"/>
-          <w:vertAlign w:val="subscript"/>
-        </w:rPr>
-        <w:t>trans</w:t>
-      </w:r>
-      <w:r>
-        <w:rPr>
-          <w:color w:val="586B80"/>
-        </w:rPr>
-        <w:t>: [Wert] eV    ΔE: [Wert] kJ/mol</w:t>
-        <w:br/>
-        <w:t>Planarität und Vergleich mit den Startstrukturen: [Text]</w:t>
-      </w:r>
-    </w:p>
-    <w:p>
-      <w:pPr>
-        <w:pStyle w:val="Heading2"/>
-      </w:pPr>
-      <w:r>
-        <w:t>Übergangszustand</w:t>
-      </w:r>
-    </w:p>
-    <w:p>
-      <w:r>
-        <w:t>Fügen Sie das Energieprofil einer erfolgreichen Übergangszustandssuche ein. Beschreiben Sie die Geometrieänderungen entlang des berechneten Reaktionspfads, etwa Verdrehungen der Ringe oder Änderungen von Bindungslängen und Winkeln. Die Wiedergabe zeigt keinen tatsächlichen zeitlichen Ablauf.</w:t>
-      </w:r>
-    </w:p>
-    <w:p>
-      <w:r>
-        <w:rPr>
-          <w:color w:val="586B80"/>
-        </w:rPr>
-        <w:t>[Energieprofil und Beschreibung des Reaktionspfads]</w:t>
-      </w:r>
-    </w:p>
-    <w:p>
-      <w:pPr>
-        <w:pStyle w:val="Heading2"/>
-      </w:pPr>
-      <w:r>
-        <w:t>Elektronische Energiebarriere</w:t>
-      </w:r>
-    </w:p>
-    <w:p>
-      <w:r>
-        <w:t xml:space="preserve">Notieren Sie </w:t>
-      </w:r>
-      <w:r>
-        <w:t>E</w:t>
-      </w:r>
-      <w:r>
-        <w:rPr>
-          <w:vertAlign w:val="subscript"/>
-        </w:rPr>
-        <w:t>TS</w:t>
-      </w:r>
-      <w:r>
-        <w:t xml:space="preserve"> und </w:t>
-      </w:r>
-      <w:r>
-        <w:t>E</w:t>
-      </w:r>
-      <w:r>
-        <w:rPr>
-          <w:vertAlign w:val="subscript"/>
-        </w:rPr>
-        <w:t>trans</w:t>
-      </w:r>
-      <w:r>
-        <w:t xml:space="preserve"> aus derselben Suche vom trans-Minimum. Berechnen Sie die elektronische Energiebarriere </w:t>
-      </w:r>
-      <w:r>
-        <w:t>ΔE</w:t>
-      </w:r>
-      <w:r>
-        <w:rPr>
-          <w:vertAlign w:val="superscript"/>
-        </w:rPr>
-        <w:t>‡</w:t>
-      </w:r>
-      <w:r>
-        <w:t xml:space="preserve"> = </w:t>
-      </w:r>
-      <w:r>
-        <w:t>E</w:t>
-      </w:r>
-      <w:r>
-        <w:rPr>
-          <w:vertAlign w:val="subscript"/>
-        </w:rPr>
-        <w:t>TS</w:t>
-      </w:r>
-      <w:r>
-        <w:t xml:space="preserve"> − </w:t>
-      </w:r>
-      <w:r>
-        <w:t>E</w:t>
-      </w:r>
-      <w:r>
-        <w:rPr>
-          <w:vertAlign w:val="subscript"/>
-        </w:rPr>
-        <w:t>trans</w:t>
-      </w:r>
-      <w:r>
-        <w:t xml:space="preserve"> in kJ/mol und das Verhältnis </w:t>
-      </w:r>
-      <w:r>
-        <w:t>ΔE</w:t>
-      </w:r>
-      <w:r>
-        <w:rPr>
-          <w:vertAlign w:val="superscript"/>
-        </w:rPr>
-        <w:t>‡</w:t>
-      </w:r>
-      <w:r>
-        <w:t xml:space="preserve"> / RT mit RT ≈ 2,5 kJ/mol bei 298 K. Erläutern Sie, warum daraus allein keine Reaktionsgeschwindigkeit folgt. </w:t>
-      </w:r>
-      <w:r>
-        <w:t>ΔE</w:t>
-      </w:r>
-      <w:r>
-        <w:rPr>
-          <w:vertAlign w:val="superscript"/>
-        </w:rPr>
-        <w:t>‡</w:t>
-      </w:r>
-      <w:r>
-        <w:t xml:space="preserve"> enthält keine Nullpunkts-, thermischen oder entropischen Korrekturen.</w:t>
-      </w:r>
-    </w:p>
-    <w:p>
-      <w:r>
-        <w:rPr>
-          <w:color w:val="586B80"/>
-        </w:rPr>
-      </w:r>
-      <w:r>
-        <w:rPr>
-          <w:color w:val="586B80"/>
-        </w:rPr>
-        <w:t>E</w:t>
-      </w:r>
-      <w:r>
-        <w:rPr>
-          <w:color w:val="586B80"/>
-          <w:vertAlign w:val="subscript"/>
-        </w:rPr>
-        <w:t>TS</w:t>
-      </w:r>
-      <w:r>
-        <w:rPr>
-          <w:color w:val="586B80"/>
-        </w:rPr>
-        <w:t xml:space="preserve">: [Wert] eV    </w:t>
-      </w:r>
-      <w:r>
-        <w:rPr>
-          <w:color w:val="586B80"/>
-        </w:rPr>
-        <w:t>E</w:t>
-      </w:r>
-      <w:r>
-        <w:rPr>
-          <w:color w:val="586B80"/>
-          <w:vertAlign w:val="subscript"/>
-        </w:rPr>
-        <w:t>trans</w:t>
-      </w:r>
-      <w:r>
-        <w:rPr>
-          <w:color w:val="586B80"/>
-        </w:rPr>
-        <w:t>: [Wert] eV</w:t>
-        <w:br/>
-      </w:r>
-      <w:r>
-        <w:rPr>
-          <w:color w:val="586B80"/>
-        </w:rPr>
-        <w:t>ΔE</w:t>
-      </w:r>
-      <w:r>
-        <w:rPr>
-          <w:color w:val="586B80"/>
-          <w:vertAlign w:val="superscript"/>
-        </w:rPr>
-        <w:t>‡</w:t>
-      </w:r>
-      <w:r>
-        <w:rPr>
-          <w:color w:val="586B80"/>
-        </w:rPr>
-        <w:t xml:space="preserve">: [Wert] kJ/mol    </w:t>
-      </w:r>
-      <w:r>
-        <w:rPr>
-          <w:color w:val="586B80"/>
-        </w:rPr>
-        <w:t>ΔE</w:t>
-      </w:r>
-      <w:r>
-        <w:rPr>
-          <w:color w:val="586B80"/>
-          <w:vertAlign w:val="superscript"/>
-        </w:rPr>
-        <w:t>‡</w:t>
-      </w:r>
-      <w:r>
-        <w:rPr>
-          <w:color w:val="586B80"/>
-        </w:rPr>
-        <w:t xml:space="preserve"> / RT: [Wert ohne Einheit]</w:t>
-        <w:br/>
-        <w:t>Interpretation und Grenzen: [Text]</w:t>
-      </w:r>
-    </w:p>
-    <w:p>
-      <w:pPr>
-        <w:pStyle w:val="Heading2"/>
-      </w:pPr>
-      <w:r>
-        <w:t>Geometrie nach der Optimierung</w:t>
-      </w:r>
-    </w:p>
-    <w:p>
-      <w:r>
-        <w:t>Notieren Sie die Diederwinkel in Grad (°) und Ringabstände in pm für beide optimierten Minima. Vergleichen Sie diese mit den Werten der Startstrukturen.</w:t>
+        <w:t>Vervollständigen Sie die Tabelle für die vier Strukturen. Beschreiben Sie die Geometrieänderungen und erläutern Sie am Vorzeichen von ΔE, welche Konfiguration im verwendeten Modell die niedrigere elektronische Energie hat. Verwenden Sie dafür insgesamt höchstens drei Sätze.</w:t>
       </w:r>
     </w:p>
     <w:tbl>
@@ -807,8 +114,9 @@
       </w:tblPr>
       <w:tblGrid>
         <w:gridCol w:w="2835"/>
-        <w:gridCol w:w="3402"/>
-        <w:gridCol w:w="3402"/>
+        <w:gridCol w:w="2268"/>
+        <w:gridCol w:w="2268"/>
+        <w:gridCol w:w="2268"/>
       </w:tblGrid>
       <w:tr>
         <w:trPr>
@@ -843,13 +151,45 @@
                 <w:color w:val="FFFFFF"/>
                 <w:sz w:val="18"/>
               </w:rPr>
-              <w:t>Minimum</w:t>
+              <w:t>Struktur</w:t>
             </w:r>
           </w:p>
         </w:tc>
         <w:tc>
           <w:tcPr>
-            <w:tcW w:type="dxa" w:w="3402"/>
+            <w:tcW w:type="dxa" w:w="2268"/>
+            <w:shd w:fill="102238"/>
+            <w:tcMar>
+              <w:top w:w="90" w:type="dxa"/>
+              <w:left w:w="90" w:type="dxa"/>
+              <w:bottom w:w="90" w:type="dxa"/>
+              <w:right w:w="90" w:type="dxa"/>
+            </w:tcMar>
+            <w:tcBorders>
+              <w:top w:val="single" w:sz="4" w:color="D9D9D9"/>
+              <w:left w:val="single" w:sz="4" w:color="D9D9D9"/>
+              <w:bottom w:val="single" w:sz="4" w:color="D9D9D9"/>
+              <w:right w:val="single" w:sz="4" w:color="D9D9D9"/>
+            </w:tcBorders>
+            <w:vAlign w:val="center"/>
+          </w:tcPr>
+          <w:p>
+            <w:pPr>
+              <w:spacing w:after="40"/>
+            </w:pPr>
+            <w:r>
+              <w:rPr>
+                <w:b/>
+                <w:color w:val="FFFFFF"/>
+                <w:sz w:val="18"/>
+              </w:rPr>
+              <w:t>Elektronische Energie / eV</w:t>
+            </w:r>
+          </w:p>
+        </w:tc>
+        <w:tc>
+          <w:tcPr>
+            <w:tcW w:type="dxa" w:w="2268"/>
             <w:shd w:fill="102238"/>
             <w:tcMar>
               <w:top w:w="90" w:type="dxa"/>
@@ -881,7 +221,7 @@
         </w:tc>
         <w:tc>
           <w:tcPr>
-            <w:tcW w:type="dxa" w:w="3402"/>
+            <w:tcW w:type="dxa" w:w="2268"/>
             <w:shd w:fill="102238"/>
             <w:tcMar>
               <w:top w:w="90" w:type="dxa"/>
@@ -942,7 +282,702 @@
               <w:rPr>
                 <w:sz w:val="18"/>
               </w:rPr>
-              <w:t>cis</w:t>
+              <w:t>cis-Startstruktur</w:t>
+            </w:r>
+          </w:p>
+        </w:tc>
+        <w:tc>
+          <w:tcPr>
+            <w:tcW w:type="dxa" w:w="2268"/>
+            <w:shd w:fill="F3F6FA"/>
+            <w:tcMar>
+              <w:top w:w="90" w:type="dxa"/>
+              <w:left w:w="90" w:type="dxa"/>
+              <w:bottom w:w="90" w:type="dxa"/>
+              <w:right w:w="90" w:type="dxa"/>
+            </w:tcMar>
+            <w:tcBorders>
+              <w:top w:val="single" w:sz="4" w:color="D9D9D9"/>
+              <w:left w:val="single" w:sz="4" w:color="D9D9D9"/>
+              <w:bottom w:val="single" w:sz="4" w:color="D9D9D9"/>
+              <w:right w:val="single" w:sz="4" w:color="D9D9D9"/>
+            </w:tcBorders>
+            <w:vAlign w:val="center"/>
+          </w:tcPr>
+          <w:p>
+            <w:pPr>
+              <w:spacing w:after="40"/>
+            </w:pPr>
+            <w:r>
+              <w:rPr>
+                <w:sz w:val="18"/>
+              </w:rPr>
+              <w:t>[Wert]</w:t>
+            </w:r>
+          </w:p>
+        </w:tc>
+        <w:tc>
+          <w:tcPr>
+            <w:tcW w:type="dxa" w:w="2268"/>
+            <w:shd w:fill="F3F6FA"/>
+            <w:tcMar>
+              <w:top w:w="90" w:type="dxa"/>
+              <w:left w:w="90" w:type="dxa"/>
+              <w:bottom w:w="90" w:type="dxa"/>
+              <w:right w:w="90" w:type="dxa"/>
+            </w:tcMar>
+            <w:tcBorders>
+              <w:top w:val="single" w:sz="4" w:color="D9D9D9"/>
+              <w:left w:val="single" w:sz="4" w:color="D9D9D9"/>
+              <w:bottom w:val="single" w:sz="4" w:color="D9D9D9"/>
+              <w:right w:val="single" w:sz="4" w:color="D9D9D9"/>
+            </w:tcBorders>
+            <w:vAlign w:val="center"/>
+          </w:tcPr>
+          <w:p>
+            <w:pPr>
+              <w:spacing w:after="40"/>
+            </w:pPr>
+            <w:r>
+              <w:rPr>
+                <w:sz w:val="18"/>
+              </w:rPr>
+              <w:t>[Wert]</w:t>
+            </w:r>
+          </w:p>
+        </w:tc>
+        <w:tc>
+          <w:tcPr>
+            <w:tcW w:type="dxa" w:w="2268"/>
+            <w:shd w:fill="F3F6FA"/>
+            <w:tcMar>
+              <w:top w:w="90" w:type="dxa"/>
+              <w:left w:w="90" w:type="dxa"/>
+              <w:bottom w:w="90" w:type="dxa"/>
+              <w:right w:w="90" w:type="dxa"/>
+            </w:tcMar>
+            <w:tcBorders>
+              <w:top w:val="single" w:sz="4" w:color="D9D9D9"/>
+              <w:left w:val="single" w:sz="4" w:color="D9D9D9"/>
+              <w:bottom w:val="single" w:sz="4" w:color="D9D9D9"/>
+              <w:right w:val="single" w:sz="4" w:color="D9D9D9"/>
+            </w:tcBorders>
+            <w:vAlign w:val="center"/>
+          </w:tcPr>
+          <w:p>
+            <w:pPr>
+              <w:spacing w:after="40"/>
+            </w:pPr>
+            <w:r>
+              <w:rPr>
+                <w:sz w:val="18"/>
+              </w:rPr>
+              <w:t>[Wert]</w:t>
+            </w:r>
+          </w:p>
+        </w:tc>
+      </w:tr>
+      <w:tr>
+        <w:trPr>
+          <w:cantSplit/>
+        </w:trPr>
+        <w:tc>
+          <w:tcPr>
+            <w:tcW w:type="dxa" w:w="2835"/>
+            <w:shd w:fill="FFFFFF"/>
+            <w:tcMar>
+              <w:top w:w="90" w:type="dxa"/>
+              <w:left w:w="90" w:type="dxa"/>
+              <w:bottom w:w="90" w:type="dxa"/>
+              <w:right w:w="90" w:type="dxa"/>
+            </w:tcMar>
+            <w:tcBorders>
+              <w:top w:val="single" w:sz="4" w:color="D9D9D9"/>
+              <w:left w:val="single" w:sz="4" w:color="D9D9D9"/>
+              <w:bottom w:val="single" w:sz="4" w:color="D9D9D9"/>
+              <w:right w:val="single" w:sz="4" w:color="D9D9D9"/>
+            </w:tcBorders>
+            <w:vAlign w:val="center"/>
+          </w:tcPr>
+          <w:p>
+            <w:pPr>
+              <w:spacing w:after="40"/>
+            </w:pPr>
+            <w:r>
+              <w:rPr>
+                <w:sz w:val="18"/>
+              </w:rPr>
+              <w:t>trans-Startstruktur</w:t>
+            </w:r>
+          </w:p>
+        </w:tc>
+        <w:tc>
+          <w:tcPr>
+            <w:tcW w:type="dxa" w:w="2268"/>
+            <w:shd w:fill="FFFFFF"/>
+            <w:tcMar>
+              <w:top w:w="90" w:type="dxa"/>
+              <w:left w:w="90" w:type="dxa"/>
+              <w:bottom w:w="90" w:type="dxa"/>
+              <w:right w:w="90" w:type="dxa"/>
+            </w:tcMar>
+            <w:tcBorders>
+              <w:top w:val="single" w:sz="4" w:color="D9D9D9"/>
+              <w:left w:val="single" w:sz="4" w:color="D9D9D9"/>
+              <w:bottom w:val="single" w:sz="4" w:color="D9D9D9"/>
+              <w:right w:val="single" w:sz="4" w:color="D9D9D9"/>
+            </w:tcBorders>
+            <w:vAlign w:val="center"/>
+          </w:tcPr>
+          <w:p>
+            <w:pPr>
+              <w:spacing w:after="40"/>
+            </w:pPr>
+            <w:r>
+              <w:rPr>
+                <w:sz w:val="18"/>
+              </w:rPr>
+              <w:t>[Wert]</w:t>
+            </w:r>
+          </w:p>
+        </w:tc>
+        <w:tc>
+          <w:tcPr>
+            <w:tcW w:type="dxa" w:w="2268"/>
+            <w:shd w:fill="FFFFFF"/>
+            <w:tcMar>
+              <w:top w:w="90" w:type="dxa"/>
+              <w:left w:w="90" w:type="dxa"/>
+              <w:bottom w:w="90" w:type="dxa"/>
+              <w:right w:w="90" w:type="dxa"/>
+            </w:tcMar>
+            <w:tcBorders>
+              <w:top w:val="single" w:sz="4" w:color="D9D9D9"/>
+              <w:left w:val="single" w:sz="4" w:color="D9D9D9"/>
+              <w:bottom w:val="single" w:sz="4" w:color="D9D9D9"/>
+              <w:right w:val="single" w:sz="4" w:color="D9D9D9"/>
+            </w:tcBorders>
+            <w:vAlign w:val="center"/>
+          </w:tcPr>
+          <w:p>
+            <w:pPr>
+              <w:spacing w:after="40"/>
+            </w:pPr>
+            <w:r>
+              <w:rPr>
+                <w:sz w:val="18"/>
+              </w:rPr>
+              <w:t>[Wert]</w:t>
+            </w:r>
+          </w:p>
+        </w:tc>
+        <w:tc>
+          <w:tcPr>
+            <w:tcW w:type="dxa" w:w="2268"/>
+            <w:shd w:fill="FFFFFF"/>
+            <w:tcMar>
+              <w:top w:w="90" w:type="dxa"/>
+              <w:left w:w="90" w:type="dxa"/>
+              <w:bottom w:w="90" w:type="dxa"/>
+              <w:right w:w="90" w:type="dxa"/>
+            </w:tcMar>
+            <w:tcBorders>
+              <w:top w:val="single" w:sz="4" w:color="D9D9D9"/>
+              <w:left w:val="single" w:sz="4" w:color="D9D9D9"/>
+              <w:bottom w:val="single" w:sz="4" w:color="D9D9D9"/>
+              <w:right w:val="single" w:sz="4" w:color="D9D9D9"/>
+            </w:tcBorders>
+            <w:vAlign w:val="center"/>
+          </w:tcPr>
+          <w:p>
+            <w:pPr>
+              <w:spacing w:after="40"/>
+            </w:pPr>
+            <w:r>
+              <w:rPr>
+                <w:sz w:val="18"/>
+              </w:rPr>
+              <w:t>[Wert]</w:t>
+            </w:r>
+          </w:p>
+        </w:tc>
+      </w:tr>
+      <w:tr>
+        <w:trPr>
+          <w:cantSplit/>
+        </w:trPr>
+        <w:tc>
+          <w:tcPr>
+            <w:tcW w:type="dxa" w:w="2835"/>
+            <w:shd w:fill="F3F6FA"/>
+            <w:tcMar>
+              <w:top w:w="90" w:type="dxa"/>
+              <w:left w:w="90" w:type="dxa"/>
+              <w:bottom w:w="90" w:type="dxa"/>
+              <w:right w:w="90" w:type="dxa"/>
+            </w:tcMar>
+            <w:tcBorders>
+              <w:top w:val="single" w:sz="4" w:color="D9D9D9"/>
+              <w:left w:val="single" w:sz="4" w:color="D9D9D9"/>
+              <w:bottom w:val="single" w:sz="4" w:color="D9D9D9"/>
+              <w:right w:val="single" w:sz="4" w:color="D9D9D9"/>
+            </w:tcBorders>
+            <w:vAlign w:val="center"/>
+          </w:tcPr>
+          <w:p>
+            <w:pPr>
+              <w:spacing w:after="40"/>
+            </w:pPr>
+            <w:r>
+              <w:rPr>
+                <w:sz w:val="18"/>
+              </w:rPr>
+              <w:t>cis-Minimumstruktur</w:t>
+            </w:r>
+          </w:p>
+        </w:tc>
+        <w:tc>
+          <w:tcPr>
+            <w:tcW w:type="dxa" w:w="2268"/>
+            <w:shd w:fill="F3F6FA"/>
+            <w:tcMar>
+              <w:top w:w="90" w:type="dxa"/>
+              <w:left w:w="90" w:type="dxa"/>
+              <w:bottom w:w="90" w:type="dxa"/>
+              <w:right w:w="90" w:type="dxa"/>
+            </w:tcMar>
+            <w:tcBorders>
+              <w:top w:val="single" w:sz="4" w:color="D9D9D9"/>
+              <w:left w:val="single" w:sz="4" w:color="D9D9D9"/>
+              <w:bottom w:val="single" w:sz="4" w:color="D9D9D9"/>
+              <w:right w:val="single" w:sz="4" w:color="D9D9D9"/>
+            </w:tcBorders>
+            <w:vAlign w:val="center"/>
+          </w:tcPr>
+          <w:p>
+            <w:pPr>
+              <w:spacing w:after="40"/>
+            </w:pPr>
+            <w:r>
+              <w:rPr>
+                <w:sz w:val="18"/>
+              </w:rPr>
+              <w:t>[Wert]</w:t>
+            </w:r>
+          </w:p>
+        </w:tc>
+        <w:tc>
+          <w:tcPr>
+            <w:tcW w:type="dxa" w:w="2268"/>
+            <w:shd w:fill="F3F6FA"/>
+            <w:tcMar>
+              <w:top w:w="90" w:type="dxa"/>
+              <w:left w:w="90" w:type="dxa"/>
+              <w:bottom w:w="90" w:type="dxa"/>
+              <w:right w:w="90" w:type="dxa"/>
+            </w:tcMar>
+            <w:tcBorders>
+              <w:top w:val="single" w:sz="4" w:color="D9D9D9"/>
+              <w:left w:val="single" w:sz="4" w:color="D9D9D9"/>
+              <w:bottom w:val="single" w:sz="4" w:color="D9D9D9"/>
+              <w:right w:val="single" w:sz="4" w:color="D9D9D9"/>
+            </w:tcBorders>
+            <w:vAlign w:val="center"/>
+          </w:tcPr>
+          <w:p>
+            <w:pPr>
+              <w:spacing w:after="40"/>
+            </w:pPr>
+            <w:r>
+              <w:rPr>
+                <w:sz w:val="18"/>
+              </w:rPr>
+              <w:t>[Wert]</w:t>
+            </w:r>
+          </w:p>
+        </w:tc>
+        <w:tc>
+          <w:tcPr>
+            <w:tcW w:type="dxa" w:w="2268"/>
+            <w:shd w:fill="F3F6FA"/>
+            <w:tcMar>
+              <w:top w:w="90" w:type="dxa"/>
+              <w:left w:w="90" w:type="dxa"/>
+              <w:bottom w:w="90" w:type="dxa"/>
+              <w:right w:w="90" w:type="dxa"/>
+            </w:tcMar>
+            <w:tcBorders>
+              <w:top w:val="single" w:sz="4" w:color="D9D9D9"/>
+              <w:left w:val="single" w:sz="4" w:color="D9D9D9"/>
+              <w:bottom w:val="single" w:sz="4" w:color="D9D9D9"/>
+              <w:right w:val="single" w:sz="4" w:color="D9D9D9"/>
+            </w:tcBorders>
+            <w:vAlign w:val="center"/>
+          </w:tcPr>
+          <w:p>
+            <w:pPr>
+              <w:spacing w:after="40"/>
+            </w:pPr>
+            <w:r>
+              <w:rPr>
+                <w:sz w:val="18"/>
+              </w:rPr>
+              <w:t>[Wert]</w:t>
+            </w:r>
+          </w:p>
+        </w:tc>
+      </w:tr>
+      <w:tr>
+        <w:trPr>
+          <w:cantSplit/>
+        </w:trPr>
+        <w:tc>
+          <w:tcPr>
+            <w:tcW w:type="dxa" w:w="2835"/>
+            <w:shd w:fill="FFFFFF"/>
+            <w:tcMar>
+              <w:top w:w="90" w:type="dxa"/>
+              <w:left w:w="90" w:type="dxa"/>
+              <w:bottom w:w="90" w:type="dxa"/>
+              <w:right w:w="90" w:type="dxa"/>
+            </w:tcMar>
+            <w:tcBorders>
+              <w:top w:val="single" w:sz="4" w:color="D9D9D9"/>
+              <w:left w:val="single" w:sz="4" w:color="D9D9D9"/>
+              <w:bottom w:val="single" w:sz="4" w:color="D9D9D9"/>
+              <w:right w:val="single" w:sz="4" w:color="D9D9D9"/>
+            </w:tcBorders>
+            <w:vAlign w:val="center"/>
+          </w:tcPr>
+          <w:p>
+            <w:pPr>
+              <w:spacing w:after="40"/>
+            </w:pPr>
+            <w:r>
+              <w:rPr>
+                <w:sz w:val="18"/>
+              </w:rPr>
+              <w:t>trans-Minimumstruktur</w:t>
+            </w:r>
+          </w:p>
+        </w:tc>
+        <w:tc>
+          <w:tcPr>
+            <w:tcW w:type="dxa" w:w="2268"/>
+            <w:shd w:fill="FFFFFF"/>
+            <w:tcMar>
+              <w:top w:w="90" w:type="dxa"/>
+              <w:left w:w="90" w:type="dxa"/>
+              <w:bottom w:w="90" w:type="dxa"/>
+              <w:right w:w="90" w:type="dxa"/>
+            </w:tcMar>
+            <w:tcBorders>
+              <w:top w:val="single" w:sz="4" w:color="D9D9D9"/>
+              <w:left w:val="single" w:sz="4" w:color="D9D9D9"/>
+              <w:bottom w:val="single" w:sz="4" w:color="D9D9D9"/>
+              <w:right w:val="single" w:sz="4" w:color="D9D9D9"/>
+            </w:tcBorders>
+            <w:vAlign w:val="center"/>
+          </w:tcPr>
+          <w:p>
+            <w:pPr>
+              <w:spacing w:after="40"/>
+            </w:pPr>
+            <w:r>
+              <w:rPr>
+                <w:sz w:val="18"/>
+              </w:rPr>
+              <w:t>[Wert]</w:t>
+            </w:r>
+          </w:p>
+        </w:tc>
+        <w:tc>
+          <w:tcPr>
+            <w:tcW w:type="dxa" w:w="2268"/>
+            <w:shd w:fill="FFFFFF"/>
+            <w:tcMar>
+              <w:top w:w="90" w:type="dxa"/>
+              <w:left w:w="90" w:type="dxa"/>
+              <w:bottom w:w="90" w:type="dxa"/>
+              <w:right w:w="90" w:type="dxa"/>
+            </w:tcMar>
+            <w:tcBorders>
+              <w:top w:val="single" w:sz="4" w:color="D9D9D9"/>
+              <w:left w:val="single" w:sz="4" w:color="D9D9D9"/>
+              <w:bottom w:val="single" w:sz="4" w:color="D9D9D9"/>
+              <w:right w:val="single" w:sz="4" w:color="D9D9D9"/>
+            </w:tcBorders>
+            <w:vAlign w:val="center"/>
+          </w:tcPr>
+          <w:p>
+            <w:pPr>
+              <w:spacing w:after="40"/>
+            </w:pPr>
+            <w:r>
+              <w:rPr>
+                <w:sz w:val="18"/>
+              </w:rPr>
+              <w:t>[Wert]</w:t>
+            </w:r>
+          </w:p>
+        </w:tc>
+        <w:tc>
+          <w:tcPr>
+            <w:tcW w:type="dxa" w:w="2268"/>
+            <w:shd w:fill="FFFFFF"/>
+            <w:tcMar>
+              <w:top w:w="90" w:type="dxa"/>
+              <w:left w:w="90" w:type="dxa"/>
+              <w:bottom w:w="90" w:type="dxa"/>
+              <w:right w:w="90" w:type="dxa"/>
+            </w:tcMar>
+            <w:tcBorders>
+              <w:top w:val="single" w:sz="4" w:color="D9D9D9"/>
+              <w:left w:val="single" w:sz="4" w:color="D9D9D9"/>
+              <w:bottom w:val="single" w:sz="4" w:color="D9D9D9"/>
+              <w:right w:val="single" w:sz="4" w:color="D9D9D9"/>
+            </w:tcBorders>
+            <w:vAlign w:val="center"/>
+          </w:tcPr>
+          <w:p>
+            <w:pPr>
+              <w:spacing w:after="40"/>
+            </w:pPr>
+            <w:r>
+              <w:rPr>
+                <w:sz w:val="18"/>
+              </w:rPr>
+              <w:t>[Wert]</w:t>
+            </w:r>
+          </w:p>
+        </w:tc>
+      </w:tr>
+    </w:tbl>
+    <w:p>
+      <w:r/>
+    </w:p>
+    <w:p>
+      <w:r>
+        <w:rPr>
+          <w:color w:val="586B80"/>
+        </w:rPr>
+        <w:t xml:space="preserve">ΔE = </w:t>
+      </w:r>
+      <w:r>
+        <w:rPr>
+          <w:color w:val="586B80"/>
+        </w:rPr>
+        <w:t>E</w:t>
+      </w:r>
+      <w:r>
+        <w:rPr>
+          <w:color w:val="586B80"/>
+          <w:vertAlign w:val="subscript"/>
+        </w:rPr>
+        <w:t>trans</w:t>
+      </w:r>
+      <w:r>
+        <w:rPr>
+          <w:color w:val="586B80"/>
+        </w:rPr>
+        <w:t xml:space="preserve"> − </w:t>
+      </w:r>
+      <w:r>
+        <w:rPr>
+          <w:color w:val="586B80"/>
+        </w:rPr>
+        <w:t>E</w:t>
+      </w:r>
+      <w:r>
+        <w:rPr>
+          <w:color w:val="586B80"/>
+          <w:vertAlign w:val="subscript"/>
+        </w:rPr>
+        <w:t>cis</w:t>
+      </w:r>
+      <w:r>
+        <w:rPr>
+          <w:color w:val="586B80"/>
+        </w:rPr>
+        <w:t xml:space="preserve"> / (kJ/mol): [Wert]</w:t>
+        <w:br/>
+        <w:t>Geometrieänderungen und Einordnung des Vorzeichens: [höchstens drei Sätze]</w:t>
+      </w:r>
+    </w:p>
+    <w:p>
+      <w:pPr>
+        <w:pStyle w:val="Heading2"/>
+      </w:pPr>
+      <w:r>
+        <w:t>Reaktionspfad und Barrieren analysieren</w:t>
+      </w:r>
+    </w:p>
+    <w:p>
+      <w:r>
+        <w:t>Fügen Sie das Energieprofil ein. Geben Sie die elektronische Energiebarriere für beide Richtungen in der Tabelle an. Fassen Sie Pfadzuordnung, Verbindungsprüfung, Barrierendifferenz und den Vergleich mit RT in höchstens drei Sätzen zusammen.</w:t>
+      </w:r>
+    </w:p>
+    <w:p>
+      <w:r/>
+    </w:p>
+    <w:p>
+      <w:r>
+        <w:rPr>
+          <w:color w:val="586B80"/>
+        </w:rPr>
+        <w:t>[Energieprofil einfügen und beschriften]</w:t>
+      </w:r>
+    </w:p>
+    <w:p>
+      <w:r>
+        <w:br/>
+        <w:br/>
+      </w:r>
+    </w:p>
+    <w:tbl>
+      <w:tblPr>
+        <w:tblW w:type="auto" w:w="0"/>
+        <w:tblLayout w:type="fixed"/>
+        <w:tblLook w:firstColumn="1" w:firstRow="1" w:lastColumn="0" w:lastRow="0" w:noHBand="0" w:noVBand="1" w:val="04A0"/>
+      </w:tblPr>
+      <w:tblGrid>
+        <w:gridCol w:w="2835"/>
+        <w:gridCol w:w="3402"/>
+        <w:gridCol w:w="3402"/>
+      </w:tblGrid>
+      <w:tr>
+        <w:trPr>
+          <w:cantSplit/>
+          <w:tblHeader/>
+        </w:trPr>
+        <w:tc>
+          <w:tcPr>
+            <w:tcW w:type="dxa" w:w="2835"/>
+            <w:shd w:fill="102238"/>
+            <w:tcMar>
+              <w:top w:w="90" w:type="dxa"/>
+              <w:left w:w="90" w:type="dxa"/>
+              <w:bottom w:w="90" w:type="dxa"/>
+              <w:right w:w="90" w:type="dxa"/>
+            </w:tcMar>
+            <w:tcBorders>
+              <w:top w:val="single" w:sz="4" w:color="D9D9D9"/>
+              <w:left w:val="single" w:sz="4" w:color="D9D9D9"/>
+              <w:bottom w:val="single" w:sz="4" w:color="D9D9D9"/>
+              <w:right w:val="single" w:sz="4" w:color="D9D9D9"/>
+            </w:tcBorders>
+            <w:vAlign w:val="center"/>
+          </w:tcPr>
+          <w:p>
+            <w:pPr>
+              <w:spacing w:after="40"/>
+            </w:pPr>
+            <w:r>
+              <w:rPr>
+                <w:b/>
+                <w:color w:val="FFFFFF"/>
+                <w:sz w:val="18"/>
+              </w:rPr>
+              <w:t>Richtung</w:t>
+            </w:r>
+          </w:p>
+        </w:tc>
+        <w:tc>
+          <w:tcPr>
+            <w:tcW w:type="dxa" w:w="3402"/>
+            <w:shd w:fill="102238"/>
+            <w:tcMar>
+              <w:top w:w="90" w:type="dxa"/>
+              <w:left w:w="90" w:type="dxa"/>
+              <w:bottom w:w="90" w:type="dxa"/>
+              <w:right w:w="90" w:type="dxa"/>
+            </w:tcMar>
+            <w:tcBorders>
+              <w:top w:val="single" w:sz="4" w:color="D9D9D9"/>
+              <w:left w:val="single" w:sz="4" w:color="D9D9D9"/>
+              <w:bottom w:val="single" w:sz="4" w:color="D9D9D9"/>
+              <w:right w:val="single" w:sz="4" w:color="D9D9D9"/>
+            </w:tcBorders>
+            <w:vAlign w:val="center"/>
+          </w:tcPr>
+          <w:p>
+            <w:pPr>
+              <w:spacing w:after="40"/>
+            </w:pPr>
+            <w:r>
+              <w:rPr>
+                <w:b/>
+                <w:color w:val="FFFFFF"/>
+                <w:sz w:val="18"/>
+              </w:rPr>
+              <w:t>ΔE‡ / (kJ/mol)</w:t>
+            </w:r>
+          </w:p>
+        </w:tc>
+        <w:tc>
+          <w:tcPr>
+            <w:tcW w:type="dxa" w:w="3402"/>
+            <w:shd w:fill="102238"/>
+            <w:tcMar>
+              <w:top w:w="90" w:type="dxa"/>
+              <w:left w:w="90" w:type="dxa"/>
+              <w:bottom w:w="90" w:type="dxa"/>
+              <w:right w:w="90" w:type="dxa"/>
+            </w:tcMar>
+            <w:tcBorders>
+              <w:top w:val="single" w:sz="4" w:color="D9D9D9"/>
+              <w:left w:val="single" w:sz="4" w:color="D9D9D9"/>
+              <w:bottom w:val="single" w:sz="4" w:color="D9D9D9"/>
+              <w:right w:val="single" w:sz="4" w:color="D9D9D9"/>
+            </w:tcBorders>
+            <w:vAlign w:val="center"/>
+          </w:tcPr>
+          <w:p>
+            <w:pPr>
+              <w:spacing w:after="40"/>
+            </w:pPr>
+            <w:r>
+              <w:rPr>
+                <w:b/>
+                <w:color w:val="FFFFFF"/>
+                <w:sz w:val="18"/>
+              </w:rPr>
+              <w:t>ΔE‡ / RT bei 298 K</w:t>
+            </w:r>
+          </w:p>
+        </w:tc>
+      </w:tr>
+      <w:tr>
+        <w:trPr>
+          <w:cantSplit/>
+        </w:trPr>
+        <w:tc>
+          <w:tcPr>
+            <w:tcW w:type="dxa" w:w="2835"/>
+            <w:shd w:fill="F3F6FA"/>
+            <w:tcMar>
+              <w:top w:w="90" w:type="dxa"/>
+              <w:left w:w="90" w:type="dxa"/>
+              <w:bottom w:w="90" w:type="dxa"/>
+              <w:right w:w="90" w:type="dxa"/>
+            </w:tcMar>
+            <w:tcBorders>
+              <w:top w:val="single" w:sz="4" w:color="D9D9D9"/>
+              <w:left w:val="single" w:sz="4" w:color="D9D9D9"/>
+              <w:bottom w:val="single" w:sz="4" w:color="D9D9D9"/>
+              <w:right w:val="single" w:sz="4" w:color="D9D9D9"/>
+            </w:tcBorders>
+            <w:vAlign w:val="center"/>
+          </w:tcPr>
+          <w:p>
+            <w:pPr>
+              <w:spacing w:after="40"/>
+            </w:pPr>
+            <w:r>
+              <w:rPr>
+                <w:sz w:val="18"/>
+              </w:rPr>
+              <w:t>trans → cis</w:t>
             </w:r>
           </w:p>
         </w:tc>
@@ -1037,7 +1072,7 @@
               <w:rPr>
                 <w:sz w:val="18"/>
               </w:rPr>
-              <w:t>trans</w:t>
+              <w:t>cis → trans</w:t>
             </w:r>
           </w:p>
         </w:tc>
@@ -1111,7 +1146,7 @@
         <w:rPr>
           <w:color w:val="586B80"/>
         </w:rPr>
-        <w:t>Vergleich mit den Startstrukturen: [Text]</w:t>
+        <w:t>Pfad, Verbindungsprüfung, Barrieren- und RT-Vergleich: [höchstens drei Sätze]</w:t>
       </w:r>
     </w:p>
     <w:p>
@@ -1132,12 +1167,12 @@
         <w:pStyle w:val="Heading2"/>
       </w:pPr>
       <w:r>
-        <w:t>cis und trans</w:t>
+        <w:t>Spektren und Photoschaltung untersuchen</w:t>
       </w:r>
     </w:p>
     <w:p>
       <w:r>
-        <w:t>Fügen Sie beide Spektren ein. Notieren Sie die Energien der Absorptionsmaxima in eV und die zugehörigen Wellenlängen in nm (Nanometer). Ordnen Sie sie dem ultravioletten oder sichtbaren Bereich zu. Diskutieren Sie die Farbvorhersage und die Grenzen des Modells; der Faktor für die optische Dichte entspricht keiner bekannten Konzentration.</w:t>
+        <w:t>Vervollständigen Sie die Tabelle für cis- und trans-Azobenzol. Begründen Sie in höchstens drei Sätzen Ihre Wahl des Wellenlängenbereichs, die erwartete Verschiebung des cis/trans-Verhältnisses und die Grenze dieser Vorhersage. Kennzeichnen Sie Absorptionsmaxima und Farben als Modellvorhersagen.</w:t>
       </w:r>
     </w:p>
     <w:tbl>
@@ -1148,9 +1183,10 @@
       </w:tblPr>
       <w:tblGrid>
         <w:gridCol w:w="1701"/>
-        <w:gridCol w:w="2268"/>
-        <w:gridCol w:w="2835"/>
-        <w:gridCol w:w="2835"/>
+        <w:gridCol w:w="1701"/>
+        <w:gridCol w:w="1984"/>
+        <w:gridCol w:w="1814"/>
+        <w:gridCol w:w="2438"/>
       </w:tblGrid>
       <w:tr>
         <w:trPr>
@@ -1185,13 +1221,13 @@
                 <w:color w:val="FFFFFF"/>
                 <w:sz w:val="18"/>
               </w:rPr>
-              <w:t>Minimum</w:t>
+              <w:t>Minimumstruktur</w:t>
             </w:r>
           </w:p>
         </w:tc>
         <w:tc>
           <w:tcPr>
-            <w:tcW w:type="dxa" w:w="2268"/>
+            <w:tcW w:type="dxa" w:w="1701"/>
             <w:shd w:fill="102238"/>
             <w:tcMar>
               <w:top w:w="90" w:type="dxa"/>
@@ -1223,7 +1259,7 @@
         </w:tc>
         <w:tc>
           <w:tcPr>
-            <w:tcW w:type="dxa" w:w="2835"/>
+            <w:tcW w:type="dxa" w:w="1984"/>
             <w:shd w:fill="102238"/>
             <w:tcMar>
               <w:top w:w="90" w:type="dxa"/>
@@ -1255,7 +1291,7 @@
         </w:tc>
         <w:tc>
           <w:tcPr>
-            <w:tcW w:type="dxa" w:w="2835"/>
+            <w:tcW w:type="dxa" w:w="1814"/>
             <w:shd w:fill="102238"/>
             <w:tcMar>
               <w:top w:w="90" w:type="dxa"/>
@@ -1282,6 +1318,38 @@
                 <w:sz w:val="18"/>
               </w:rPr>
               <w:t>UV oder sichtbar</w:t>
+            </w:r>
+          </w:p>
+        </w:tc>
+        <w:tc>
+          <w:tcPr>
+            <w:tcW w:type="dxa" w:w="2438"/>
+            <w:shd w:fill="102238"/>
+            <w:tcMar>
+              <w:top w:w="90" w:type="dxa"/>
+              <w:left w:w="90" w:type="dxa"/>
+              <w:bottom w:w="90" w:type="dxa"/>
+              <w:right w:w="90" w:type="dxa"/>
+            </w:tcMar>
+            <w:tcBorders>
+              <w:top w:val="single" w:sz="4" w:color="D9D9D9"/>
+              <w:left w:val="single" w:sz="4" w:color="D9D9D9"/>
+              <w:bottom w:val="single" w:sz="4" w:color="D9D9D9"/>
+              <w:right w:val="single" w:sz="4" w:color="D9D9D9"/>
+            </w:tcBorders>
+            <w:vAlign w:val="center"/>
+          </w:tcPr>
+          <w:p>
+            <w:pPr>
+              <w:spacing w:after="40"/>
+            </w:pPr>
+            <w:r>
+              <w:rPr>
+                <w:b/>
+                <w:color w:val="FFFFFF"/>
+                <w:sz w:val="18"/>
+              </w:rPr>
+              <w:t>Farbvorhersage</w:t>
             </w:r>
           </w:p>
         </w:tc>
@@ -1322,7 +1390,7 @@
         </w:tc>
         <w:tc>
           <w:tcPr>
-            <w:tcW w:type="dxa" w:w="2268"/>
+            <w:tcW w:type="dxa" w:w="1701"/>
             <w:shd w:fill="F3F6FA"/>
             <w:tcMar>
               <w:top w:w="90" w:type="dxa"/>
@@ -1352,7 +1420,7 @@
         </w:tc>
         <w:tc>
           <w:tcPr>
-            <w:tcW w:type="dxa" w:w="2835"/>
+            <w:tcW w:type="dxa" w:w="1984"/>
             <w:shd w:fill="F3F6FA"/>
             <w:tcMar>
               <w:top w:w="90" w:type="dxa"/>
@@ -1382,7 +1450,7 @@
         </w:tc>
         <w:tc>
           <w:tcPr>
-            <w:tcW w:type="dxa" w:w="2835"/>
+            <w:tcW w:type="dxa" w:w="1814"/>
             <w:shd w:fill="F3F6FA"/>
             <w:tcMar>
               <w:top w:w="90" w:type="dxa"/>
@@ -1407,6 +1475,36 @@
                 <w:sz w:val="18"/>
               </w:rPr>
               <w:t>[Bereich]</w:t>
+            </w:r>
+          </w:p>
+        </w:tc>
+        <w:tc>
+          <w:tcPr>
+            <w:tcW w:type="dxa" w:w="2438"/>
+            <w:shd w:fill="F3F6FA"/>
+            <w:tcMar>
+              <w:top w:w="90" w:type="dxa"/>
+              <w:left w:w="90" w:type="dxa"/>
+              <w:bottom w:w="90" w:type="dxa"/>
+              <w:right w:w="90" w:type="dxa"/>
+            </w:tcMar>
+            <w:tcBorders>
+              <w:top w:val="single" w:sz="4" w:color="D9D9D9"/>
+              <w:left w:val="single" w:sz="4" w:color="D9D9D9"/>
+              <w:bottom w:val="single" w:sz="4" w:color="D9D9D9"/>
+              <w:right w:val="single" w:sz="4" w:color="D9D9D9"/>
+            </w:tcBorders>
+            <w:vAlign w:val="center"/>
+          </w:tcPr>
+          <w:p>
+            <w:pPr>
+              <w:spacing w:after="40"/>
+            </w:pPr>
+            <w:r>
+              <w:rPr>
+                <w:sz w:val="18"/>
+              </w:rPr>
+              <w:t>[Farbe]</w:t>
             </w:r>
           </w:p>
         </w:tc>
@@ -1447,7 +1545,7 @@
         </w:tc>
         <w:tc>
           <w:tcPr>
-            <w:tcW w:type="dxa" w:w="2268"/>
+            <w:tcW w:type="dxa" w:w="1701"/>
             <w:shd w:fill="FFFFFF"/>
             <w:tcMar>
               <w:top w:w="90" w:type="dxa"/>
@@ -1477,7 +1575,7 @@
         </w:tc>
         <w:tc>
           <w:tcPr>
-            <w:tcW w:type="dxa" w:w="2835"/>
+            <w:tcW w:type="dxa" w:w="1984"/>
             <w:shd w:fill="FFFFFF"/>
             <w:tcMar>
               <w:top w:w="90" w:type="dxa"/>
@@ -1507,7 +1605,7 @@
         </w:tc>
         <w:tc>
           <w:tcPr>
-            <w:tcW w:type="dxa" w:w="2835"/>
+            <w:tcW w:type="dxa" w:w="1814"/>
             <w:shd w:fill="FFFFFF"/>
             <w:tcMar>
               <w:top w:w="90" w:type="dxa"/>
@@ -1535,6 +1633,36 @@
             </w:r>
           </w:p>
         </w:tc>
+        <w:tc>
+          <w:tcPr>
+            <w:tcW w:type="dxa" w:w="2438"/>
+            <w:shd w:fill="FFFFFF"/>
+            <w:tcMar>
+              <w:top w:w="90" w:type="dxa"/>
+              <w:left w:w="90" w:type="dxa"/>
+              <w:bottom w:w="90" w:type="dxa"/>
+              <w:right w:w="90" w:type="dxa"/>
+            </w:tcMar>
+            <w:tcBorders>
+              <w:top w:val="single" w:sz="4" w:color="D9D9D9"/>
+              <w:left w:val="single" w:sz="4" w:color="D9D9D9"/>
+              <w:bottom w:val="single" w:sz="4" w:color="D9D9D9"/>
+              <w:right w:val="single" w:sz="4" w:color="D9D9D9"/>
+            </w:tcBorders>
+            <w:vAlign w:val="center"/>
+          </w:tcPr>
+          <w:p>
+            <w:pPr>
+              <w:spacing w:after="40"/>
+            </w:pPr>
+            <w:r>
+              <w:rPr>
+                <w:sz w:val="18"/>
+              </w:rPr>
+              <w:t>[Farbe]</w:t>
+            </w:r>
+          </w:p>
+        </w:tc>
       </w:tr>
     </w:tbl>
     <w:p>
@@ -1545,50 +1673,7 @@
         <w:rPr>
           <w:color w:val="586B80"/>
         </w:rPr>
-        <w:t>cis-Azobenzol: [Spektrum einfügen]</w:t>
-      </w:r>
-    </w:p>
-    <w:p>
-      <w:r>
-        <w:br/>
-        <w:br/>
-      </w:r>
-    </w:p>
-    <w:p>
-      <w:r>
-        <w:rPr>
-          <w:color w:val="586B80"/>
-        </w:rPr>
-        <w:t>trans-Azobenzol: [Spektrum einfügen]</w:t>
-      </w:r>
-    </w:p>
-    <w:p>
-      <w:r>
-        <w:br/>
-        <w:br/>
-      </w:r>
-    </w:p>
-    <w:p>
-      <w:r>
-        <w:rPr>
-          <w:color w:val="586B80"/>
-        </w:rPr>
-        <w:t>Verwendeter Faktor für die optische Dichte: [Wert]</w:t>
-        <w:br/>
-        <w:t>Vergleich der Farbvorhersagen und Grenzen des Modells: [Text]</w:t>
-      </w:r>
-    </w:p>
-    <w:p>
-      <w:r>
-        <w:br w:type="page"/>
-      </w:r>
-    </w:p>
-    <w:p>
-      <w:pPr>
-        <w:pStyle w:val="Heading1"/>
-      </w:pPr>
-      <w:r>
-        <w:t>UV/Vis-Spektrum</w:t>
+        <w:t>Bevorzugte Anregung und Grenze der Vorhersage: [höchstens drei Sätze]</w:t>
       </w:r>
     </w:p>
     <w:p>
@@ -1596,12 +1681,12 @@
         <w:pStyle w:val="Heading2"/>
       </w:pPr>
       <w:r>
-        <w:t>Substituenten vergleichen</w:t>
+        <w:t>Substituenteneinfluss vergleichen</w:t>
       </w:r>
     </w:p>
     <w:p>
       <w:r>
-        <w:t>Dokumentieren Sie für trans-Azobenzol und die sechs Derivate mit Me, OMe, NMe₂, CF₃, CN und NO₂ in 4-Position die Absorptionsmaxima in eV und nm. Fügen Sie die Spektren ein. Benennen Sie die stärkste Verschiebung zu kleineren Energien und prüfen Sie, ob das Maximum im sichtbaren Bereich liegt.</w:t>
+        <w:t>Vervollständigen Sie die gemeinsame Ergebnistabelle. Benennen Sie in einem Satz das Derivat mit der stärksten Verschiebung zu kleineren Energien und geben Sie die Verschiebung in eV an.</w:t>
       </w:r>
     </w:p>
     <w:tbl>
@@ -1648,7 +1733,7 @@
                 <w:color w:val="FFFFFF"/>
                 <w:sz w:val="18"/>
               </w:rPr>
-              <w:t>Substitution der trans-Form</w:t>
+              <w:t>Name und Substitution der trans-Form</w:t>
             </w:r>
           </w:p>
         </w:tc>
@@ -1747,7 +1832,7 @@
               <w:rPr>
                 <w:sz w:val="18"/>
               </w:rPr>
-              <w:t>unsubstituiert</w:t>
+              <w:t>unsubstituiert [Name]</w:t>
             </w:r>
           </w:p>
         </w:tc>
@@ -1842,7 +1927,7 @@
               <w:rPr>
                 <w:sz w:val="18"/>
               </w:rPr>
-              <w:t>4-Me</w:t>
+              <w:t>4-OMe [Name]</w:t>
             </w:r>
           </w:p>
         </w:tc>
@@ -1937,7 +2022,7 @@
               <w:rPr>
                 <w:sz w:val="18"/>
               </w:rPr>
-              <w:t>4-OMe</w:t>
+              <w:t>4-NMe₂ [Name]</w:t>
             </w:r>
           </w:p>
         </w:tc>
@@ -2032,7 +2117,7 @@
               <w:rPr>
                 <w:sz w:val="18"/>
               </w:rPr>
-              <w:t>4-NMe₂</w:t>
+              <w:t>4-CF₃ [Name]</w:t>
             </w:r>
           </w:p>
         </w:tc>
@@ -2127,197 +2212,7 @@
               <w:rPr>
                 <w:sz w:val="18"/>
               </w:rPr>
-              <w:t>4-CF₃</w:t>
-            </w:r>
-          </w:p>
-        </w:tc>
-        <w:tc>
-          <w:tcPr>
-            <w:tcW w:type="dxa" w:w="2268"/>
-            <w:shd w:fill="F3F6FA"/>
-            <w:tcMar>
-              <w:top w:w="90" w:type="dxa"/>
-              <w:left w:w="90" w:type="dxa"/>
-              <w:bottom w:w="90" w:type="dxa"/>
-              <w:right w:w="90" w:type="dxa"/>
-            </w:tcMar>
-            <w:tcBorders>
-              <w:top w:val="single" w:sz="4" w:color="D9D9D9"/>
-              <w:left w:val="single" w:sz="4" w:color="D9D9D9"/>
-              <w:bottom w:val="single" w:sz="4" w:color="D9D9D9"/>
-              <w:right w:val="single" w:sz="4" w:color="D9D9D9"/>
-            </w:tcBorders>
-            <w:vAlign w:val="center"/>
-          </w:tcPr>
-          <w:p>
-            <w:pPr>
-              <w:spacing w:after="40"/>
-            </w:pPr>
-            <w:r>
-              <w:rPr>
-                <w:sz w:val="18"/>
-              </w:rPr>
-              <w:t>[Wert]</w:t>
-            </w:r>
-          </w:p>
-        </w:tc>
-        <w:tc>
-          <w:tcPr>
-            <w:tcW w:type="dxa" w:w="2835"/>
-            <w:shd w:fill="F3F6FA"/>
-            <w:tcMar>
-              <w:top w:w="90" w:type="dxa"/>
-              <w:left w:w="90" w:type="dxa"/>
-              <w:bottom w:w="90" w:type="dxa"/>
-              <w:right w:w="90" w:type="dxa"/>
-            </w:tcMar>
-            <w:tcBorders>
-              <w:top w:val="single" w:sz="4" w:color="D9D9D9"/>
-              <w:left w:val="single" w:sz="4" w:color="D9D9D9"/>
-              <w:bottom w:val="single" w:sz="4" w:color="D9D9D9"/>
-              <w:right w:val="single" w:sz="4" w:color="D9D9D9"/>
-            </w:tcBorders>
-            <w:vAlign w:val="center"/>
-          </w:tcPr>
-          <w:p>
-            <w:pPr>
-              <w:spacing w:after="40"/>
-            </w:pPr>
-            <w:r>
-              <w:rPr>
-                <w:sz w:val="18"/>
-              </w:rPr>
-              <w:t>[Wert]</w:t>
-            </w:r>
-          </w:p>
-        </w:tc>
-      </w:tr>
-      <w:tr>
-        <w:trPr>
-          <w:cantSplit/>
-        </w:trPr>
-        <w:tc>
-          <w:tcPr>
-            <w:tcW w:type="dxa" w:w="4535"/>
-            <w:shd w:fill="FFFFFF"/>
-            <w:tcMar>
-              <w:top w:w="90" w:type="dxa"/>
-              <w:left w:w="90" w:type="dxa"/>
-              <w:bottom w:w="90" w:type="dxa"/>
-              <w:right w:w="90" w:type="dxa"/>
-            </w:tcMar>
-            <w:tcBorders>
-              <w:top w:val="single" w:sz="4" w:color="D9D9D9"/>
-              <w:left w:val="single" w:sz="4" w:color="D9D9D9"/>
-              <w:bottom w:val="single" w:sz="4" w:color="D9D9D9"/>
-              <w:right w:val="single" w:sz="4" w:color="D9D9D9"/>
-            </w:tcBorders>
-            <w:vAlign w:val="center"/>
-          </w:tcPr>
-          <w:p>
-            <w:pPr>
-              <w:spacing w:after="40"/>
-            </w:pPr>
-            <w:r>
-              <w:rPr>
-                <w:sz w:val="18"/>
-              </w:rPr>
-              <w:t>4-CN</w:t>
-            </w:r>
-          </w:p>
-        </w:tc>
-        <w:tc>
-          <w:tcPr>
-            <w:tcW w:type="dxa" w:w="2268"/>
-            <w:shd w:fill="FFFFFF"/>
-            <w:tcMar>
-              <w:top w:w="90" w:type="dxa"/>
-              <w:left w:w="90" w:type="dxa"/>
-              <w:bottom w:w="90" w:type="dxa"/>
-              <w:right w:w="90" w:type="dxa"/>
-            </w:tcMar>
-            <w:tcBorders>
-              <w:top w:val="single" w:sz="4" w:color="D9D9D9"/>
-              <w:left w:val="single" w:sz="4" w:color="D9D9D9"/>
-              <w:bottom w:val="single" w:sz="4" w:color="D9D9D9"/>
-              <w:right w:val="single" w:sz="4" w:color="D9D9D9"/>
-            </w:tcBorders>
-            <w:vAlign w:val="center"/>
-          </w:tcPr>
-          <w:p>
-            <w:pPr>
-              <w:spacing w:after="40"/>
-            </w:pPr>
-            <w:r>
-              <w:rPr>
-                <w:sz w:val="18"/>
-              </w:rPr>
-              <w:t>[Wert]</w:t>
-            </w:r>
-          </w:p>
-        </w:tc>
-        <w:tc>
-          <w:tcPr>
-            <w:tcW w:type="dxa" w:w="2835"/>
-            <w:shd w:fill="FFFFFF"/>
-            <w:tcMar>
-              <w:top w:w="90" w:type="dxa"/>
-              <w:left w:w="90" w:type="dxa"/>
-              <w:bottom w:w="90" w:type="dxa"/>
-              <w:right w:w="90" w:type="dxa"/>
-            </w:tcMar>
-            <w:tcBorders>
-              <w:top w:val="single" w:sz="4" w:color="D9D9D9"/>
-              <w:left w:val="single" w:sz="4" w:color="D9D9D9"/>
-              <w:bottom w:val="single" w:sz="4" w:color="D9D9D9"/>
-              <w:right w:val="single" w:sz="4" w:color="D9D9D9"/>
-            </w:tcBorders>
-            <w:vAlign w:val="center"/>
-          </w:tcPr>
-          <w:p>
-            <w:pPr>
-              <w:spacing w:after="40"/>
-            </w:pPr>
-            <w:r>
-              <w:rPr>
-                <w:sz w:val="18"/>
-              </w:rPr>
-              <w:t>[Wert]</w:t>
-            </w:r>
-          </w:p>
-        </w:tc>
-      </w:tr>
-      <w:tr>
-        <w:trPr>
-          <w:cantSplit/>
-        </w:trPr>
-        <w:tc>
-          <w:tcPr>
-            <w:tcW w:type="dxa" w:w="4535"/>
-            <w:shd w:fill="F3F6FA"/>
-            <w:tcMar>
-              <w:top w:w="90" w:type="dxa"/>
-              <w:left w:w="90" w:type="dxa"/>
-              <w:bottom w:w="90" w:type="dxa"/>
-              <w:right w:w="90" w:type="dxa"/>
-            </w:tcMar>
-            <w:tcBorders>
-              <w:top w:val="single" w:sz="4" w:color="D9D9D9"/>
-              <w:left w:val="single" w:sz="4" w:color="D9D9D9"/>
-              <w:bottom w:val="single" w:sz="4" w:color="D9D9D9"/>
-              <w:right w:val="single" w:sz="4" w:color="D9D9D9"/>
-            </w:tcBorders>
-            <w:vAlign w:val="center"/>
-          </w:tcPr>
-          <w:p>
-            <w:pPr>
-              <w:spacing w:after="40"/>
-            </w:pPr>
-            <w:r>
-              <w:rPr>
-                <w:sz w:val="18"/>
-              </w:rPr>
-              <w:t>4-NO₂</w:t>
+              <w:t>4-NO₂ [Name]</w:t>
             </w:r>
           </w:p>
         </w:tc>
@@ -2391,21 +2286,7 @@
         <w:rPr>
           <w:color w:val="586B80"/>
         </w:rPr>
-        <w:t>[Spektren mit Beschriftungen einfügen]</w:t>
-      </w:r>
-    </w:p>
-    <w:p>
-      <w:r>
-        <w:br/>
-        <w:br/>
-      </w:r>
-    </w:p>
-    <w:p>
-      <w:r>
-        <w:rPr>
-          <w:color w:val="586B80"/>
-        </w:rPr>
-        <w:t>Stärkste Verschiebung und Einordnung des Maximums: [Text]</w:t>
+        <w:t>Stärkste Verschiebung zu kleinerer Energie: [Derivat und Verschiebung in eV]</w:t>
       </w:r>
     </w:p>
     <w:p>
@@ -2426,12 +2307,12 @@
         <w:pStyle w:val="Heading2"/>
       </w:pPr>
       <w:r>
-        <w:t>Eigene Versuchsreihe</w:t>
+        <w:t>Eigenes Derivat untersuchen</w:t>
       </w:r>
     </w:p>
     <w:p>
       <w:r>
-        <w:t>Planen Sie in der Gruppe eine Versuchsreihe, um die Absorption möglichst weit in den sichtbaren Bereich zu verschieben. Variieren Sie Art, Anzahl und Position der Substituenten und verteilen Sie die Rechnungen. Berechnen Sie für mindestens zehn Varianten jeweils das Spektrum eines optimierten Minimums. Dokumentieren Sie jede Variante mit Konfiguration, Substitutionspositionen, erwarteter Verschiebung und berechnetem Absorptionsmaximum. Fügen Sie ausgewählte Spektren ein. Begründen Sie Ihre Versuchsplanung und vergleichen Sie Ihre Erwartungen mit den berechneten Ergebnissen.</w:t>
+        <w:t>Vervollständigen Sie die Tabelle für Ihr eigenes cis/trans-Paar und fügen Sie dessen beide Spektren ein. Vergleichen Sie Ihre Vorhersage und das Ergebnis in höchstens zwei Sätzen. Notieren Sie außerdem die beiden ausgewählten Gruppenergebnisse mit Namen und dem jeweils entscheidenden Wert; Dateien anderer Gruppenmitglieder sind nicht erforderlich.</w:t>
       </w:r>
     </w:p>
     <w:p>
@@ -2439,7 +2320,9 @@
         <w:rPr>
           <w:color w:val="586B80"/>
         </w:rPr>
-        <w:t>Planung und Verteilung der Rechnungen in der Gruppe: [Text]</w:t>
+        <w:t>Name und Substitutionsmuster des eigenen Derivats: [Name]</w:t>
+        <w:br/>
+        <w:t>Erwartete Verschiebung gegenüber den unsubstituierten Formen: [Vorhersage]</w:t>
       </w:r>
     </w:p>
     <w:tbl>
@@ -2449,10 +2332,10 @@
         <w:tblLook w:firstColumn="1" w:firstRow="1" w:lastColumn="0" w:lastRow="0" w:noHBand="0" w:noVBand="1" w:val="04A0"/>
       </w:tblPr>
       <w:tblGrid>
-        <w:gridCol w:w="3402"/>
+        <w:gridCol w:w="1984"/>
+        <w:gridCol w:w="2268"/>
         <w:gridCol w:w="2835"/>
-        <w:gridCol w:w="1701"/>
-        <w:gridCol w:w="1701"/>
+        <w:gridCol w:w="2551"/>
       </w:tblGrid>
       <w:tr>
         <w:trPr>
@@ -2461,7 +2344,7 @@
         </w:trPr>
         <w:tc>
           <w:tcPr>
-            <w:tcW w:type="dxa" w:w="3402"/>
+            <w:tcW w:type="dxa" w:w="1984"/>
             <w:shd w:fill="102238"/>
             <w:tcMar>
               <w:top w:w="90" w:type="dxa"/>
@@ -2487,7 +2370,39 @@
                 <w:color w:val="FFFFFF"/>
                 <w:sz w:val="18"/>
               </w:rPr>
-              <w:t>Variante und Konfiguration</w:t>
+              <w:t>Konfiguration</w:t>
+            </w:r>
+          </w:p>
+        </w:tc>
+        <w:tc>
+          <w:tcPr>
+            <w:tcW w:type="dxa" w:w="2268"/>
+            <w:shd w:fill="102238"/>
+            <w:tcMar>
+              <w:top w:w="90" w:type="dxa"/>
+              <w:left w:w="90" w:type="dxa"/>
+              <w:bottom w:w="90" w:type="dxa"/>
+              <w:right w:w="90" w:type="dxa"/>
+            </w:tcMar>
+            <w:tcBorders>
+              <w:top w:val="single" w:sz="4" w:color="D9D9D9"/>
+              <w:left w:val="single" w:sz="4" w:color="D9D9D9"/>
+              <w:bottom w:val="single" w:sz="4" w:color="D9D9D9"/>
+              <w:right w:val="single" w:sz="4" w:color="D9D9D9"/>
+            </w:tcBorders>
+            <w:vAlign w:val="center"/>
+          </w:tcPr>
+          <w:p>
+            <w:pPr>
+              <w:spacing w:after="40"/>
+            </w:pPr>
+            <w:r>
+              <w:rPr>
+                <w:b/>
+                <w:color w:val="FFFFFF"/>
+                <w:sz w:val="18"/>
+              </w:rPr>
+              <w:t>Maximum / eV</w:t>
             </w:r>
           </w:p>
         </w:tc>
@@ -2519,13 +2434,13 @@
                 <w:color w:val="FFFFFF"/>
                 <w:sz w:val="18"/>
               </w:rPr>
-              <w:t>Erwartete Verschiebung</w:t>
+              <w:t>Wellenlänge / nm</w:t>
             </w:r>
           </w:p>
         </w:tc>
         <w:tc>
           <w:tcPr>
-            <w:tcW w:type="dxa" w:w="1701"/>
+            <w:tcW w:type="dxa" w:w="2551"/>
             <w:shd w:fill="102238"/>
             <w:tcMar>
               <w:top w:w="90" w:type="dxa"/>
@@ -2551,39 +2466,7 @@
                 <w:color w:val="FFFFFF"/>
                 <w:sz w:val="18"/>
               </w:rPr>
-              <w:t>Maximum / eV</w:t>
-            </w:r>
-          </w:p>
-        </w:tc>
-        <w:tc>
-          <w:tcPr>
-            <w:tcW w:type="dxa" w:w="1701"/>
-            <w:shd w:fill="102238"/>
-            <w:tcMar>
-              <w:top w:w="90" w:type="dxa"/>
-              <w:left w:w="90" w:type="dxa"/>
-              <w:bottom w:w="90" w:type="dxa"/>
-              <w:right w:w="90" w:type="dxa"/>
-            </w:tcMar>
-            <w:tcBorders>
-              <w:top w:val="single" w:sz="4" w:color="D9D9D9"/>
-              <w:left w:val="single" w:sz="4" w:color="D9D9D9"/>
-              <w:bottom w:val="single" w:sz="4" w:color="D9D9D9"/>
-              <w:right w:val="single" w:sz="4" w:color="D9D9D9"/>
-            </w:tcBorders>
-            <w:vAlign w:val="center"/>
-          </w:tcPr>
-          <w:p>
-            <w:pPr>
-              <w:spacing w:after="40"/>
-            </w:pPr>
-            <w:r>
-              <w:rPr>
-                <w:b/>
-                <w:color w:val="FFFFFF"/>
-                <w:sz w:val="18"/>
-              </w:rPr>
-              <w:t>Wellenlänge / nm</w:t>
+              <w:t>Farbvorhersage</w:t>
             </w:r>
           </w:p>
         </w:tc>
@@ -2594,7 +2477,7 @@
         </w:trPr>
         <w:tc>
           <w:tcPr>
-            <w:tcW w:type="dxa" w:w="3402"/>
+            <w:tcW w:type="dxa" w:w="1984"/>
             <w:shd w:fill="F3F6FA"/>
             <w:tcMar>
               <w:top w:w="90" w:type="dxa"/>
@@ -2618,7 +2501,37 @@
               <w:rPr>
                 <w:sz w:val="18"/>
               </w:rPr>
-              <w:t>1  [Konfiguration, Positionen, Gruppen]</w:t>
+              <w:t>cis</w:t>
+            </w:r>
+          </w:p>
+        </w:tc>
+        <w:tc>
+          <w:tcPr>
+            <w:tcW w:type="dxa" w:w="2268"/>
+            <w:shd w:fill="F3F6FA"/>
+            <w:tcMar>
+              <w:top w:w="90" w:type="dxa"/>
+              <w:left w:w="90" w:type="dxa"/>
+              <w:bottom w:w="90" w:type="dxa"/>
+              <w:right w:w="90" w:type="dxa"/>
+            </w:tcMar>
+            <w:tcBorders>
+              <w:top w:val="single" w:sz="4" w:color="D9D9D9"/>
+              <w:left w:val="single" w:sz="4" w:color="D9D9D9"/>
+              <w:bottom w:val="single" w:sz="4" w:color="D9D9D9"/>
+              <w:right w:val="single" w:sz="4" w:color="D9D9D9"/>
+            </w:tcBorders>
+            <w:vAlign w:val="center"/>
+          </w:tcPr>
+          <w:p>
+            <w:pPr>
+              <w:spacing w:after="40"/>
+            </w:pPr>
+            <w:r>
+              <w:rPr>
+                <w:sz w:val="18"/>
+              </w:rPr>
+              <w:t>[Wert]</w:t>
             </w:r>
           </w:p>
         </w:tc>
@@ -2648,13 +2561,13 @@
               <w:rPr>
                 <w:sz w:val="18"/>
               </w:rPr>
-              <w:t>[Erwartung]</w:t>
+              <w:t>[Wert]</w:t>
             </w:r>
           </w:p>
         </w:tc>
         <w:tc>
           <w:tcPr>
-            <w:tcW w:type="dxa" w:w="1701"/>
+            <w:tcW w:type="dxa" w:w="2551"/>
             <w:shd w:fill="F3F6FA"/>
             <w:tcMar>
               <w:top w:w="90" w:type="dxa"/>
@@ -2678,14 +2591,49 @@
               <w:rPr>
                 <w:sz w:val="18"/>
               </w:rPr>
-              <w:t>[Wert]</w:t>
+              <w:t>[Farbe]</w:t>
+            </w:r>
+          </w:p>
+        </w:tc>
+      </w:tr>
+      <w:tr>
+        <w:trPr>
+          <w:cantSplit/>
+        </w:trPr>
+        <w:tc>
+          <w:tcPr>
+            <w:tcW w:type="dxa" w:w="1984"/>
+            <w:shd w:fill="FFFFFF"/>
+            <w:tcMar>
+              <w:top w:w="90" w:type="dxa"/>
+              <w:left w:w="90" w:type="dxa"/>
+              <w:bottom w:w="90" w:type="dxa"/>
+              <w:right w:w="90" w:type="dxa"/>
+            </w:tcMar>
+            <w:tcBorders>
+              <w:top w:val="single" w:sz="4" w:color="D9D9D9"/>
+              <w:left w:val="single" w:sz="4" w:color="D9D9D9"/>
+              <w:bottom w:val="single" w:sz="4" w:color="D9D9D9"/>
+              <w:right w:val="single" w:sz="4" w:color="D9D9D9"/>
+            </w:tcBorders>
+            <w:vAlign w:val="center"/>
+          </w:tcPr>
+          <w:p>
+            <w:pPr>
+              <w:spacing w:after="40"/>
+            </w:pPr>
+            <w:r>
+              <w:rPr>
+                <w:sz w:val="18"/>
+              </w:rPr>
+              <w:t>trans</w:t>
             </w:r>
           </w:p>
         </w:tc>
         <w:tc>
           <w:tcPr>
-            <w:tcW w:type="dxa" w:w="1701"/>
-            <w:shd w:fill="F3F6FA"/>
+            <w:tcW w:type="dxa" w:w="2268"/>
+            <w:shd w:fill="FFFFFF"/>
             <w:tcMar>
               <w:top w:w="90" w:type="dxa"/>
               <w:left w:w="90" w:type="dxa"/>
@@ -2709,41 +2657,6 @@
                 <w:sz w:val="18"/>
               </w:rPr>
               <w:t>[Wert]</w:t>
-            </w:r>
-          </w:p>
-        </w:tc>
-      </w:tr>
-      <w:tr>
-        <w:trPr>
-          <w:cantSplit/>
-        </w:trPr>
-        <w:tc>
-          <w:tcPr>
-            <w:tcW w:type="dxa" w:w="3402"/>
-            <w:shd w:fill="FFFFFF"/>
-            <w:tcMar>
-              <w:top w:w="90" w:type="dxa"/>
-              <w:left w:w="90" w:type="dxa"/>
-              <w:bottom w:w="90" w:type="dxa"/>
-              <w:right w:w="90" w:type="dxa"/>
-            </w:tcMar>
-            <w:tcBorders>
-              <w:top w:val="single" w:sz="4" w:color="D9D9D9"/>
-              <w:left w:val="single" w:sz="4" w:color="D9D9D9"/>
-              <w:bottom w:val="single" w:sz="4" w:color="D9D9D9"/>
-              <w:right w:val="single" w:sz="4" w:color="D9D9D9"/>
-            </w:tcBorders>
-            <w:vAlign w:val="center"/>
-          </w:tcPr>
-          <w:p>
-            <w:pPr>
-              <w:spacing w:after="40"/>
-            </w:pPr>
-            <w:r>
-              <w:rPr>
-                <w:sz w:val="18"/>
-              </w:rPr>
-              <w:t>2  [Konfiguration, Positionen, Gruppen]</w:t>
             </w:r>
           </w:p>
         </w:tc>
@@ -2773,13 +2686,13 @@
               <w:rPr>
                 <w:sz w:val="18"/>
               </w:rPr>
-              <w:t>[Erwartung]</w:t>
+              <w:t>[Wert]</w:t>
             </w:r>
           </w:p>
         </w:tc>
         <w:tc>
           <w:tcPr>
-            <w:tcW w:type="dxa" w:w="1701"/>
+            <w:tcW w:type="dxa" w:w="2551"/>
             <w:shd w:fill="FFFFFF"/>
             <w:tcMar>
               <w:top w:w="90" w:type="dxa"/>
@@ -2803,1037 +2716,7 @@
               <w:rPr>
                 <w:sz w:val="18"/>
               </w:rPr>
-              <w:t>[Wert]</w:t>
-            </w:r>
-          </w:p>
-        </w:tc>
-        <w:tc>
-          <w:tcPr>
-            <w:tcW w:type="dxa" w:w="1701"/>
-            <w:shd w:fill="FFFFFF"/>
-            <w:tcMar>
-              <w:top w:w="90" w:type="dxa"/>
-              <w:left w:w="90" w:type="dxa"/>
-              <w:bottom w:w="90" w:type="dxa"/>
-              <w:right w:w="90" w:type="dxa"/>
-            </w:tcMar>
-            <w:tcBorders>
-              <w:top w:val="single" w:sz="4" w:color="D9D9D9"/>
-              <w:left w:val="single" w:sz="4" w:color="D9D9D9"/>
-              <w:bottom w:val="single" w:sz="4" w:color="D9D9D9"/>
-              <w:right w:val="single" w:sz="4" w:color="D9D9D9"/>
-            </w:tcBorders>
-            <w:vAlign w:val="center"/>
-          </w:tcPr>
-          <w:p>
-            <w:pPr>
-              <w:spacing w:after="40"/>
-            </w:pPr>
-            <w:r>
-              <w:rPr>
-                <w:sz w:val="18"/>
-              </w:rPr>
-              <w:t>[Wert]</w:t>
-            </w:r>
-          </w:p>
-        </w:tc>
-      </w:tr>
-      <w:tr>
-        <w:trPr>
-          <w:cantSplit/>
-        </w:trPr>
-        <w:tc>
-          <w:tcPr>
-            <w:tcW w:type="dxa" w:w="3402"/>
-            <w:shd w:fill="F3F6FA"/>
-            <w:tcMar>
-              <w:top w:w="90" w:type="dxa"/>
-              <w:left w:w="90" w:type="dxa"/>
-              <w:bottom w:w="90" w:type="dxa"/>
-              <w:right w:w="90" w:type="dxa"/>
-            </w:tcMar>
-            <w:tcBorders>
-              <w:top w:val="single" w:sz="4" w:color="D9D9D9"/>
-              <w:left w:val="single" w:sz="4" w:color="D9D9D9"/>
-              <w:bottom w:val="single" w:sz="4" w:color="D9D9D9"/>
-              <w:right w:val="single" w:sz="4" w:color="D9D9D9"/>
-            </w:tcBorders>
-            <w:vAlign w:val="center"/>
-          </w:tcPr>
-          <w:p>
-            <w:pPr>
-              <w:spacing w:after="40"/>
-            </w:pPr>
-            <w:r>
-              <w:rPr>
-                <w:sz w:val="18"/>
-              </w:rPr>
-              <w:t>3  [Konfiguration, Positionen, Gruppen]</w:t>
-            </w:r>
-          </w:p>
-        </w:tc>
-        <w:tc>
-          <w:tcPr>
-            <w:tcW w:type="dxa" w:w="2835"/>
-            <w:shd w:fill="F3F6FA"/>
-            <w:tcMar>
-              <w:top w:w="90" w:type="dxa"/>
-              <w:left w:w="90" w:type="dxa"/>
-              <w:bottom w:w="90" w:type="dxa"/>
-              <w:right w:w="90" w:type="dxa"/>
-            </w:tcMar>
-            <w:tcBorders>
-              <w:top w:val="single" w:sz="4" w:color="D9D9D9"/>
-              <w:left w:val="single" w:sz="4" w:color="D9D9D9"/>
-              <w:bottom w:val="single" w:sz="4" w:color="D9D9D9"/>
-              <w:right w:val="single" w:sz="4" w:color="D9D9D9"/>
-            </w:tcBorders>
-            <w:vAlign w:val="center"/>
-          </w:tcPr>
-          <w:p>
-            <w:pPr>
-              <w:spacing w:after="40"/>
-            </w:pPr>
-            <w:r>
-              <w:rPr>
-                <w:sz w:val="18"/>
-              </w:rPr>
-              <w:t>[Erwartung]</w:t>
-            </w:r>
-          </w:p>
-        </w:tc>
-        <w:tc>
-          <w:tcPr>
-            <w:tcW w:type="dxa" w:w="1701"/>
-            <w:shd w:fill="F3F6FA"/>
-            <w:tcMar>
-              <w:top w:w="90" w:type="dxa"/>
-              <w:left w:w="90" w:type="dxa"/>
-              <w:bottom w:w="90" w:type="dxa"/>
-              <w:right w:w="90" w:type="dxa"/>
-            </w:tcMar>
-            <w:tcBorders>
-              <w:top w:val="single" w:sz="4" w:color="D9D9D9"/>
-              <w:left w:val="single" w:sz="4" w:color="D9D9D9"/>
-              <w:bottom w:val="single" w:sz="4" w:color="D9D9D9"/>
-              <w:right w:val="single" w:sz="4" w:color="D9D9D9"/>
-            </w:tcBorders>
-            <w:vAlign w:val="center"/>
-          </w:tcPr>
-          <w:p>
-            <w:pPr>
-              <w:spacing w:after="40"/>
-            </w:pPr>
-            <w:r>
-              <w:rPr>
-                <w:sz w:val="18"/>
-              </w:rPr>
-              <w:t>[Wert]</w:t>
-            </w:r>
-          </w:p>
-        </w:tc>
-        <w:tc>
-          <w:tcPr>
-            <w:tcW w:type="dxa" w:w="1701"/>
-            <w:shd w:fill="F3F6FA"/>
-            <w:tcMar>
-              <w:top w:w="90" w:type="dxa"/>
-              <w:left w:w="90" w:type="dxa"/>
-              <w:bottom w:w="90" w:type="dxa"/>
-              <w:right w:w="90" w:type="dxa"/>
-            </w:tcMar>
-            <w:tcBorders>
-              <w:top w:val="single" w:sz="4" w:color="D9D9D9"/>
-              <w:left w:val="single" w:sz="4" w:color="D9D9D9"/>
-              <w:bottom w:val="single" w:sz="4" w:color="D9D9D9"/>
-              <w:right w:val="single" w:sz="4" w:color="D9D9D9"/>
-            </w:tcBorders>
-            <w:vAlign w:val="center"/>
-          </w:tcPr>
-          <w:p>
-            <w:pPr>
-              <w:spacing w:after="40"/>
-            </w:pPr>
-            <w:r>
-              <w:rPr>
-                <w:sz w:val="18"/>
-              </w:rPr>
-              <w:t>[Wert]</w:t>
-            </w:r>
-          </w:p>
-        </w:tc>
-      </w:tr>
-      <w:tr>
-        <w:trPr>
-          <w:cantSplit/>
-        </w:trPr>
-        <w:tc>
-          <w:tcPr>
-            <w:tcW w:type="dxa" w:w="3402"/>
-            <w:shd w:fill="FFFFFF"/>
-            <w:tcMar>
-              <w:top w:w="90" w:type="dxa"/>
-              <w:left w:w="90" w:type="dxa"/>
-              <w:bottom w:w="90" w:type="dxa"/>
-              <w:right w:w="90" w:type="dxa"/>
-            </w:tcMar>
-            <w:tcBorders>
-              <w:top w:val="single" w:sz="4" w:color="D9D9D9"/>
-              <w:left w:val="single" w:sz="4" w:color="D9D9D9"/>
-              <w:bottom w:val="single" w:sz="4" w:color="D9D9D9"/>
-              <w:right w:val="single" w:sz="4" w:color="D9D9D9"/>
-            </w:tcBorders>
-            <w:vAlign w:val="center"/>
-          </w:tcPr>
-          <w:p>
-            <w:pPr>
-              <w:spacing w:after="40"/>
-            </w:pPr>
-            <w:r>
-              <w:rPr>
-                <w:sz w:val="18"/>
-              </w:rPr>
-              <w:t>4  [Konfiguration, Positionen, Gruppen]</w:t>
-            </w:r>
-          </w:p>
-        </w:tc>
-        <w:tc>
-          <w:tcPr>
-            <w:tcW w:type="dxa" w:w="2835"/>
-            <w:shd w:fill="FFFFFF"/>
-            <w:tcMar>
-              <w:top w:w="90" w:type="dxa"/>
-              <w:left w:w="90" w:type="dxa"/>
-              <w:bottom w:w="90" w:type="dxa"/>
-              <w:right w:w="90" w:type="dxa"/>
-            </w:tcMar>
-            <w:tcBorders>
-              <w:top w:val="single" w:sz="4" w:color="D9D9D9"/>
-              <w:left w:val="single" w:sz="4" w:color="D9D9D9"/>
-              <w:bottom w:val="single" w:sz="4" w:color="D9D9D9"/>
-              <w:right w:val="single" w:sz="4" w:color="D9D9D9"/>
-            </w:tcBorders>
-            <w:vAlign w:val="center"/>
-          </w:tcPr>
-          <w:p>
-            <w:pPr>
-              <w:spacing w:after="40"/>
-            </w:pPr>
-            <w:r>
-              <w:rPr>
-                <w:sz w:val="18"/>
-              </w:rPr>
-              <w:t>[Erwartung]</w:t>
-            </w:r>
-          </w:p>
-        </w:tc>
-        <w:tc>
-          <w:tcPr>
-            <w:tcW w:type="dxa" w:w="1701"/>
-            <w:shd w:fill="FFFFFF"/>
-            <w:tcMar>
-              <w:top w:w="90" w:type="dxa"/>
-              <w:left w:w="90" w:type="dxa"/>
-              <w:bottom w:w="90" w:type="dxa"/>
-              <w:right w:w="90" w:type="dxa"/>
-            </w:tcMar>
-            <w:tcBorders>
-              <w:top w:val="single" w:sz="4" w:color="D9D9D9"/>
-              <w:left w:val="single" w:sz="4" w:color="D9D9D9"/>
-              <w:bottom w:val="single" w:sz="4" w:color="D9D9D9"/>
-              <w:right w:val="single" w:sz="4" w:color="D9D9D9"/>
-            </w:tcBorders>
-            <w:vAlign w:val="center"/>
-          </w:tcPr>
-          <w:p>
-            <w:pPr>
-              <w:spacing w:after="40"/>
-            </w:pPr>
-            <w:r>
-              <w:rPr>
-                <w:sz w:val="18"/>
-              </w:rPr>
-              <w:t>[Wert]</w:t>
-            </w:r>
-          </w:p>
-        </w:tc>
-        <w:tc>
-          <w:tcPr>
-            <w:tcW w:type="dxa" w:w="1701"/>
-            <w:shd w:fill="FFFFFF"/>
-            <w:tcMar>
-              <w:top w:w="90" w:type="dxa"/>
-              <w:left w:w="90" w:type="dxa"/>
-              <w:bottom w:w="90" w:type="dxa"/>
-              <w:right w:w="90" w:type="dxa"/>
-            </w:tcMar>
-            <w:tcBorders>
-              <w:top w:val="single" w:sz="4" w:color="D9D9D9"/>
-              <w:left w:val="single" w:sz="4" w:color="D9D9D9"/>
-              <w:bottom w:val="single" w:sz="4" w:color="D9D9D9"/>
-              <w:right w:val="single" w:sz="4" w:color="D9D9D9"/>
-            </w:tcBorders>
-            <w:vAlign w:val="center"/>
-          </w:tcPr>
-          <w:p>
-            <w:pPr>
-              <w:spacing w:after="40"/>
-            </w:pPr>
-            <w:r>
-              <w:rPr>
-                <w:sz w:val="18"/>
-              </w:rPr>
-              <w:t>[Wert]</w:t>
-            </w:r>
-          </w:p>
-        </w:tc>
-      </w:tr>
-      <w:tr>
-        <w:trPr>
-          <w:cantSplit/>
-        </w:trPr>
-        <w:tc>
-          <w:tcPr>
-            <w:tcW w:type="dxa" w:w="3402"/>
-            <w:shd w:fill="F3F6FA"/>
-            <w:tcMar>
-              <w:top w:w="90" w:type="dxa"/>
-              <w:left w:w="90" w:type="dxa"/>
-              <w:bottom w:w="90" w:type="dxa"/>
-              <w:right w:w="90" w:type="dxa"/>
-            </w:tcMar>
-            <w:tcBorders>
-              <w:top w:val="single" w:sz="4" w:color="D9D9D9"/>
-              <w:left w:val="single" w:sz="4" w:color="D9D9D9"/>
-              <w:bottom w:val="single" w:sz="4" w:color="D9D9D9"/>
-              <w:right w:val="single" w:sz="4" w:color="D9D9D9"/>
-            </w:tcBorders>
-            <w:vAlign w:val="center"/>
-          </w:tcPr>
-          <w:p>
-            <w:pPr>
-              <w:spacing w:after="40"/>
-            </w:pPr>
-            <w:r>
-              <w:rPr>
-                <w:sz w:val="18"/>
-              </w:rPr>
-              <w:t>5  [Konfiguration, Positionen, Gruppen]</w:t>
-            </w:r>
-          </w:p>
-        </w:tc>
-        <w:tc>
-          <w:tcPr>
-            <w:tcW w:type="dxa" w:w="2835"/>
-            <w:shd w:fill="F3F6FA"/>
-            <w:tcMar>
-              <w:top w:w="90" w:type="dxa"/>
-              <w:left w:w="90" w:type="dxa"/>
-              <w:bottom w:w="90" w:type="dxa"/>
-              <w:right w:w="90" w:type="dxa"/>
-            </w:tcMar>
-            <w:tcBorders>
-              <w:top w:val="single" w:sz="4" w:color="D9D9D9"/>
-              <w:left w:val="single" w:sz="4" w:color="D9D9D9"/>
-              <w:bottom w:val="single" w:sz="4" w:color="D9D9D9"/>
-              <w:right w:val="single" w:sz="4" w:color="D9D9D9"/>
-            </w:tcBorders>
-            <w:vAlign w:val="center"/>
-          </w:tcPr>
-          <w:p>
-            <w:pPr>
-              <w:spacing w:after="40"/>
-            </w:pPr>
-            <w:r>
-              <w:rPr>
-                <w:sz w:val="18"/>
-              </w:rPr>
-              <w:t>[Erwartung]</w:t>
-            </w:r>
-          </w:p>
-        </w:tc>
-        <w:tc>
-          <w:tcPr>
-            <w:tcW w:type="dxa" w:w="1701"/>
-            <w:shd w:fill="F3F6FA"/>
-            <w:tcMar>
-              <w:top w:w="90" w:type="dxa"/>
-              <w:left w:w="90" w:type="dxa"/>
-              <w:bottom w:w="90" w:type="dxa"/>
-              <w:right w:w="90" w:type="dxa"/>
-            </w:tcMar>
-            <w:tcBorders>
-              <w:top w:val="single" w:sz="4" w:color="D9D9D9"/>
-              <w:left w:val="single" w:sz="4" w:color="D9D9D9"/>
-              <w:bottom w:val="single" w:sz="4" w:color="D9D9D9"/>
-              <w:right w:val="single" w:sz="4" w:color="D9D9D9"/>
-            </w:tcBorders>
-            <w:vAlign w:val="center"/>
-          </w:tcPr>
-          <w:p>
-            <w:pPr>
-              <w:spacing w:after="40"/>
-            </w:pPr>
-            <w:r>
-              <w:rPr>
-                <w:sz w:val="18"/>
-              </w:rPr>
-              <w:t>[Wert]</w:t>
-            </w:r>
-          </w:p>
-        </w:tc>
-        <w:tc>
-          <w:tcPr>
-            <w:tcW w:type="dxa" w:w="1701"/>
-            <w:shd w:fill="F3F6FA"/>
-            <w:tcMar>
-              <w:top w:w="90" w:type="dxa"/>
-              <w:left w:w="90" w:type="dxa"/>
-              <w:bottom w:w="90" w:type="dxa"/>
-              <w:right w:w="90" w:type="dxa"/>
-            </w:tcMar>
-            <w:tcBorders>
-              <w:top w:val="single" w:sz="4" w:color="D9D9D9"/>
-              <w:left w:val="single" w:sz="4" w:color="D9D9D9"/>
-              <w:bottom w:val="single" w:sz="4" w:color="D9D9D9"/>
-              <w:right w:val="single" w:sz="4" w:color="D9D9D9"/>
-            </w:tcBorders>
-            <w:vAlign w:val="center"/>
-          </w:tcPr>
-          <w:p>
-            <w:pPr>
-              <w:spacing w:after="40"/>
-            </w:pPr>
-            <w:r>
-              <w:rPr>
-                <w:sz w:val="18"/>
-              </w:rPr>
-              <w:t>[Wert]</w:t>
-            </w:r>
-          </w:p>
-        </w:tc>
-      </w:tr>
-      <w:tr>
-        <w:trPr>
-          <w:cantSplit/>
-        </w:trPr>
-        <w:tc>
-          <w:tcPr>
-            <w:tcW w:type="dxa" w:w="3402"/>
-            <w:shd w:fill="FFFFFF"/>
-            <w:tcMar>
-              <w:top w:w="90" w:type="dxa"/>
-              <w:left w:w="90" w:type="dxa"/>
-              <w:bottom w:w="90" w:type="dxa"/>
-              <w:right w:w="90" w:type="dxa"/>
-            </w:tcMar>
-            <w:tcBorders>
-              <w:top w:val="single" w:sz="4" w:color="D9D9D9"/>
-              <w:left w:val="single" w:sz="4" w:color="D9D9D9"/>
-              <w:bottom w:val="single" w:sz="4" w:color="D9D9D9"/>
-              <w:right w:val="single" w:sz="4" w:color="D9D9D9"/>
-            </w:tcBorders>
-            <w:vAlign w:val="center"/>
-          </w:tcPr>
-          <w:p>
-            <w:pPr>
-              <w:spacing w:after="40"/>
-            </w:pPr>
-            <w:r>
-              <w:rPr>
-                <w:sz w:val="18"/>
-              </w:rPr>
-              <w:t>6  [Konfiguration, Positionen, Gruppen]</w:t>
-            </w:r>
-          </w:p>
-        </w:tc>
-        <w:tc>
-          <w:tcPr>
-            <w:tcW w:type="dxa" w:w="2835"/>
-            <w:shd w:fill="FFFFFF"/>
-            <w:tcMar>
-              <w:top w:w="90" w:type="dxa"/>
-              <w:left w:w="90" w:type="dxa"/>
-              <w:bottom w:w="90" w:type="dxa"/>
-              <w:right w:w="90" w:type="dxa"/>
-            </w:tcMar>
-            <w:tcBorders>
-              <w:top w:val="single" w:sz="4" w:color="D9D9D9"/>
-              <w:left w:val="single" w:sz="4" w:color="D9D9D9"/>
-              <w:bottom w:val="single" w:sz="4" w:color="D9D9D9"/>
-              <w:right w:val="single" w:sz="4" w:color="D9D9D9"/>
-            </w:tcBorders>
-            <w:vAlign w:val="center"/>
-          </w:tcPr>
-          <w:p>
-            <w:pPr>
-              <w:spacing w:after="40"/>
-            </w:pPr>
-            <w:r>
-              <w:rPr>
-                <w:sz w:val="18"/>
-              </w:rPr>
-              <w:t>[Erwartung]</w:t>
-            </w:r>
-          </w:p>
-        </w:tc>
-        <w:tc>
-          <w:tcPr>
-            <w:tcW w:type="dxa" w:w="1701"/>
-            <w:shd w:fill="FFFFFF"/>
-            <w:tcMar>
-              <w:top w:w="90" w:type="dxa"/>
-              <w:left w:w="90" w:type="dxa"/>
-              <w:bottom w:w="90" w:type="dxa"/>
-              <w:right w:w="90" w:type="dxa"/>
-            </w:tcMar>
-            <w:tcBorders>
-              <w:top w:val="single" w:sz="4" w:color="D9D9D9"/>
-              <w:left w:val="single" w:sz="4" w:color="D9D9D9"/>
-              <w:bottom w:val="single" w:sz="4" w:color="D9D9D9"/>
-              <w:right w:val="single" w:sz="4" w:color="D9D9D9"/>
-            </w:tcBorders>
-            <w:vAlign w:val="center"/>
-          </w:tcPr>
-          <w:p>
-            <w:pPr>
-              <w:spacing w:after="40"/>
-            </w:pPr>
-            <w:r>
-              <w:rPr>
-                <w:sz w:val="18"/>
-              </w:rPr>
-              <w:t>[Wert]</w:t>
-            </w:r>
-          </w:p>
-        </w:tc>
-        <w:tc>
-          <w:tcPr>
-            <w:tcW w:type="dxa" w:w="1701"/>
-            <w:shd w:fill="FFFFFF"/>
-            <w:tcMar>
-              <w:top w:w="90" w:type="dxa"/>
-              <w:left w:w="90" w:type="dxa"/>
-              <w:bottom w:w="90" w:type="dxa"/>
-              <w:right w:w="90" w:type="dxa"/>
-            </w:tcMar>
-            <w:tcBorders>
-              <w:top w:val="single" w:sz="4" w:color="D9D9D9"/>
-              <w:left w:val="single" w:sz="4" w:color="D9D9D9"/>
-              <w:bottom w:val="single" w:sz="4" w:color="D9D9D9"/>
-              <w:right w:val="single" w:sz="4" w:color="D9D9D9"/>
-            </w:tcBorders>
-            <w:vAlign w:val="center"/>
-          </w:tcPr>
-          <w:p>
-            <w:pPr>
-              <w:spacing w:after="40"/>
-            </w:pPr>
-            <w:r>
-              <w:rPr>
-                <w:sz w:val="18"/>
-              </w:rPr>
-              <w:t>[Wert]</w:t>
-            </w:r>
-          </w:p>
-        </w:tc>
-      </w:tr>
-      <w:tr>
-        <w:trPr>
-          <w:cantSplit/>
-        </w:trPr>
-        <w:tc>
-          <w:tcPr>
-            <w:tcW w:type="dxa" w:w="3402"/>
-            <w:shd w:fill="F3F6FA"/>
-            <w:tcMar>
-              <w:top w:w="90" w:type="dxa"/>
-              <w:left w:w="90" w:type="dxa"/>
-              <w:bottom w:w="90" w:type="dxa"/>
-              <w:right w:w="90" w:type="dxa"/>
-            </w:tcMar>
-            <w:tcBorders>
-              <w:top w:val="single" w:sz="4" w:color="D9D9D9"/>
-              <w:left w:val="single" w:sz="4" w:color="D9D9D9"/>
-              <w:bottom w:val="single" w:sz="4" w:color="D9D9D9"/>
-              <w:right w:val="single" w:sz="4" w:color="D9D9D9"/>
-            </w:tcBorders>
-            <w:vAlign w:val="center"/>
-          </w:tcPr>
-          <w:p>
-            <w:pPr>
-              <w:spacing w:after="40"/>
-            </w:pPr>
-            <w:r>
-              <w:rPr>
-                <w:sz w:val="18"/>
-              </w:rPr>
-              <w:t>7  [Konfiguration, Positionen, Gruppen]</w:t>
-            </w:r>
-          </w:p>
-        </w:tc>
-        <w:tc>
-          <w:tcPr>
-            <w:tcW w:type="dxa" w:w="2835"/>
-            <w:shd w:fill="F3F6FA"/>
-            <w:tcMar>
-              <w:top w:w="90" w:type="dxa"/>
-              <w:left w:w="90" w:type="dxa"/>
-              <w:bottom w:w="90" w:type="dxa"/>
-              <w:right w:w="90" w:type="dxa"/>
-            </w:tcMar>
-            <w:tcBorders>
-              <w:top w:val="single" w:sz="4" w:color="D9D9D9"/>
-              <w:left w:val="single" w:sz="4" w:color="D9D9D9"/>
-              <w:bottom w:val="single" w:sz="4" w:color="D9D9D9"/>
-              <w:right w:val="single" w:sz="4" w:color="D9D9D9"/>
-            </w:tcBorders>
-            <w:vAlign w:val="center"/>
-          </w:tcPr>
-          <w:p>
-            <w:pPr>
-              <w:spacing w:after="40"/>
-            </w:pPr>
-            <w:r>
-              <w:rPr>
-                <w:sz w:val="18"/>
-              </w:rPr>
-              <w:t>[Erwartung]</w:t>
-            </w:r>
-          </w:p>
-        </w:tc>
-        <w:tc>
-          <w:tcPr>
-            <w:tcW w:type="dxa" w:w="1701"/>
-            <w:shd w:fill="F3F6FA"/>
-            <w:tcMar>
-              <w:top w:w="90" w:type="dxa"/>
-              <w:left w:w="90" w:type="dxa"/>
-              <w:bottom w:w="90" w:type="dxa"/>
-              <w:right w:w="90" w:type="dxa"/>
-            </w:tcMar>
-            <w:tcBorders>
-              <w:top w:val="single" w:sz="4" w:color="D9D9D9"/>
-              <w:left w:val="single" w:sz="4" w:color="D9D9D9"/>
-              <w:bottom w:val="single" w:sz="4" w:color="D9D9D9"/>
-              <w:right w:val="single" w:sz="4" w:color="D9D9D9"/>
-            </w:tcBorders>
-            <w:vAlign w:val="center"/>
-          </w:tcPr>
-          <w:p>
-            <w:pPr>
-              <w:spacing w:after="40"/>
-            </w:pPr>
-            <w:r>
-              <w:rPr>
-                <w:sz w:val="18"/>
-              </w:rPr>
-              <w:t>[Wert]</w:t>
-            </w:r>
-          </w:p>
-        </w:tc>
-        <w:tc>
-          <w:tcPr>
-            <w:tcW w:type="dxa" w:w="1701"/>
-            <w:shd w:fill="F3F6FA"/>
-            <w:tcMar>
-              <w:top w:w="90" w:type="dxa"/>
-              <w:left w:w="90" w:type="dxa"/>
-              <w:bottom w:w="90" w:type="dxa"/>
-              <w:right w:w="90" w:type="dxa"/>
-            </w:tcMar>
-            <w:tcBorders>
-              <w:top w:val="single" w:sz="4" w:color="D9D9D9"/>
-              <w:left w:val="single" w:sz="4" w:color="D9D9D9"/>
-              <w:bottom w:val="single" w:sz="4" w:color="D9D9D9"/>
-              <w:right w:val="single" w:sz="4" w:color="D9D9D9"/>
-            </w:tcBorders>
-            <w:vAlign w:val="center"/>
-          </w:tcPr>
-          <w:p>
-            <w:pPr>
-              <w:spacing w:after="40"/>
-            </w:pPr>
-            <w:r>
-              <w:rPr>
-                <w:sz w:val="18"/>
-              </w:rPr>
-              <w:t>[Wert]</w:t>
-            </w:r>
-          </w:p>
-        </w:tc>
-      </w:tr>
-      <w:tr>
-        <w:trPr>
-          <w:cantSplit/>
-        </w:trPr>
-        <w:tc>
-          <w:tcPr>
-            <w:tcW w:type="dxa" w:w="3402"/>
-            <w:shd w:fill="FFFFFF"/>
-            <w:tcMar>
-              <w:top w:w="90" w:type="dxa"/>
-              <w:left w:w="90" w:type="dxa"/>
-              <w:bottom w:w="90" w:type="dxa"/>
-              <w:right w:w="90" w:type="dxa"/>
-            </w:tcMar>
-            <w:tcBorders>
-              <w:top w:val="single" w:sz="4" w:color="D9D9D9"/>
-              <w:left w:val="single" w:sz="4" w:color="D9D9D9"/>
-              <w:bottom w:val="single" w:sz="4" w:color="D9D9D9"/>
-              <w:right w:val="single" w:sz="4" w:color="D9D9D9"/>
-            </w:tcBorders>
-            <w:vAlign w:val="center"/>
-          </w:tcPr>
-          <w:p>
-            <w:pPr>
-              <w:spacing w:after="40"/>
-            </w:pPr>
-            <w:r>
-              <w:rPr>
-                <w:sz w:val="18"/>
-              </w:rPr>
-              <w:t>8  [Konfiguration, Positionen, Gruppen]</w:t>
-            </w:r>
-          </w:p>
-        </w:tc>
-        <w:tc>
-          <w:tcPr>
-            <w:tcW w:type="dxa" w:w="2835"/>
-            <w:shd w:fill="FFFFFF"/>
-            <w:tcMar>
-              <w:top w:w="90" w:type="dxa"/>
-              <w:left w:w="90" w:type="dxa"/>
-              <w:bottom w:w="90" w:type="dxa"/>
-              <w:right w:w="90" w:type="dxa"/>
-            </w:tcMar>
-            <w:tcBorders>
-              <w:top w:val="single" w:sz="4" w:color="D9D9D9"/>
-              <w:left w:val="single" w:sz="4" w:color="D9D9D9"/>
-              <w:bottom w:val="single" w:sz="4" w:color="D9D9D9"/>
-              <w:right w:val="single" w:sz="4" w:color="D9D9D9"/>
-            </w:tcBorders>
-            <w:vAlign w:val="center"/>
-          </w:tcPr>
-          <w:p>
-            <w:pPr>
-              <w:spacing w:after="40"/>
-            </w:pPr>
-            <w:r>
-              <w:rPr>
-                <w:sz w:val="18"/>
-              </w:rPr>
-              <w:t>[Erwartung]</w:t>
-            </w:r>
-          </w:p>
-        </w:tc>
-        <w:tc>
-          <w:tcPr>
-            <w:tcW w:type="dxa" w:w="1701"/>
-            <w:shd w:fill="FFFFFF"/>
-            <w:tcMar>
-              <w:top w:w="90" w:type="dxa"/>
-              <w:left w:w="90" w:type="dxa"/>
-              <w:bottom w:w="90" w:type="dxa"/>
-              <w:right w:w="90" w:type="dxa"/>
-            </w:tcMar>
-            <w:tcBorders>
-              <w:top w:val="single" w:sz="4" w:color="D9D9D9"/>
-              <w:left w:val="single" w:sz="4" w:color="D9D9D9"/>
-              <w:bottom w:val="single" w:sz="4" w:color="D9D9D9"/>
-              <w:right w:val="single" w:sz="4" w:color="D9D9D9"/>
-            </w:tcBorders>
-            <w:vAlign w:val="center"/>
-          </w:tcPr>
-          <w:p>
-            <w:pPr>
-              <w:spacing w:after="40"/>
-            </w:pPr>
-            <w:r>
-              <w:rPr>
-                <w:sz w:val="18"/>
-              </w:rPr>
-              <w:t>[Wert]</w:t>
-            </w:r>
-          </w:p>
-        </w:tc>
-        <w:tc>
-          <w:tcPr>
-            <w:tcW w:type="dxa" w:w="1701"/>
-            <w:shd w:fill="FFFFFF"/>
-            <w:tcMar>
-              <w:top w:w="90" w:type="dxa"/>
-              <w:left w:w="90" w:type="dxa"/>
-              <w:bottom w:w="90" w:type="dxa"/>
-              <w:right w:w="90" w:type="dxa"/>
-            </w:tcMar>
-            <w:tcBorders>
-              <w:top w:val="single" w:sz="4" w:color="D9D9D9"/>
-              <w:left w:val="single" w:sz="4" w:color="D9D9D9"/>
-              <w:bottom w:val="single" w:sz="4" w:color="D9D9D9"/>
-              <w:right w:val="single" w:sz="4" w:color="D9D9D9"/>
-            </w:tcBorders>
-            <w:vAlign w:val="center"/>
-          </w:tcPr>
-          <w:p>
-            <w:pPr>
-              <w:spacing w:after="40"/>
-            </w:pPr>
-            <w:r>
-              <w:rPr>
-                <w:sz w:val="18"/>
-              </w:rPr>
-              <w:t>[Wert]</w:t>
-            </w:r>
-          </w:p>
-        </w:tc>
-      </w:tr>
-      <w:tr>
-        <w:trPr>
-          <w:cantSplit/>
-        </w:trPr>
-        <w:tc>
-          <w:tcPr>
-            <w:tcW w:type="dxa" w:w="3402"/>
-            <w:shd w:fill="F3F6FA"/>
-            <w:tcMar>
-              <w:top w:w="90" w:type="dxa"/>
-              <w:left w:w="90" w:type="dxa"/>
-              <w:bottom w:w="90" w:type="dxa"/>
-              <w:right w:w="90" w:type="dxa"/>
-            </w:tcMar>
-            <w:tcBorders>
-              <w:top w:val="single" w:sz="4" w:color="D9D9D9"/>
-              <w:left w:val="single" w:sz="4" w:color="D9D9D9"/>
-              <w:bottom w:val="single" w:sz="4" w:color="D9D9D9"/>
-              <w:right w:val="single" w:sz="4" w:color="D9D9D9"/>
-            </w:tcBorders>
-            <w:vAlign w:val="center"/>
-          </w:tcPr>
-          <w:p>
-            <w:pPr>
-              <w:spacing w:after="40"/>
-            </w:pPr>
-            <w:r>
-              <w:rPr>
-                <w:sz w:val="18"/>
-              </w:rPr>
-              <w:t>9  [Konfiguration, Positionen, Gruppen]</w:t>
-            </w:r>
-          </w:p>
-        </w:tc>
-        <w:tc>
-          <w:tcPr>
-            <w:tcW w:type="dxa" w:w="2835"/>
-            <w:shd w:fill="F3F6FA"/>
-            <w:tcMar>
-              <w:top w:w="90" w:type="dxa"/>
-              <w:left w:w="90" w:type="dxa"/>
-              <w:bottom w:w="90" w:type="dxa"/>
-              <w:right w:w="90" w:type="dxa"/>
-            </w:tcMar>
-            <w:tcBorders>
-              <w:top w:val="single" w:sz="4" w:color="D9D9D9"/>
-              <w:left w:val="single" w:sz="4" w:color="D9D9D9"/>
-              <w:bottom w:val="single" w:sz="4" w:color="D9D9D9"/>
-              <w:right w:val="single" w:sz="4" w:color="D9D9D9"/>
-            </w:tcBorders>
-            <w:vAlign w:val="center"/>
-          </w:tcPr>
-          <w:p>
-            <w:pPr>
-              <w:spacing w:after="40"/>
-            </w:pPr>
-            <w:r>
-              <w:rPr>
-                <w:sz w:val="18"/>
-              </w:rPr>
-              <w:t>[Erwartung]</w:t>
-            </w:r>
-          </w:p>
-        </w:tc>
-        <w:tc>
-          <w:tcPr>
-            <w:tcW w:type="dxa" w:w="1701"/>
-            <w:shd w:fill="F3F6FA"/>
-            <w:tcMar>
-              <w:top w:w="90" w:type="dxa"/>
-              <w:left w:w="90" w:type="dxa"/>
-              <w:bottom w:w="90" w:type="dxa"/>
-              <w:right w:w="90" w:type="dxa"/>
-            </w:tcMar>
-            <w:tcBorders>
-              <w:top w:val="single" w:sz="4" w:color="D9D9D9"/>
-              <w:left w:val="single" w:sz="4" w:color="D9D9D9"/>
-              <w:bottom w:val="single" w:sz="4" w:color="D9D9D9"/>
-              <w:right w:val="single" w:sz="4" w:color="D9D9D9"/>
-            </w:tcBorders>
-            <w:vAlign w:val="center"/>
-          </w:tcPr>
-          <w:p>
-            <w:pPr>
-              <w:spacing w:after="40"/>
-            </w:pPr>
-            <w:r>
-              <w:rPr>
-                <w:sz w:val="18"/>
-              </w:rPr>
-              <w:t>[Wert]</w:t>
-            </w:r>
-          </w:p>
-        </w:tc>
-        <w:tc>
-          <w:tcPr>
-            <w:tcW w:type="dxa" w:w="1701"/>
-            <w:shd w:fill="F3F6FA"/>
-            <w:tcMar>
-              <w:top w:w="90" w:type="dxa"/>
-              <w:left w:w="90" w:type="dxa"/>
-              <w:bottom w:w="90" w:type="dxa"/>
-              <w:right w:w="90" w:type="dxa"/>
-            </w:tcMar>
-            <w:tcBorders>
-              <w:top w:val="single" w:sz="4" w:color="D9D9D9"/>
-              <w:left w:val="single" w:sz="4" w:color="D9D9D9"/>
-              <w:bottom w:val="single" w:sz="4" w:color="D9D9D9"/>
-              <w:right w:val="single" w:sz="4" w:color="D9D9D9"/>
-            </w:tcBorders>
-            <w:vAlign w:val="center"/>
-          </w:tcPr>
-          <w:p>
-            <w:pPr>
-              <w:spacing w:after="40"/>
-            </w:pPr>
-            <w:r>
-              <w:rPr>
-                <w:sz w:val="18"/>
-              </w:rPr>
-              <w:t>[Wert]</w:t>
-            </w:r>
-          </w:p>
-        </w:tc>
-      </w:tr>
-      <w:tr>
-        <w:trPr>
-          <w:cantSplit/>
-        </w:trPr>
-        <w:tc>
-          <w:tcPr>
-            <w:tcW w:type="dxa" w:w="3402"/>
-            <w:shd w:fill="FFFFFF"/>
-            <w:tcMar>
-              <w:top w:w="90" w:type="dxa"/>
-              <w:left w:w="90" w:type="dxa"/>
-              <w:bottom w:w="90" w:type="dxa"/>
-              <w:right w:w="90" w:type="dxa"/>
-            </w:tcMar>
-            <w:tcBorders>
-              <w:top w:val="single" w:sz="4" w:color="D9D9D9"/>
-              <w:left w:val="single" w:sz="4" w:color="D9D9D9"/>
-              <w:bottom w:val="single" w:sz="4" w:color="D9D9D9"/>
-              <w:right w:val="single" w:sz="4" w:color="D9D9D9"/>
-            </w:tcBorders>
-            <w:vAlign w:val="center"/>
-          </w:tcPr>
-          <w:p>
-            <w:pPr>
-              <w:spacing w:after="40"/>
-            </w:pPr>
-            <w:r>
-              <w:rPr>
-                <w:sz w:val="18"/>
-              </w:rPr>
-              <w:t>10  [Konfiguration, Positionen, Gruppen]</w:t>
-            </w:r>
-          </w:p>
-        </w:tc>
-        <w:tc>
-          <w:tcPr>
-            <w:tcW w:type="dxa" w:w="2835"/>
-            <w:shd w:fill="FFFFFF"/>
-            <w:tcMar>
-              <w:top w:w="90" w:type="dxa"/>
-              <w:left w:w="90" w:type="dxa"/>
-              <w:bottom w:w="90" w:type="dxa"/>
-              <w:right w:w="90" w:type="dxa"/>
-            </w:tcMar>
-            <w:tcBorders>
-              <w:top w:val="single" w:sz="4" w:color="D9D9D9"/>
-              <w:left w:val="single" w:sz="4" w:color="D9D9D9"/>
-              <w:bottom w:val="single" w:sz="4" w:color="D9D9D9"/>
-              <w:right w:val="single" w:sz="4" w:color="D9D9D9"/>
-            </w:tcBorders>
-            <w:vAlign w:val="center"/>
-          </w:tcPr>
-          <w:p>
-            <w:pPr>
-              <w:spacing w:after="40"/>
-            </w:pPr>
-            <w:r>
-              <w:rPr>
-                <w:sz w:val="18"/>
-              </w:rPr>
-              <w:t>[Erwartung]</w:t>
-            </w:r>
-          </w:p>
-        </w:tc>
-        <w:tc>
-          <w:tcPr>
-            <w:tcW w:type="dxa" w:w="1701"/>
-            <w:shd w:fill="FFFFFF"/>
-            <w:tcMar>
-              <w:top w:w="90" w:type="dxa"/>
-              <w:left w:w="90" w:type="dxa"/>
-              <w:bottom w:w="90" w:type="dxa"/>
-              <w:right w:w="90" w:type="dxa"/>
-            </w:tcMar>
-            <w:tcBorders>
-              <w:top w:val="single" w:sz="4" w:color="D9D9D9"/>
-              <w:left w:val="single" w:sz="4" w:color="D9D9D9"/>
-              <w:bottom w:val="single" w:sz="4" w:color="D9D9D9"/>
-              <w:right w:val="single" w:sz="4" w:color="D9D9D9"/>
-            </w:tcBorders>
-            <w:vAlign w:val="center"/>
-          </w:tcPr>
-          <w:p>
-            <w:pPr>
-              <w:spacing w:after="40"/>
-            </w:pPr>
-            <w:r>
-              <w:rPr>
-                <w:sz w:val="18"/>
-              </w:rPr>
-              <w:t>[Wert]</w:t>
-            </w:r>
-          </w:p>
-        </w:tc>
-        <w:tc>
-          <w:tcPr>
-            <w:tcW w:type="dxa" w:w="1701"/>
-            <w:shd w:fill="FFFFFF"/>
-            <w:tcMar>
-              <w:top w:w="90" w:type="dxa"/>
-              <w:left w:w="90" w:type="dxa"/>
-              <w:bottom w:w="90" w:type="dxa"/>
-              <w:right w:w="90" w:type="dxa"/>
-            </w:tcMar>
-            <w:tcBorders>
-              <w:top w:val="single" w:sz="4" w:color="D9D9D9"/>
-              <w:left w:val="single" w:sz="4" w:color="D9D9D9"/>
-              <w:bottom w:val="single" w:sz="4" w:color="D9D9D9"/>
-              <w:right w:val="single" w:sz="4" w:color="D9D9D9"/>
-            </w:tcBorders>
-            <w:vAlign w:val="center"/>
-          </w:tcPr>
-          <w:p>
-            <w:pPr>
-              <w:spacing w:after="40"/>
-            </w:pPr>
-            <w:r>
-              <w:rPr>
-                <w:sz w:val="18"/>
-              </w:rPr>
-              <w:t>[Wert]</w:t>
+              <w:t>[Farbe]</w:t>
             </w:r>
           </w:p>
         </w:tc>
@@ -3847,7 +2730,13 @@
         <w:rPr>
           <w:color w:val="586B80"/>
         </w:rPr>
-        <w:t>[Ausgewählte Spektren mit Beschriftungen einfügen]</w:t>
+        <w:t>cis: [Spektrum einfügen und beschriften]</w:t>
+      </w:r>
+    </w:p>
+    <w:p>
+      <w:r>
+        <w:br/>
+        <w:br/>
       </w:r>
     </w:p>
     <w:p>
@@ -3855,7 +2744,37 @@
         <w:rPr>
           <w:color w:val="586B80"/>
         </w:rPr>
-        <w:t>Vergleich der Erwartungen mit den berechneten Ergebnissen: [Text]</w:t>
+        <w:t>trans: [Spektrum einfügen und beschriften]</w:t>
+      </w:r>
+    </w:p>
+    <w:p>
+      <w:r>
+        <w:br/>
+        <w:br/>
+      </w:r>
+    </w:p>
+    <w:p>
+      <w:r>
+        <w:rPr>
+          <w:color w:val="586B80"/>
+        </w:rPr>
+        <w:t>Vorhersage und Ergebnis: [höchstens zwei Sätze]</w:t>
+      </w:r>
+    </w:p>
+    <w:p>
+      <w:r>
+        <w:rPr>
+          <w:color w:val="586B80"/>
+        </w:rPr>
+        <w:t>Längstwelliges Gruppenresultat: [Name und Wellenlänge]</w:t>
+      </w:r>
+    </w:p>
+    <w:p>
+      <w:r>
+        <w:rPr>
+          <w:color w:val="586B80"/>
+        </w:rPr>
+        <w:t>Stärkster vorhergesagter cis/trans-Farbunterschied: [Name und Farben bei Faktor 1,0]</w:t>
       </w:r>
     </w:p>
     <w:sectPr>
@@ -4646,7 +3565,7 @@
       <w:rFonts w:asciiTheme="majorHAnsi" w:eastAsiaTheme="majorEastAsia" w:hAnsiTheme="majorHAnsi" w:cstheme="majorBidi" w:ascii="Arial" w:hAnsi="Arial"/>
       <w:i/>
       <w:iCs/>
-      <w:color w:val="586B80"/>
+      <w:color w:val="000000"/>
       <w:spacing w:val="15"/>
       <w:sz w:val="28"/>
       <w:szCs w:val="24"/>

</xml_diff>

<commit_message>
Refocus structure task on molecular symmetry
</commit_message>
<xml_diff>
--- a/src/achprak/web/static/materials/protokollvorlage.docx
+++ b/src/achprak/web/static/materials/protokollvorlage.docx
@@ -56,20 +56,12 @@
         <w:pStyle w:val="Heading2"/>
       </w:pPr>
       <w:r>
-        <w:t>Konfigurationen erkennen</w:t>
+        <w:t>Konfiguration und chemische Identität untersuchen</w:t>
       </w:r>
     </w:p>
     <w:p>
       <w:r>
-        <w:t>Notieren Sie den Namen Ihres Derivats. Erklären Sie in höchstens zwei Sätzen, ob sich Zusammensetzung, die Verknüpfung der Atome oder die räumliche Anordnung zwischen cis- und trans-Azobenzol unterscheiden und warum eine Drehung des gesamten Modells sie nicht ineinander überführt.</w:t>
-      </w:r>
-    </w:p>
-    <w:p>
-      <w:r>
-        <w:rPr>
-          <w:color w:val="586B80"/>
-        </w:rPr>
-        <w:t>Name des selbst gewählten Derivats: [Name einschließlich Konfiguration]</w:t>
+        <w:t>Erklären Sie in höchstens zwei Sätzen, ob sich Zusammensetzung, die Verknüpfung der Atome oder die räumliche Anordnung zwischen cis- und trans-Azobenzol unterscheiden und warum eine Drehung des gesamten Modells sie nicht ineinander überführt. Geben Sie an, wie viele chemisch verschiedene trans-Azobenzole mit genau einer Methoxygruppe Sie erhalten, und fassen Sie die jeweils symmetrieäquivalenten Auswahlpositionen zusammen.</w:t>
       </w:r>
     </w:p>
     <w:p>
@@ -78,6 +70,22 @@
           <w:color w:val="586B80"/>
         </w:rPr>
         <w:t>Unterschied zwischen cis und trans: [höchstens zwei Sätze]</w:t>
+      </w:r>
+    </w:p>
+    <w:p>
+      <w:r>
+        <w:rPr>
+          <w:color w:val="586B80"/>
+        </w:rPr>
+        <w:t>Anzahl chemisch verschiedener trans-Azobenzole mit genau einer Methoxygruppe: [Anzahl]</w:t>
+      </w:r>
+    </w:p>
+    <w:p>
+      <w:r>
+        <w:rPr>
+          <w:color w:val="586B80"/>
+        </w:rPr>
+        <w:t>Symmetrieäquivalente Auswahlpositionen: [Fassen Sie die zehn Positionen in Gruppen zusammen]</w:t>
       </w:r>
     </w:p>
     <w:p>

</xml_diff>

<commit_message>
Split configuration and symmetry tasks
</commit_message>
<xml_diff>
--- a/src/achprak/web/static/materials/protokollvorlage.docx
+++ b/src/achprak/web/static/materials/protokollvorlage.docx
@@ -56,12 +56,12 @@
         <w:pStyle w:val="Heading2"/>
       </w:pPr>
       <w:r>
-        <w:t>Konfiguration und chemische Identität untersuchen</w:t>
+        <w:t>Konfigurationen vergleichen</w:t>
       </w:r>
     </w:p>
     <w:p>
       <w:r>
-        <w:t>Erklären Sie in höchstens zwei Sätzen, ob sich Zusammensetzung, die Verknüpfung der Atome oder die räumliche Anordnung zwischen cis- und trans-Azobenzol unterscheiden und warum eine Drehung des gesamten Modells sie nicht ineinander überführt. Geben Sie an, wie viele chemisch verschiedene trans-Azobenzole mit genau einer Methoxygruppe Sie erhalten, und fassen Sie die jeweils symmetrieäquivalenten Auswahlpositionen zusammen.</w:t>
+        <w:t>Erklären Sie in höchstens zwei Sätzen, ob sich Zusammensetzung, die Verknüpfung der Atome oder die räumliche Anordnung zwischen cis- und trans-Azobenzol unterscheiden und warum eine Drehung des gesamten Modells sie nicht ineinander überführt.</w:t>
       </w:r>
     </w:p>
     <w:p>
@@ -70,6 +70,19 @@
           <w:color w:val="586B80"/>
         </w:rPr>
         <w:t>Unterschied zwischen cis und trans: [höchstens zwei Sätze]</w:t>
+      </w:r>
+    </w:p>
+    <w:p>
+      <w:pPr>
+        <w:pStyle w:val="Heading2"/>
+      </w:pPr>
+      <w:r>
+        <w:t>Symmetrie erkennen</w:t>
+      </w:r>
+    </w:p>
+    <w:p>
+      <w:r>
+        <w:t>Geben Sie an, wie viele chemisch verschiedene trans-Azobenzole mit genau einer Methoxygruppe Sie erhalten, und fassen Sie die jeweils symmetrieäquivalenten Auswahlpositionen zusammen. Begründen Sie Ihre Zuordnung anhand der Symmetrie des Grundgerüsts in höchstens zwei Sätzen.</w:t>
       </w:r>
     </w:p>
     <w:p>
@@ -86,6 +99,14 @@
           <w:color w:val="586B80"/>
         </w:rPr>
         <w:t>Symmetrieäquivalente Auswahlpositionen: [Fassen Sie die zehn Positionen in Gruppen zusammen]</w:t>
+      </w:r>
+    </w:p>
+    <w:p>
+      <w:r>
+        <w:rPr>
+          <w:color w:val="586B80"/>
+        </w:rPr>
+        <w:t>Begründung anhand der Symmetrie: [höchstens zwei Sätze]</w:t>
       </w:r>
     </w:p>
     <w:p>

</xml_diff>

<commit_message>
Harmonize task panel spacing
</commit_message>
<xml_diff>
--- a/src/achprak/web/static/materials/protokollvorlage.docx
+++ b/src/achprak/web/static/materials/protokollvorlage.docx
@@ -838,7 +838,7 @@
         <w:pStyle w:val="Heading2"/>
       </w:pPr>
       <w:r>
-        <w:t>Reaktionspfad und Barrieren analysieren</w:t>
+        <w:t>Reaktionspfad analysieren</w:t>
       </w:r>
     </w:p>
     <w:p>
@@ -1196,7 +1196,7 @@
         <w:pStyle w:val="Heading2"/>
       </w:pPr>
       <w:r>
-        <w:t>Spektren und Photoschaltung untersuchen</w:t>
+        <w:t>Spektren vergleichen</w:t>
       </w:r>
     </w:p>
     <w:p>
@@ -2336,7 +2336,7 @@
         <w:pStyle w:val="Heading2"/>
       </w:pPr>
       <w:r>
-        <w:t>Eigenes Derivat untersuchen</w:t>
+        <w:t>Derivat untersuchen</w:t>
       </w:r>
     </w:p>
     <w:p>

</xml_diff>

<commit_message>
Refine spectra exercise guidance
</commit_message>
<xml_diff>
--- a/src/achprak/web/static/materials/protokollvorlage.docx
+++ b/src/achprak/web/static/materials/protokollvorlage.docx
@@ -843,7 +843,7 @@
     </w:p>
     <w:p>
       <w:r>
-        <w:t>Geben Sie Ihre Vorhersage an und vervollständigen Sie die Tabelle für die drei Strukturen. Fügen Sie gleich ausgerichtete 3D-Ansichten der substituierten Start- und Minimumstruktur ein. Erklären Sie anhand der räumlich benachbarten Gruppen, wie sich Diederwinkel und Ringabstand bei der Optimierung ändern und wie sich die substituierte von der unsubstituierten Minimumstruktur unterscheidet. Verwenden Sie dafür höchstens vier Sätze.</w:t>
+        <w:t>Geben Sie Ihre Vermutung an und vervollständigen Sie die Tabelle für die drei Strukturen. Fügen Sie gleich ausgerichtete 3D-Ansichten der substituierten Start- und Minimumstruktur ein. Erklären Sie anhand der räumlich benachbarten Gruppen, wie sich Diederwinkel und Ringabstand bei der Optimierung ändern und wie sich die substituierte von der unsubstituierten Minimumstruktur unterscheidet. Verwenden Sie dafür höchstens vier Sätze.</w:t>
       </w:r>
     </w:p>
     <w:p>
@@ -851,7 +851,7 @@
         <w:rPr>
           <w:color w:val="586B80"/>
         </w:rPr>
-        <w:t>Vorhersage für die Änderung der Ringstellung: [Ihre Vorhersage]</w:t>
+        <w:t>Vermutung zur Änderung der Ringstellung: [Ihre Vermutung]</w:t>
       </w:r>
     </w:p>
     <w:tbl>
@@ -1671,7 +1671,7 @@
     </w:p>
     <w:p>
       <w:r>
-        <w:t>Vervollständigen Sie die Tabelle für cis- und trans-Azobenzol. Begründen Sie in höchstens drei Sätzen Ihre Wahl des Wellenlängenbereichs, die erwartete Verschiebung des cis/trans-Verhältnisses und die Grenze dieser Vorhersage. Kennzeichnen Sie Absorptionsmaxima und Farben als Modellvorhersagen.</w:t>
+        <w:t>Vervollständigen Sie die Tabelle für cis- und trans-Azobenzol. Begründen Sie in höchstens drei Sätzen Ihre Wahl des Wellenlängenbereichs, geben Sie die dort stärker absorbierende Konfiguration an und erklären Sie, warum sich daraus keine Änderung des cis/trans-Verhältnisses ableiten lässt. Kennzeichnen Sie Absorptionsmaxima und Farben als Modellvorhersagen.</w:t>
       </w:r>
     </w:p>
     <w:tbl>
@@ -2265,7 +2265,7 @@
         <w:rPr>
           <w:color w:val="586B80"/>
         </w:rPr>
-        <w:t>Bevorzugte Anregung und Grenze der Vorhersage: [höchstens drei Sätze]</w:t>
+        <w:t>Wellenlängenbereich, stärker absorbierende Konfiguration und Grenze der Aussage: [höchstens drei Sätze]</w:t>
       </w:r>
     </w:p>
     <w:p>
@@ -2291,7 +2291,7 @@
     </w:p>
     <w:p>
       <w:r>
-        <w:t xml:space="preserve">Notieren Sie die zugeteilte Reihe und Ihre Vorhersage. Vervollständigen Sie die Tabelle für alle sechs Derivate. Fügen Sie die Spektren der Derivate mit dem kleinsten und dem größten Wert von </w:t>
+        <w:t xml:space="preserve">Notieren Sie die zugeteilte Reihe und vervollständigen Sie die Tabelle für alle sechs Derivate. Fügen Sie die Spektren der Derivate mit dem kleinsten und dem größten Wert von </w:t>
       </w:r>
       <w:r>
         <w:t>ΔE</w:t>
@@ -2303,7 +2303,7 @@
         <w:t>max</w:t>
       </w:r>
       <w:r>
-        <w:t xml:space="preserve"> ein. Beschreiben Sie den Trend innerhalb Ihrer Reihe, vergleichen Sie ihn mit Ihrer Vorhersage und nennen Sie mindestens eine Abweichung, die nicht in einen einfachen Trend passt. Verwenden Sie dafür höchstens vier Sätze und kennzeichnen Sie Spektren, Maxima und Farben als Modellvorhersagen.</w:t>
+        <w:t xml:space="preserve"> ein. Beschreiben Sie den Trend innerhalb Ihrer Reihe und nennen Sie mindestens eine Abweichung, die nicht in einen einfachen Trend passt. Verwenden Sie dafür höchstens vier Sätze und kennzeichnen Sie Spektren, Maxima und Farben als Modellvorhersagen.</w:t>
       </w:r>
     </w:p>
     <w:p>
@@ -2312,14 +2312,6 @@
           <w:color w:val="586B80"/>
         </w:rPr>
         <w:t>Zugeordnete Reihe: [4-X, 2-X, 3-X oder 4,4′-X₂]</w:t>
-      </w:r>
-    </w:p>
-    <w:p>
-      <w:r>
-        <w:rPr>
-          <w:color w:val="586B80"/>
-        </w:rPr>
-        <w:t>Vorhersage: [Substituent mit der erwarteten stärksten Verschiebung zu kleinerer Energie und kurze Begründung]</w:t>
       </w:r>
     </w:p>
     <w:tbl>
@@ -3984,7 +3976,7 @@
         <w:rPr>
           <w:color w:val="586B80"/>
         </w:rPr>
-        <w:t>Trend, Vergleich mit der Vorhersage und Abweichung: [höchstens vier Sätze]</w:t>
+        <w:t>Trend und Abweichung: [höchstens vier Sätze]</w:t>
       </w:r>
     </w:p>
     <w:p>
@@ -5189,7 +5181,7 @@
     </w:p>
     <w:p>
       <w:r>
-        <w:t>Benennen und begründen Sie Ihr Substitutionsmuster anhand eines Ergebnisses aus den systematischen Reihen und notieren Sie Ihre Vorhersage. Vervollständigen Sie die Tabelle für Ihr cis/trans-Paar und fügen Sie beide Spektren ein. Geben Sie an, ob das Ergebnis den zugrunde gelegten Trend stützt, ihm widerspricht oder keine eindeutige Aussage erlaubt. Notieren Sie außerdem die beiden ausgewählten Gruppenergebnisse mit Namen und dem jeweils entscheidenden Wert.</w:t>
+        <w:t>Benennen und begründen Sie Ihr Substitutionsmuster anhand eines Ergebnisses aus den systematischen Reihen und notieren Sie Ihre Vermutung. Vervollständigen Sie die Tabelle für Ihr cis/trans-Paar und fügen Sie beide Spektren ein. Geben Sie an, ob das Ergebnis den zugrunde gelegten Trend stützt, ihm widerspricht oder keine eindeutige Aussage erlaubt. Notieren Sie außerdem die beiden ausgewählten Gruppenergebnisse mit Namen und dem jeweils entscheidenden Wert.</w:t>
       </w:r>
     </w:p>
     <w:p>
@@ -5201,7 +5193,7 @@
         <w:br/>
         <w:t>Bezug zur systematischen Reihe und Begründung der Auswahl: [Ergebnis und Begründung]</w:t>
         <w:br/>
-        <w:t>Vorhersage: [Ihre Vorhersage vor den Rechnungen]</w:t>
+        <w:t>Vermutung: [Ihre Vermutung vor den Rechnungen]</w:t>
       </w:r>
     </w:p>
     <w:tbl>
@@ -5730,7 +5722,7 @@
         <w:rPr>
           <w:color w:val="586B80"/>
         </w:rPr>
-        <w:t>Vergleich der vollständigen Spektren und Prüfung der Vorhersage: [Stützt das Ergebnis den Trend, widerspricht es ihm oder ist keine eindeutige Aussage möglich?]</w:t>
+        <w:t>Vergleich der vollständigen Spektren und Prüfung der Vermutung: [Stützt das Ergebnis den zugrunde gelegten Trend, widerspricht es ihm oder ist keine eindeutige Aussage möglich?]</w:t>
       </w:r>
     </w:p>
     <w:p>

</xml_diff>

<commit_message>
Use structure terminology in teaching materials
</commit_message>
<xml_diff>
--- a/src/achprak/web/static/materials/protokollvorlage.docx
+++ b/src/achprak/web/static/materials/protokollvorlage.docx
@@ -119,7 +119,7 @@
         <w:pStyle w:val="Heading1"/>
       </w:pPr>
       <w:r>
-        <w:t>Geometrien und Energiebarrieren untersuchen</w:t>
+        <w:t>Strukturen und Energiebarrieren untersuchen</w:t>
       </w:r>
     </w:p>
     <w:p>
@@ -132,7 +132,7 @@
     </w:p>
     <w:p>
       <w:r>
-        <w:t>Vervollständigen Sie die Tabelle für die vier Strukturen. Beschreiben Sie die Geometrieänderungen und erläutern Sie am Vorzeichen von ΔE, welche Konfiguration im verwendeten Modell die niedrigere elektronische Energie hat. Verwenden Sie dafür insgesamt höchstens drei Sätze.</w:t>
+        <w:t>Vervollständigen Sie die Tabelle für die vier Strukturen. Beschreiben Sie die Strukturänderungen und erläutern Sie am Vorzeichen von ΔE, welche Konfiguration im verwendeten Modell die niedrigere elektronische Energie hat. Verwenden Sie dafür insgesamt höchstens drei Sätze.</w:t>
       </w:r>
     </w:p>
     <w:tbl>
@@ -830,7 +830,7 @@
         </w:rPr>
         <w:t xml:space="preserve"> / (kJ/mol): [Wert]</w:t>
         <w:br/>
-        <w:t>Geometrieänderungen und Einordnung des Vorzeichens: [höchstens drei Sätze]</w:t>
+        <w:t>Strukturänderungen und Einordnung des Vorzeichens: [höchstens drei Sätze]</w:t>
       </w:r>
     </w:p>
     <w:p>

</xml_diff>

<commit_message>
Prefer excitation energies in teaching materials
</commit_message>
<xml_diff>
--- a/src/achprak/web/static/materials/protokollvorlage.docx
+++ b/src/achprak/web/static/materials/protokollvorlage.docx
@@ -1671,7 +1671,7 @@
     </w:p>
     <w:p>
       <w:r>
-        <w:t>Vervollständigen Sie die Tabelle für cis- und trans-Azobenzol. Begründen Sie in höchstens drei Sätzen Ihre Wahl des Wellenlängenbereichs, geben Sie die dort stärker absorbierende Konfiguration an und erklären Sie, warum sich daraus keine Änderung des cis/trans-Verhältnisses ableiten lässt. Kennzeichnen Sie Absorptionsmaxima und Farben als Modellvorhersagen.</w:t>
+        <w:t>Vervollständigen Sie die Tabelle für cis- und trans-Azobenzol. Begründen Sie in höchstens drei Sätzen Ihre Wahl des Energiebereichs, geben Sie die dort stärker absorbierende Konfiguration an und erklären Sie, warum sich daraus keine Änderung des cis/trans-Verhältnisses ableiten lässt. Kennzeichnen Sie Absorptionsmaxima und Farben als Modellvorhersagen.</w:t>
       </w:r>
     </w:p>
     <w:tbl>
@@ -1681,12 +1681,11 @@
         <w:tblLook w:firstColumn="1" w:firstRow="1" w:lastColumn="0" w:lastRow="0" w:noHBand="0" w:noVBand="1" w:val="04A0"/>
       </w:tblPr>
       <w:tblGrid>
-        <w:gridCol w:w="1417"/>
-        <w:gridCol w:w="1417"/>
+        <w:gridCol w:w="1587"/>
         <w:gridCol w:w="1701"/>
-        <w:gridCol w:w="1531"/>
-        <w:gridCol w:w="1701"/>
-        <w:gridCol w:w="1871"/>
+        <w:gridCol w:w="1757"/>
+        <w:gridCol w:w="2154"/>
+        <w:gridCol w:w="2438"/>
       </w:tblGrid>
       <w:tr>
         <w:trPr>
@@ -1695,7 +1694,7 @@
         </w:trPr>
         <w:tc>
           <w:tcPr>
-            <w:tcW w:type="dxa" w:w="1417"/>
+            <w:tcW w:type="dxa" w:w="1587"/>
             <w:shd w:fill="102238"/>
             <w:tcMar>
               <w:top w:w="90" w:type="dxa"/>
@@ -1727,7 +1726,7 @@
         </w:tc>
         <w:tc>
           <w:tcPr>
-            <w:tcW w:type="dxa" w:w="1417"/>
+            <w:tcW w:type="dxa" w:w="1701"/>
             <w:shd w:fill="102238"/>
             <w:tcMar>
               <w:top w:w="90" w:type="dxa"/>
@@ -1759,7 +1758,7 @@
         </w:tc>
         <w:tc>
           <w:tcPr>
-            <w:tcW w:type="dxa" w:w="1701"/>
+            <w:tcW w:type="dxa" w:w="1757"/>
             <w:shd w:fill="102238"/>
             <w:tcMar>
               <w:top w:w="90" w:type="dxa"/>
@@ -1785,7 +1784,555 @@
                 <w:color w:val="FFFFFF"/>
                 <w:sz w:val="18"/>
               </w:rPr>
-              <w:t>Wellenlänge / nm</w:t>
+              <w:t>UV oder sichtbar</w:t>
+            </w:r>
+          </w:p>
+        </w:tc>
+        <w:tc>
+          <w:tcPr>
+            <w:tcW w:type="dxa" w:w="2154"/>
+            <w:shd w:fill="102238"/>
+            <w:tcMar>
+              <w:top w:w="90" w:type="dxa"/>
+              <w:left w:w="90" w:type="dxa"/>
+              <w:bottom w:w="90" w:type="dxa"/>
+              <w:right w:w="90" w:type="dxa"/>
+            </w:tcMar>
+            <w:tcBorders>
+              <w:top w:val="single" w:sz="4" w:color="D9D9D9"/>
+              <w:left w:val="single" w:sz="4" w:color="D9D9D9"/>
+              <w:bottom w:val="single" w:sz="4" w:color="D9D9D9"/>
+              <w:right w:val="single" w:sz="4" w:color="D9D9D9"/>
+            </w:tcBorders>
+            <w:vAlign w:val="center"/>
+          </w:tcPr>
+          <w:p>
+            <w:pPr>
+              <w:spacing w:after="40"/>
+            </w:pPr>
+            <w:r>
+              <w:rPr>
+                <w:b/>
+                <w:color w:val="FFFFFF"/>
+                <w:sz w:val="18"/>
+              </w:rPr>
+              <w:t>Farbvorhersage</w:t>
+            </w:r>
+          </w:p>
+        </w:tc>
+        <w:tc>
+          <w:tcPr>
+            <w:tcW w:type="dxa" w:w="2438"/>
+            <w:shd w:fill="102238"/>
+            <w:tcMar>
+              <w:top w:w="90" w:type="dxa"/>
+              <w:left w:w="90" w:type="dxa"/>
+              <w:bottom w:w="90" w:type="dxa"/>
+              <w:right w:w="90" w:type="dxa"/>
+            </w:tcMar>
+            <w:tcBorders>
+              <w:top w:val="single" w:sz="4" w:color="D9D9D9"/>
+              <w:left w:val="single" w:sz="4" w:color="D9D9D9"/>
+              <w:bottom w:val="single" w:sz="4" w:color="D9D9D9"/>
+              <w:right w:val="single" w:sz="4" w:color="D9D9D9"/>
+            </w:tcBorders>
+            <w:vAlign w:val="center"/>
+          </w:tcPr>
+          <w:p>
+            <w:pPr>
+              <w:spacing w:after="40"/>
+            </w:pPr>
+            <w:r>
+              <w:rPr>
+                <w:b/>
+                <w:color w:val="FFFFFF"/>
+                <w:sz w:val="18"/>
+              </w:rPr>
+              <w:t>Lichtdurchlässigkeit / %</w:t>
+            </w:r>
+          </w:p>
+        </w:tc>
+      </w:tr>
+      <w:tr>
+        <w:trPr>
+          <w:cantSplit/>
+        </w:trPr>
+        <w:tc>
+          <w:tcPr>
+            <w:tcW w:type="dxa" w:w="1587"/>
+            <w:shd w:fill="F3F6FA"/>
+            <w:tcMar>
+              <w:top w:w="90" w:type="dxa"/>
+              <w:left w:w="90" w:type="dxa"/>
+              <w:bottom w:w="90" w:type="dxa"/>
+              <w:right w:w="90" w:type="dxa"/>
+            </w:tcMar>
+            <w:tcBorders>
+              <w:top w:val="single" w:sz="4" w:color="D9D9D9"/>
+              <w:left w:val="single" w:sz="4" w:color="D9D9D9"/>
+              <w:bottom w:val="single" w:sz="4" w:color="D9D9D9"/>
+              <w:right w:val="single" w:sz="4" w:color="D9D9D9"/>
+            </w:tcBorders>
+            <w:vAlign w:val="center"/>
+          </w:tcPr>
+          <w:p>
+            <w:pPr>
+              <w:spacing w:after="40"/>
+            </w:pPr>
+            <w:r>
+              <w:rPr>
+                <w:sz w:val="18"/>
+              </w:rPr>
+              <w:t>cis</w:t>
+            </w:r>
+          </w:p>
+        </w:tc>
+        <w:tc>
+          <w:tcPr>
+            <w:tcW w:type="dxa" w:w="1701"/>
+            <w:shd w:fill="F3F6FA"/>
+            <w:tcMar>
+              <w:top w:w="90" w:type="dxa"/>
+              <w:left w:w="90" w:type="dxa"/>
+              <w:bottom w:w="90" w:type="dxa"/>
+              <w:right w:w="90" w:type="dxa"/>
+            </w:tcMar>
+            <w:tcBorders>
+              <w:top w:val="single" w:sz="4" w:color="D9D9D9"/>
+              <w:left w:val="single" w:sz="4" w:color="D9D9D9"/>
+              <w:bottom w:val="single" w:sz="4" w:color="D9D9D9"/>
+              <w:right w:val="single" w:sz="4" w:color="D9D9D9"/>
+            </w:tcBorders>
+            <w:vAlign w:val="center"/>
+          </w:tcPr>
+          <w:p>
+            <w:pPr>
+              <w:spacing w:after="40"/>
+            </w:pPr>
+            <w:r>
+              <w:rPr>
+                <w:sz w:val="18"/>
+              </w:rPr>
+              <w:t>[Wert]</w:t>
+            </w:r>
+          </w:p>
+        </w:tc>
+        <w:tc>
+          <w:tcPr>
+            <w:tcW w:type="dxa" w:w="1757"/>
+            <w:shd w:fill="F3F6FA"/>
+            <w:tcMar>
+              <w:top w:w="90" w:type="dxa"/>
+              <w:left w:w="90" w:type="dxa"/>
+              <w:bottom w:w="90" w:type="dxa"/>
+              <w:right w:w="90" w:type="dxa"/>
+            </w:tcMar>
+            <w:tcBorders>
+              <w:top w:val="single" w:sz="4" w:color="D9D9D9"/>
+              <w:left w:val="single" w:sz="4" w:color="D9D9D9"/>
+              <w:bottom w:val="single" w:sz="4" w:color="D9D9D9"/>
+              <w:right w:val="single" w:sz="4" w:color="D9D9D9"/>
+            </w:tcBorders>
+            <w:vAlign w:val="center"/>
+          </w:tcPr>
+          <w:p>
+            <w:pPr>
+              <w:spacing w:after="40"/>
+            </w:pPr>
+            <w:r>
+              <w:rPr>
+                <w:sz w:val="18"/>
+              </w:rPr>
+              <w:t>[Bereich]</w:t>
+            </w:r>
+          </w:p>
+        </w:tc>
+        <w:tc>
+          <w:tcPr>
+            <w:tcW w:type="dxa" w:w="2154"/>
+            <w:shd w:fill="F3F6FA"/>
+            <w:tcMar>
+              <w:top w:w="90" w:type="dxa"/>
+              <w:left w:w="90" w:type="dxa"/>
+              <w:bottom w:w="90" w:type="dxa"/>
+              <w:right w:w="90" w:type="dxa"/>
+            </w:tcMar>
+            <w:tcBorders>
+              <w:top w:val="single" w:sz="4" w:color="D9D9D9"/>
+              <w:left w:val="single" w:sz="4" w:color="D9D9D9"/>
+              <w:bottom w:val="single" w:sz="4" w:color="D9D9D9"/>
+              <w:right w:val="single" w:sz="4" w:color="D9D9D9"/>
+            </w:tcBorders>
+            <w:vAlign w:val="center"/>
+          </w:tcPr>
+          <w:p>
+            <w:pPr>
+              <w:spacing w:after="40"/>
+            </w:pPr>
+            <w:r>
+              <w:rPr>
+                <w:sz w:val="18"/>
+              </w:rPr>
+              <w:t>[Farbe]</w:t>
+            </w:r>
+          </w:p>
+        </w:tc>
+        <w:tc>
+          <w:tcPr>
+            <w:tcW w:type="dxa" w:w="2438"/>
+            <w:shd w:fill="F3F6FA"/>
+            <w:tcMar>
+              <w:top w:w="90" w:type="dxa"/>
+              <w:left w:w="90" w:type="dxa"/>
+              <w:bottom w:w="90" w:type="dxa"/>
+              <w:right w:w="90" w:type="dxa"/>
+            </w:tcMar>
+            <w:tcBorders>
+              <w:top w:val="single" w:sz="4" w:color="D9D9D9"/>
+              <w:left w:val="single" w:sz="4" w:color="D9D9D9"/>
+              <w:bottom w:val="single" w:sz="4" w:color="D9D9D9"/>
+              <w:right w:val="single" w:sz="4" w:color="D9D9D9"/>
+            </w:tcBorders>
+            <w:vAlign w:val="center"/>
+          </w:tcPr>
+          <w:p>
+            <w:pPr>
+              <w:spacing w:after="40"/>
+            </w:pPr>
+            <w:r>
+              <w:rPr>
+                <w:sz w:val="18"/>
+              </w:rPr>
+              <w:t>[Wert]</w:t>
+            </w:r>
+          </w:p>
+        </w:tc>
+      </w:tr>
+      <w:tr>
+        <w:trPr>
+          <w:cantSplit/>
+        </w:trPr>
+        <w:tc>
+          <w:tcPr>
+            <w:tcW w:type="dxa" w:w="1587"/>
+            <w:shd w:fill="FFFFFF"/>
+            <w:tcMar>
+              <w:top w:w="90" w:type="dxa"/>
+              <w:left w:w="90" w:type="dxa"/>
+              <w:bottom w:w="90" w:type="dxa"/>
+              <w:right w:w="90" w:type="dxa"/>
+            </w:tcMar>
+            <w:tcBorders>
+              <w:top w:val="single" w:sz="4" w:color="D9D9D9"/>
+              <w:left w:val="single" w:sz="4" w:color="D9D9D9"/>
+              <w:bottom w:val="single" w:sz="4" w:color="D9D9D9"/>
+              <w:right w:val="single" w:sz="4" w:color="D9D9D9"/>
+            </w:tcBorders>
+            <w:vAlign w:val="center"/>
+          </w:tcPr>
+          <w:p>
+            <w:pPr>
+              <w:spacing w:after="40"/>
+            </w:pPr>
+            <w:r>
+              <w:rPr>
+                <w:sz w:val="18"/>
+              </w:rPr>
+              <w:t>trans</w:t>
+            </w:r>
+          </w:p>
+        </w:tc>
+        <w:tc>
+          <w:tcPr>
+            <w:tcW w:type="dxa" w:w="1701"/>
+            <w:shd w:fill="FFFFFF"/>
+            <w:tcMar>
+              <w:top w:w="90" w:type="dxa"/>
+              <w:left w:w="90" w:type="dxa"/>
+              <w:bottom w:w="90" w:type="dxa"/>
+              <w:right w:w="90" w:type="dxa"/>
+            </w:tcMar>
+            <w:tcBorders>
+              <w:top w:val="single" w:sz="4" w:color="D9D9D9"/>
+              <w:left w:val="single" w:sz="4" w:color="D9D9D9"/>
+              <w:bottom w:val="single" w:sz="4" w:color="D9D9D9"/>
+              <w:right w:val="single" w:sz="4" w:color="D9D9D9"/>
+            </w:tcBorders>
+            <w:vAlign w:val="center"/>
+          </w:tcPr>
+          <w:p>
+            <w:pPr>
+              <w:spacing w:after="40"/>
+            </w:pPr>
+            <w:r>
+              <w:rPr>
+                <w:sz w:val="18"/>
+              </w:rPr>
+              <w:t>[Wert]</w:t>
+            </w:r>
+          </w:p>
+        </w:tc>
+        <w:tc>
+          <w:tcPr>
+            <w:tcW w:type="dxa" w:w="1757"/>
+            <w:shd w:fill="FFFFFF"/>
+            <w:tcMar>
+              <w:top w:w="90" w:type="dxa"/>
+              <w:left w:w="90" w:type="dxa"/>
+              <w:bottom w:w="90" w:type="dxa"/>
+              <w:right w:w="90" w:type="dxa"/>
+            </w:tcMar>
+            <w:tcBorders>
+              <w:top w:val="single" w:sz="4" w:color="D9D9D9"/>
+              <w:left w:val="single" w:sz="4" w:color="D9D9D9"/>
+              <w:bottom w:val="single" w:sz="4" w:color="D9D9D9"/>
+              <w:right w:val="single" w:sz="4" w:color="D9D9D9"/>
+            </w:tcBorders>
+            <w:vAlign w:val="center"/>
+          </w:tcPr>
+          <w:p>
+            <w:pPr>
+              <w:spacing w:after="40"/>
+            </w:pPr>
+            <w:r>
+              <w:rPr>
+                <w:sz w:val="18"/>
+              </w:rPr>
+              <w:t>[Bereich]</w:t>
+            </w:r>
+          </w:p>
+        </w:tc>
+        <w:tc>
+          <w:tcPr>
+            <w:tcW w:type="dxa" w:w="2154"/>
+            <w:shd w:fill="FFFFFF"/>
+            <w:tcMar>
+              <w:top w:w="90" w:type="dxa"/>
+              <w:left w:w="90" w:type="dxa"/>
+              <w:bottom w:w="90" w:type="dxa"/>
+              <w:right w:w="90" w:type="dxa"/>
+            </w:tcMar>
+            <w:tcBorders>
+              <w:top w:val="single" w:sz="4" w:color="D9D9D9"/>
+              <w:left w:val="single" w:sz="4" w:color="D9D9D9"/>
+              <w:bottom w:val="single" w:sz="4" w:color="D9D9D9"/>
+              <w:right w:val="single" w:sz="4" w:color="D9D9D9"/>
+            </w:tcBorders>
+            <w:vAlign w:val="center"/>
+          </w:tcPr>
+          <w:p>
+            <w:pPr>
+              <w:spacing w:after="40"/>
+            </w:pPr>
+            <w:r>
+              <w:rPr>
+                <w:sz w:val="18"/>
+              </w:rPr>
+              <w:t>[Farbe]</w:t>
+            </w:r>
+          </w:p>
+        </w:tc>
+        <w:tc>
+          <w:tcPr>
+            <w:tcW w:type="dxa" w:w="2438"/>
+            <w:shd w:fill="FFFFFF"/>
+            <w:tcMar>
+              <w:top w:w="90" w:type="dxa"/>
+              <w:left w:w="90" w:type="dxa"/>
+              <w:bottom w:w="90" w:type="dxa"/>
+              <w:right w:w="90" w:type="dxa"/>
+            </w:tcMar>
+            <w:tcBorders>
+              <w:top w:val="single" w:sz="4" w:color="D9D9D9"/>
+              <w:left w:val="single" w:sz="4" w:color="D9D9D9"/>
+              <w:bottom w:val="single" w:sz="4" w:color="D9D9D9"/>
+              <w:right w:val="single" w:sz="4" w:color="D9D9D9"/>
+            </w:tcBorders>
+            <w:vAlign w:val="center"/>
+          </w:tcPr>
+          <w:p>
+            <w:pPr>
+              <w:spacing w:after="40"/>
+            </w:pPr>
+            <w:r>
+              <w:rPr>
+                <w:sz w:val="18"/>
+              </w:rPr>
+              <w:t>[Wert]</w:t>
+            </w:r>
+          </w:p>
+        </w:tc>
+      </w:tr>
+    </w:tbl>
+    <w:p>
+      <w:r/>
+    </w:p>
+    <w:p>
+      <w:r>
+        <w:rPr>
+          <w:color w:val="586B80"/>
+        </w:rPr>
+        <w:t>Energiebereich, stärker absorbierende Konfiguration und Grenze der Aussage: [höchstens drei Sätze]</w:t>
+      </w:r>
+    </w:p>
+    <w:p>
+      <w:r>
+        <w:br w:type="page"/>
+      </w:r>
+    </w:p>
+    <w:p>
+      <w:pPr>
+        <w:pStyle w:val="Heading1"/>
+      </w:pPr>
+      <w:r>
+        <w:t>Systematische Substituentenreihe</w:t>
+      </w:r>
+    </w:p>
+    <w:p>
+      <w:pPr>
+        <w:pStyle w:val="Heading2"/>
+      </w:pPr>
+      <w:r>
+        <w:t>Substituentenreihe untersuchen</w:t>
+      </w:r>
+    </w:p>
+    <w:p>
+      <w:r>
+        <w:t xml:space="preserve">Notieren Sie die zugeteilte Reihe und vervollständigen Sie die Tabelle für alle sechs Derivate. Fügen Sie die Spektren der Derivate mit dem kleinsten und dem größten Wert von </w:t>
+      </w:r>
+      <w:r>
+        <w:t>ΔE</w:t>
+      </w:r>
+      <w:r>
+        <w:rPr>
+          <w:vertAlign w:val="subscript"/>
+        </w:rPr>
+        <w:t>max</w:t>
+      </w:r>
+      <w:r>
+        <w:t xml:space="preserve"> ein. Beschreiben Sie den Trend innerhalb Ihrer Reihe und nennen Sie mindestens eine Abweichung, die nicht in einen einfachen Trend passt. Verwenden Sie dafür höchstens vier Sätze und kennzeichnen Sie Spektren, Maxima und Farben als Modellvorhersagen.</w:t>
+      </w:r>
+    </w:p>
+    <w:p>
+      <w:r>
+        <w:rPr>
+          <w:color w:val="586B80"/>
+        </w:rPr>
+        <w:t>Zugeordnete Reihe: [4-X, 2-X, 3-X oder 4,4′-X₂]</w:t>
+      </w:r>
+    </w:p>
+    <w:tbl>
+      <w:tblPr>
+        <w:tblW w:type="auto" w:w="0"/>
+        <w:tblLayout w:type="fixed"/>
+        <w:tblLook w:firstColumn="1" w:firstRow="1" w:lastColumn="0" w:lastRow="0" w:noHBand="0" w:noVBand="1" w:val="04A0"/>
+      </w:tblPr>
+      <w:tblGrid>
+        <w:gridCol w:w="1134"/>
+        <w:gridCol w:w="1531"/>
+        <w:gridCol w:w="1587"/>
+        <w:gridCol w:w="1531"/>
+        <w:gridCol w:w="1814"/>
+        <w:gridCol w:w="2041"/>
+      </w:tblGrid>
+      <w:tr>
+        <w:trPr>
+          <w:cantSplit/>
+          <w:tblHeader/>
+        </w:trPr>
+        <w:tc>
+          <w:tcPr>
+            <w:tcW w:type="dxa" w:w="1134"/>
+            <w:shd w:fill="102238"/>
+            <w:tcMar>
+              <w:top w:w="90" w:type="dxa"/>
+              <w:left w:w="90" w:type="dxa"/>
+              <w:bottom w:w="90" w:type="dxa"/>
+              <w:right w:w="90" w:type="dxa"/>
+            </w:tcMar>
+            <w:tcBorders>
+              <w:top w:val="single" w:sz="4" w:color="D9D9D9"/>
+              <w:left w:val="single" w:sz="4" w:color="D9D9D9"/>
+              <w:bottom w:val="single" w:sz="4" w:color="D9D9D9"/>
+              <w:right w:val="single" w:sz="4" w:color="D9D9D9"/>
+            </w:tcBorders>
+            <w:vAlign w:val="center"/>
+          </w:tcPr>
+          <w:p>
+            <w:pPr>
+              <w:spacing w:after="40"/>
+            </w:pPr>
+            <w:r>
+              <w:rPr>
+                <w:b/>
+                <w:color w:val="FFFFFF"/>
+                <w:sz w:val="18"/>
+              </w:rPr>
+              <w:t>X</w:t>
+            </w:r>
+          </w:p>
+        </w:tc>
+        <w:tc>
+          <w:tcPr>
+            <w:tcW w:type="dxa" w:w="1531"/>
+            <w:shd w:fill="102238"/>
+            <w:tcMar>
+              <w:top w:w="90" w:type="dxa"/>
+              <w:left w:w="90" w:type="dxa"/>
+              <w:bottom w:w="90" w:type="dxa"/>
+              <w:right w:w="90" w:type="dxa"/>
+            </w:tcMar>
+            <w:tcBorders>
+              <w:top w:val="single" w:sz="4" w:color="D9D9D9"/>
+              <w:left w:val="single" w:sz="4" w:color="D9D9D9"/>
+              <w:bottom w:val="single" w:sz="4" w:color="D9D9D9"/>
+              <w:right w:val="single" w:sz="4" w:color="D9D9D9"/>
+            </w:tcBorders>
+            <w:vAlign w:val="center"/>
+          </w:tcPr>
+          <w:p>
+            <w:pPr>
+              <w:spacing w:after="40"/>
+            </w:pPr>
+            <w:r>
+              <w:rPr>
+                <w:b/>
+                <w:color w:val="FFFFFF"/>
+                <w:sz w:val="18"/>
+              </w:rPr>
+              <w:t>Maximum / eV</w:t>
+            </w:r>
+          </w:p>
+        </w:tc>
+        <w:tc>
+          <w:tcPr>
+            <w:tcW w:type="dxa" w:w="1587"/>
+            <w:shd w:fill="102238"/>
+            <w:tcMar>
+              <w:top w:w="90" w:type="dxa"/>
+              <w:left w:w="90" w:type="dxa"/>
+              <w:bottom w:w="90" w:type="dxa"/>
+              <w:right w:w="90" w:type="dxa"/>
+            </w:tcMar>
+            <w:tcBorders>
+              <w:top w:val="single" w:sz="4" w:color="D9D9D9"/>
+              <w:left w:val="single" w:sz="4" w:color="D9D9D9"/>
+              <w:bottom w:val="single" w:sz="4" w:color="D9D9D9"/>
+              <w:right w:val="single" w:sz="4" w:color="D9D9D9"/>
+            </w:tcBorders>
+            <w:vAlign w:val="center"/>
+          </w:tcPr>
+          <w:p>
+            <w:pPr>
+              <w:spacing w:after="40"/>
+            </w:pPr>
+            <w:r>
+              <w:rPr>
+                <w:b/>
+                <w:color w:val="FFFFFF"/>
+                <w:sz w:val="18"/>
+              </w:rPr>
+              <w:t>Verschiebung / eV</w:t>
             </w:r>
           </w:p>
         </w:tc>
@@ -1823,7 +2370,7 @@
         </w:tc>
         <w:tc>
           <w:tcPr>
-            <w:tcW w:type="dxa" w:w="1701"/>
+            <w:tcW w:type="dxa" w:w="1814"/>
             <w:shd w:fill="102238"/>
             <w:tcMar>
               <w:top w:w="90" w:type="dxa"/>
@@ -1855,7 +2402,7 @@
         </w:tc>
         <w:tc>
           <w:tcPr>
-            <w:tcW w:type="dxa" w:w="1871"/>
+            <w:tcW w:type="dxa" w:w="2041"/>
             <w:shd w:fill="102238"/>
             <w:tcMar>
               <w:top w:w="90" w:type="dxa"/>
@@ -1892,7 +2439,7 @@
         </w:trPr>
         <w:tc>
           <w:tcPr>
-            <w:tcW w:type="dxa" w:w="1417"/>
+            <w:tcW w:type="dxa" w:w="1134"/>
             <w:shd w:fill="F3F6FA"/>
             <w:tcMar>
               <w:top w:w="90" w:type="dxa"/>
@@ -1916,13 +2463,13 @@
               <w:rPr>
                 <w:sz w:val="18"/>
               </w:rPr>
-              <w:t>cis</w:t>
+              <w:t>CH₃</w:t>
             </w:r>
           </w:p>
         </w:tc>
         <w:tc>
           <w:tcPr>
-            <w:tcW w:type="dxa" w:w="1417"/>
+            <w:tcW w:type="dxa" w:w="1531"/>
             <w:shd w:fill="F3F6FA"/>
             <w:tcMar>
               <w:top w:w="90" w:type="dxa"/>
@@ -1952,7 +2499,7 @@
         </w:tc>
         <w:tc>
           <w:tcPr>
-            <w:tcW w:type="dxa" w:w="1701"/>
+            <w:tcW w:type="dxa" w:w="1587"/>
             <w:shd w:fill="F3F6FA"/>
             <w:tcMar>
               <w:top w:w="90" w:type="dxa"/>
@@ -2012,7 +2559,7 @@
         </w:tc>
         <w:tc>
           <w:tcPr>
-            <w:tcW w:type="dxa" w:w="1701"/>
+            <w:tcW w:type="dxa" w:w="1814"/>
             <w:shd w:fill="F3F6FA"/>
             <w:tcMar>
               <w:top w:w="90" w:type="dxa"/>
@@ -2042,7 +2589,7 @@
         </w:tc>
         <w:tc>
           <w:tcPr>
-            <w:tcW w:type="dxa" w:w="1871"/>
+            <w:tcW w:type="dxa" w:w="2041"/>
             <w:shd w:fill="F3F6FA"/>
             <w:tcMar>
               <w:top w:w="90" w:type="dxa"/>
@@ -2077,7 +2624,7 @@
         </w:trPr>
         <w:tc>
           <w:tcPr>
-            <w:tcW w:type="dxa" w:w="1417"/>
+            <w:tcW w:type="dxa" w:w="1134"/>
             <w:shd w:fill="FFFFFF"/>
             <w:tcMar>
               <w:top w:w="90" w:type="dxa"/>
@@ -2101,13 +2648,13 @@
               <w:rPr>
                 <w:sz w:val="18"/>
               </w:rPr>
-              <w:t>trans</w:t>
+              <w:t>OCH₃</w:t>
             </w:r>
           </w:p>
         </w:tc>
         <w:tc>
           <w:tcPr>
-            <w:tcW w:type="dxa" w:w="1417"/>
+            <w:tcW w:type="dxa" w:w="1531"/>
             <w:shd w:fill="FFFFFF"/>
             <w:tcMar>
               <w:top w:w="90" w:type="dxa"/>
@@ -2137,7 +2684,7 @@
         </w:tc>
         <w:tc>
           <w:tcPr>
-            <w:tcW w:type="dxa" w:w="1701"/>
+            <w:tcW w:type="dxa" w:w="1587"/>
             <w:shd w:fill="FFFFFF"/>
             <w:tcMar>
               <w:top w:w="90" w:type="dxa"/>
@@ -2197,7 +2744,7 @@
         </w:tc>
         <w:tc>
           <w:tcPr>
-            <w:tcW w:type="dxa" w:w="1701"/>
+            <w:tcW w:type="dxa" w:w="1814"/>
             <w:shd w:fill="FFFFFF"/>
             <w:tcMar>
               <w:top w:w="90" w:type="dxa"/>
@@ -2227,7 +2774,7 @@
         </w:tc>
         <w:tc>
           <w:tcPr>
-            <w:tcW w:type="dxa" w:w="1871"/>
+            <w:tcW w:type="dxa" w:w="2041"/>
             <w:shd w:fill="FFFFFF"/>
             <w:tcMar>
               <w:top w:w="90" w:type="dxa"/>
@@ -2256,316 +2803,13 @@
           </w:p>
         </w:tc>
       </w:tr>
-    </w:tbl>
-    <w:p>
-      <w:r/>
-    </w:p>
-    <w:p>
-      <w:r>
-        <w:rPr>
-          <w:color w:val="586B80"/>
-        </w:rPr>
-        <w:t>Wellenlängenbereich, stärker absorbierende Konfiguration und Grenze der Aussage: [höchstens drei Sätze]</w:t>
-      </w:r>
-    </w:p>
-    <w:p>
-      <w:r>
-        <w:br w:type="page"/>
-      </w:r>
-    </w:p>
-    <w:p>
-      <w:pPr>
-        <w:pStyle w:val="Heading1"/>
-      </w:pPr>
-      <w:r>
-        <w:t>Systematische Substituentenreihe</w:t>
-      </w:r>
-    </w:p>
-    <w:p>
-      <w:pPr>
-        <w:pStyle w:val="Heading2"/>
-      </w:pPr>
-      <w:r>
-        <w:t>Substituentenreihe untersuchen</w:t>
-      </w:r>
-    </w:p>
-    <w:p>
-      <w:r>
-        <w:t xml:space="preserve">Notieren Sie die zugeteilte Reihe und vervollständigen Sie die Tabelle für alle sechs Derivate. Fügen Sie die Spektren der Derivate mit dem kleinsten und dem größten Wert von </w:t>
-      </w:r>
-      <w:r>
-        <w:t>ΔE</w:t>
-      </w:r>
-      <w:r>
-        <w:rPr>
-          <w:vertAlign w:val="subscript"/>
-        </w:rPr>
-        <w:t>max</w:t>
-      </w:r>
-      <w:r>
-        <w:t xml:space="preserve"> ein. Beschreiben Sie den Trend innerhalb Ihrer Reihe und nennen Sie mindestens eine Abweichung, die nicht in einen einfachen Trend passt. Verwenden Sie dafür höchstens vier Sätze und kennzeichnen Sie Spektren, Maxima und Farben als Modellvorhersagen.</w:t>
-      </w:r>
-    </w:p>
-    <w:p>
-      <w:r>
-        <w:rPr>
-          <w:color w:val="586B80"/>
-        </w:rPr>
-        <w:t>Zugeordnete Reihe: [4-X, 2-X, 3-X oder 4,4′-X₂]</w:t>
-      </w:r>
-    </w:p>
-    <w:tbl>
-      <w:tblPr>
-        <w:tblW w:type="auto" w:w="0"/>
-        <w:tblLayout w:type="fixed"/>
-        <w:tblLook w:firstColumn="1" w:firstRow="1" w:lastColumn="0" w:lastRow="0" w:noHBand="0" w:noVBand="1" w:val="04A0"/>
-      </w:tblPr>
-      <w:tblGrid>
-        <w:gridCol w:w="1020"/>
-        <w:gridCol w:w="1304"/>
-        <w:gridCol w:w="1417"/>
-        <w:gridCol w:w="1191"/>
-        <w:gridCol w:w="1247"/>
-        <w:gridCol w:w="1701"/>
-        <w:gridCol w:w="1757"/>
-      </w:tblGrid>
-      <w:tr>
-        <w:trPr>
-          <w:cantSplit/>
-          <w:tblHeader/>
-        </w:trPr>
-        <w:tc>
-          <w:tcPr>
-            <w:tcW w:type="dxa" w:w="1020"/>
-            <w:shd w:fill="102238"/>
-            <w:tcMar>
-              <w:top w:w="90" w:type="dxa"/>
-              <w:left w:w="90" w:type="dxa"/>
-              <w:bottom w:w="90" w:type="dxa"/>
-              <w:right w:w="90" w:type="dxa"/>
-            </w:tcMar>
-            <w:tcBorders>
-              <w:top w:val="single" w:sz="4" w:color="D9D9D9"/>
-              <w:left w:val="single" w:sz="4" w:color="D9D9D9"/>
-              <w:bottom w:val="single" w:sz="4" w:color="D9D9D9"/>
-              <w:right w:val="single" w:sz="4" w:color="D9D9D9"/>
-            </w:tcBorders>
-            <w:vAlign w:val="center"/>
-          </w:tcPr>
-          <w:p>
-            <w:pPr>
-              <w:spacing w:after="40"/>
-            </w:pPr>
-            <w:r>
-              <w:rPr>
-                <w:b/>
-                <w:color w:val="FFFFFF"/>
-                <w:sz w:val="18"/>
-              </w:rPr>
-              <w:t>X</w:t>
-            </w:r>
-          </w:p>
-        </w:tc>
-        <w:tc>
-          <w:tcPr>
-            <w:tcW w:type="dxa" w:w="1304"/>
-            <w:shd w:fill="102238"/>
-            <w:tcMar>
-              <w:top w:w="90" w:type="dxa"/>
-              <w:left w:w="90" w:type="dxa"/>
-              <w:bottom w:w="90" w:type="dxa"/>
-              <w:right w:w="90" w:type="dxa"/>
-            </w:tcMar>
-            <w:tcBorders>
-              <w:top w:val="single" w:sz="4" w:color="D9D9D9"/>
-              <w:left w:val="single" w:sz="4" w:color="D9D9D9"/>
-              <w:bottom w:val="single" w:sz="4" w:color="D9D9D9"/>
-              <w:right w:val="single" w:sz="4" w:color="D9D9D9"/>
-            </w:tcBorders>
-            <w:vAlign w:val="center"/>
-          </w:tcPr>
-          <w:p>
-            <w:pPr>
-              <w:spacing w:after="40"/>
-            </w:pPr>
-            <w:r>
-              <w:rPr>
-                <w:b/>
-                <w:color w:val="FFFFFF"/>
-                <w:sz w:val="18"/>
-              </w:rPr>
-              <w:t>Maximum / eV</w:t>
-            </w:r>
-          </w:p>
-        </w:tc>
-        <w:tc>
-          <w:tcPr>
-            <w:tcW w:type="dxa" w:w="1417"/>
-            <w:shd w:fill="102238"/>
-            <w:tcMar>
-              <w:top w:w="90" w:type="dxa"/>
-              <w:left w:w="90" w:type="dxa"/>
-              <w:bottom w:w="90" w:type="dxa"/>
-              <w:right w:w="90" w:type="dxa"/>
-            </w:tcMar>
-            <w:tcBorders>
-              <w:top w:val="single" w:sz="4" w:color="D9D9D9"/>
-              <w:left w:val="single" w:sz="4" w:color="D9D9D9"/>
-              <w:bottom w:val="single" w:sz="4" w:color="D9D9D9"/>
-              <w:right w:val="single" w:sz="4" w:color="D9D9D9"/>
-            </w:tcBorders>
-            <w:vAlign w:val="center"/>
-          </w:tcPr>
-          <w:p>
-            <w:pPr>
-              <w:spacing w:after="40"/>
-            </w:pPr>
-            <w:r>
-              <w:rPr>
-                <w:b/>
-                <w:color w:val="FFFFFF"/>
-                <w:sz w:val="18"/>
-              </w:rPr>
-              <w:t>Wellenlänge / nm</w:t>
-            </w:r>
-          </w:p>
-        </w:tc>
-        <w:tc>
-          <w:tcPr>
-            <w:tcW w:type="dxa" w:w="1191"/>
-            <w:shd w:fill="102238"/>
-            <w:tcMar>
-              <w:top w:w="90" w:type="dxa"/>
-              <w:left w:w="90" w:type="dxa"/>
-              <w:bottom w:w="90" w:type="dxa"/>
-              <w:right w:w="90" w:type="dxa"/>
-            </w:tcMar>
-            <w:tcBorders>
-              <w:top w:val="single" w:sz="4" w:color="D9D9D9"/>
-              <w:left w:val="single" w:sz="4" w:color="D9D9D9"/>
-              <w:bottom w:val="single" w:sz="4" w:color="D9D9D9"/>
-              <w:right w:val="single" w:sz="4" w:color="D9D9D9"/>
-            </w:tcBorders>
-            <w:vAlign w:val="center"/>
-          </w:tcPr>
-          <w:p>
-            <w:pPr>
-              <w:spacing w:after="40"/>
-            </w:pPr>
-            <w:r>
-              <w:rPr>
-                <w:b/>
-                <w:color w:val="FFFFFF"/>
-                <w:sz w:val="18"/>
-              </w:rPr>
-              <w:t>Verschiebung / eV</w:t>
-            </w:r>
-          </w:p>
-        </w:tc>
-        <w:tc>
-          <w:tcPr>
-            <w:tcW w:type="dxa" w:w="1247"/>
-            <w:shd w:fill="102238"/>
-            <w:tcMar>
-              <w:top w:w="90" w:type="dxa"/>
-              <w:left w:w="90" w:type="dxa"/>
-              <w:bottom w:w="90" w:type="dxa"/>
-              <w:right w:w="90" w:type="dxa"/>
-            </w:tcMar>
-            <w:tcBorders>
-              <w:top w:val="single" w:sz="4" w:color="D9D9D9"/>
-              <w:left w:val="single" w:sz="4" w:color="D9D9D9"/>
-              <w:bottom w:val="single" w:sz="4" w:color="D9D9D9"/>
-              <w:right w:val="single" w:sz="4" w:color="D9D9D9"/>
-            </w:tcBorders>
-            <w:vAlign w:val="center"/>
-          </w:tcPr>
-          <w:p>
-            <w:pPr>
-              <w:spacing w:after="40"/>
-            </w:pPr>
-            <w:r>
-              <w:rPr>
-                <w:b/>
-                <w:color w:val="FFFFFF"/>
-                <w:sz w:val="18"/>
-              </w:rPr>
-              <w:t>UV oder sichtbar</w:t>
-            </w:r>
-          </w:p>
-        </w:tc>
-        <w:tc>
-          <w:tcPr>
-            <w:tcW w:type="dxa" w:w="1701"/>
-            <w:shd w:fill="102238"/>
-            <w:tcMar>
-              <w:top w:w="90" w:type="dxa"/>
-              <w:left w:w="90" w:type="dxa"/>
-              <w:bottom w:w="90" w:type="dxa"/>
-              <w:right w:w="90" w:type="dxa"/>
-            </w:tcMar>
-            <w:tcBorders>
-              <w:top w:val="single" w:sz="4" w:color="D9D9D9"/>
-              <w:left w:val="single" w:sz="4" w:color="D9D9D9"/>
-              <w:bottom w:val="single" w:sz="4" w:color="D9D9D9"/>
-              <w:right w:val="single" w:sz="4" w:color="D9D9D9"/>
-            </w:tcBorders>
-            <w:vAlign w:val="center"/>
-          </w:tcPr>
-          <w:p>
-            <w:pPr>
-              <w:spacing w:after="40"/>
-            </w:pPr>
-            <w:r>
-              <w:rPr>
-                <w:b/>
-                <w:color w:val="FFFFFF"/>
-                <w:sz w:val="18"/>
-              </w:rPr>
-              <w:t>Farbvorhersage</w:t>
-            </w:r>
-          </w:p>
-        </w:tc>
-        <w:tc>
-          <w:tcPr>
-            <w:tcW w:type="dxa" w:w="1757"/>
-            <w:shd w:fill="102238"/>
-            <w:tcMar>
-              <w:top w:w="90" w:type="dxa"/>
-              <w:left w:w="90" w:type="dxa"/>
-              <w:bottom w:w="90" w:type="dxa"/>
-              <w:right w:w="90" w:type="dxa"/>
-            </w:tcMar>
-            <w:tcBorders>
-              <w:top w:val="single" w:sz="4" w:color="D9D9D9"/>
-              <w:left w:val="single" w:sz="4" w:color="D9D9D9"/>
-              <w:bottom w:val="single" w:sz="4" w:color="D9D9D9"/>
-              <w:right w:val="single" w:sz="4" w:color="D9D9D9"/>
-            </w:tcBorders>
-            <w:vAlign w:val="center"/>
-          </w:tcPr>
-          <w:p>
-            <w:pPr>
-              <w:spacing w:after="40"/>
-            </w:pPr>
-            <w:r>
-              <w:rPr>
-                <w:b/>
-                <w:color w:val="FFFFFF"/>
-                <w:sz w:val="18"/>
-              </w:rPr>
-              <w:t>Lichtdurchlässigkeit / %</w:t>
-            </w:r>
-          </w:p>
-        </w:tc>
-      </w:tr>
       <w:tr>
         <w:trPr>
           <w:cantSplit/>
         </w:trPr>
         <w:tc>
           <w:tcPr>
-            <w:tcW w:type="dxa" w:w="1020"/>
+            <w:tcW w:type="dxa" w:w="1134"/>
             <w:shd w:fill="F3F6FA"/>
             <w:tcMar>
               <w:top w:w="90" w:type="dxa"/>
@@ -2589,13 +2833,13 @@
               <w:rPr>
                 <w:sz w:val="18"/>
               </w:rPr>
-              <w:t>CH₃</w:t>
+              <w:t>N(CH₃)₂</w:t>
             </w:r>
           </w:p>
         </w:tc>
         <w:tc>
           <w:tcPr>
-            <w:tcW w:type="dxa" w:w="1304"/>
+            <w:tcW w:type="dxa" w:w="1531"/>
             <w:shd w:fill="F3F6FA"/>
             <w:tcMar>
               <w:top w:w="90" w:type="dxa"/>
@@ -2625,7 +2869,7 @@
         </w:tc>
         <w:tc>
           <w:tcPr>
-            <w:tcW w:type="dxa" w:w="1417"/>
+            <w:tcW w:type="dxa" w:w="1587"/>
             <w:shd w:fill="F3F6FA"/>
             <w:tcMar>
               <w:top w:w="90" w:type="dxa"/>
@@ -2655,37 +2899,7 @@
         </w:tc>
         <w:tc>
           <w:tcPr>
-            <w:tcW w:type="dxa" w:w="1191"/>
-            <w:shd w:fill="F3F6FA"/>
-            <w:tcMar>
-              <w:top w:w="90" w:type="dxa"/>
-              <w:left w:w="90" w:type="dxa"/>
-              <w:bottom w:w="90" w:type="dxa"/>
-              <w:right w:w="90" w:type="dxa"/>
-            </w:tcMar>
-            <w:tcBorders>
-              <w:top w:val="single" w:sz="4" w:color="D9D9D9"/>
-              <w:left w:val="single" w:sz="4" w:color="D9D9D9"/>
-              <w:bottom w:val="single" w:sz="4" w:color="D9D9D9"/>
-              <w:right w:val="single" w:sz="4" w:color="D9D9D9"/>
-            </w:tcBorders>
-            <w:vAlign w:val="center"/>
-          </w:tcPr>
-          <w:p>
-            <w:pPr>
-              <w:spacing w:after="40"/>
-            </w:pPr>
-            <w:r>
-              <w:rPr>
-                <w:sz w:val="18"/>
-              </w:rPr>
-              <w:t>[Wert]</w:t>
-            </w:r>
-          </w:p>
-        </w:tc>
-        <w:tc>
-          <w:tcPr>
-            <w:tcW w:type="dxa" w:w="1247"/>
+            <w:tcW w:type="dxa" w:w="1531"/>
             <w:shd w:fill="F3F6FA"/>
             <w:tcMar>
               <w:top w:w="90" w:type="dxa"/>
@@ -2715,7 +2929,7 @@
         </w:tc>
         <w:tc>
           <w:tcPr>
-            <w:tcW w:type="dxa" w:w="1701"/>
+            <w:tcW w:type="dxa" w:w="1814"/>
             <w:shd w:fill="F3F6FA"/>
             <w:tcMar>
               <w:top w:w="90" w:type="dxa"/>
@@ -2745,7 +2959,7 @@
         </w:tc>
         <w:tc>
           <w:tcPr>
-            <w:tcW w:type="dxa" w:w="1757"/>
+            <w:tcW w:type="dxa" w:w="2041"/>
             <w:shd w:fill="F3F6FA"/>
             <w:tcMar>
               <w:top w:w="90" w:type="dxa"/>
@@ -2780,7 +2994,7 @@
         </w:trPr>
         <w:tc>
           <w:tcPr>
-            <w:tcW w:type="dxa" w:w="1020"/>
+            <w:tcW w:type="dxa" w:w="1134"/>
             <w:shd w:fill="FFFFFF"/>
             <w:tcMar>
               <w:top w:w="90" w:type="dxa"/>
@@ -2804,13 +3018,13 @@
               <w:rPr>
                 <w:sz w:val="18"/>
               </w:rPr>
-              <w:t>OCH₃</w:t>
+              <w:t>CF₃</w:t>
             </w:r>
           </w:p>
         </w:tc>
         <w:tc>
           <w:tcPr>
-            <w:tcW w:type="dxa" w:w="1304"/>
+            <w:tcW w:type="dxa" w:w="1531"/>
             <w:shd w:fill="FFFFFF"/>
             <w:tcMar>
               <w:top w:w="90" w:type="dxa"/>
@@ -2840,7 +3054,7 @@
         </w:tc>
         <w:tc>
           <w:tcPr>
-            <w:tcW w:type="dxa" w:w="1417"/>
+            <w:tcW w:type="dxa" w:w="1587"/>
             <w:shd w:fill="FFFFFF"/>
             <w:tcMar>
               <w:top w:w="90" w:type="dxa"/>
@@ -2870,37 +3084,7 @@
         </w:tc>
         <w:tc>
           <w:tcPr>
-            <w:tcW w:type="dxa" w:w="1191"/>
-            <w:shd w:fill="FFFFFF"/>
-            <w:tcMar>
-              <w:top w:w="90" w:type="dxa"/>
-              <w:left w:w="90" w:type="dxa"/>
-              <w:bottom w:w="90" w:type="dxa"/>
-              <w:right w:w="90" w:type="dxa"/>
-            </w:tcMar>
-            <w:tcBorders>
-              <w:top w:val="single" w:sz="4" w:color="D9D9D9"/>
-              <w:left w:val="single" w:sz="4" w:color="D9D9D9"/>
-              <w:bottom w:val="single" w:sz="4" w:color="D9D9D9"/>
-              <w:right w:val="single" w:sz="4" w:color="D9D9D9"/>
-            </w:tcBorders>
-            <w:vAlign w:val="center"/>
-          </w:tcPr>
-          <w:p>
-            <w:pPr>
-              <w:spacing w:after="40"/>
-            </w:pPr>
-            <w:r>
-              <w:rPr>
-                <w:sz w:val="18"/>
-              </w:rPr>
-              <w:t>[Wert]</w:t>
-            </w:r>
-          </w:p>
-        </w:tc>
-        <w:tc>
-          <w:tcPr>
-            <w:tcW w:type="dxa" w:w="1247"/>
+            <w:tcW w:type="dxa" w:w="1531"/>
             <w:shd w:fill="FFFFFF"/>
             <w:tcMar>
               <w:top w:w="90" w:type="dxa"/>
@@ -2930,7 +3114,7 @@
         </w:tc>
         <w:tc>
           <w:tcPr>
-            <w:tcW w:type="dxa" w:w="1701"/>
+            <w:tcW w:type="dxa" w:w="1814"/>
             <w:shd w:fill="FFFFFF"/>
             <w:tcMar>
               <w:top w:w="90" w:type="dxa"/>
@@ -2960,7 +3144,7 @@
         </w:tc>
         <w:tc>
           <w:tcPr>
-            <w:tcW w:type="dxa" w:w="1757"/>
+            <w:tcW w:type="dxa" w:w="2041"/>
             <w:shd w:fill="FFFFFF"/>
             <w:tcMar>
               <w:top w:w="90" w:type="dxa"/>
@@ -2995,7 +3179,7 @@
         </w:trPr>
         <w:tc>
           <w:tcPr>
-            <w:tcW w:type="dxa" w:w="1020"/>
+            <w:tcW w:type="dxa" w:w="1134"/>
             <w:shd w:fill="F3F6FA"/>
             <w:tcMar>
               <w:top w:w="90" w:type="dxa"/>
@@ -3019,13 +3203,13 @@
               <w:rPr>
                 <w:sz w:val="18"/>
               </w:rPr>
-              <w:t>N(CH₃)₂</w:t>
+              <w:t>CN</w:t>
             </w:r>
           </w:p>
         </w:tc>
         <w:tc>
           <w:tcPr>
-            <w:tcW w:type="dxa" w:w="1304"/>
+            <w:tcW w:type="dxa" w:w="1531"/>
             <w:shd w:fill="F3F6FA"/>
             <w:tcMar>
               <w:top w:w="90" w:type="dxa"/>
@@ -3055,7 +3239,7 @@
         </w:tc>
         <w:tc>
           <w:tcPr>
-            <w:tcW w:type="dxa" w:w="1417"/>
+            <w:tcW w:type="dxa" w:w="1587"/>
             <w:shd w:fill="F3F6FA"/>
             <w:tcMar>
               <w:top w:w="90" w:type="dxa"/>
@@ -3085,37 +3269,7 @@
         </w:tc>
         <w:tc>
           <w:tcPr>
-            <w:tcW w:type="dxa" w:w="1191"/>
-            <w:shd w:fill="F3F6FA"/>
-            <w:tcMar>
-              <w:top w:w="90" w:type="dxa"/>
-              <w:left w:w="90" w:type="dxa"/>
-              <w:bottom w:w="90" w:type="dxa"/>
-              <w:right w:w="90" w:type="dxa"/>
-            </w:tcMar>
-            <w:tcBorders>
-              <w:top w:val="single" w:sz="4" w:color="D9D9D9"/>
-              <w:left w:val="single" w:sz="4" w:color="D9D9D9"/>
-              <w:bottom w:val="single" w:sz="4" w:color="D9D9D9"/>
-              <w:right w:val="single" w:sz="4" w:color="D9D9D9"/>
-            </w:tcBorders>
-            <w:vAlign w:val="center"/>
-          </w:tcPr>
-          <w:p>
-            <w:pPr>
-              <w:spacing w:after="40"/>
-            </w:pPr>
-            <w:r>
-              <w:rPr>
-                <w:sz w:val="18"/>
-              </w:rPr>
-              <w:t>[Wert]</w:t>
-            </w:r>
-          </w:p>
-        </w:tc>
-        <w:tc>
-          <w:tcPr>
-            <w:tcW w:type="dxa" w:w="1247"/>
+            <w:tcW w:type="dxa" w:w="1531"/>
             <w:shd w:fill="F3F6FA"/>
             <w:tcMar>
               <w:top w:w="90" w:type="dxa"/>
@@ -3145,7 +3299,7 @@
         </w:tc>
         <w:tc>
           <w:tcPr>
-            <w:tcW w:type="dxa" w:w="1701"/>
+            <w:tcW w:type="dxa" w:w="1814"/>
             <w:shd w:fill="F3F6FA"/>
             <w:tcMar>
               <w:top w:w="90" w:type="dxa"/>
@@ -3175,7 +3329,7 @@
         </w:tc>
         <w:tc>
           <w:tcPr>
-            <w:tcW w:type="dxa" w:w="1757"/>
+            <w:tcW w:type="dxa" w:w="2041"/>
             <w:shd w:fill="F3F6FA"/>
             <w:tcMar>
               <w:top w:w="90" w:type="dxa"/>
@@ -3210,7 +3364,7 @@
         </w:trPr>
         <w:tc>
           <w:tcPr>
-            <w:tcW w:type="dxa" w:w="1020"/>
+            <w:tcW w:type="dxa" w:w="1134"/>
             <w:shd w:fill="FFFFFF"/>
             <w:tcMar>
               <w:top w:w="90" w:type="dxa"/>
@@ -3234,13 +3388,13 @@
               <w:rPr>
                 <w:sz w:val="18"/>
               </w:rPr>
-              <w:t>CF₃</w:t>
+              <w:t>NO₂</w:t>
             </w:r>
           </w:p>
         </w:tc>
         <w:tc>
           <w:tcPr>
-            <w:tcW w:type="dxa" w:w="1304"/>
+            <w:tcW w:type="dxa" w:w="1531"/>
             <w:shd w:fill="FFFFFF"/>
             <w:tcMar>
               <w:top w:w="90" w:type="dxa"/>
@@ -3270,7 +3424,7 @@
         </w:tc>
         <w:tc>
           <w:tcPr>
-            <w:tcW w:type="dxa" w:w="1417"/>
+            <w:tcW w:type="dxa" w:w="1587"/>
             <w:shd w:fill="FFFFFF"/>
             <w:tcMar>
               <w:top w:w="90" w:type="dxa"/>
@@ -3300,37 +3454,7 @@
         </w:tc>
         <w:tc>
           <w:tcPr>
-            <w:tcW w:type="dxa" w:w="1191"/>
-            <w:shd w:fill="FFFFFF"/>
-            <w:tcMar>
-              <w:top w:w="90" w:type="dxa"/>
-              <w:left w:w="90" w:type="dxa"/>
-              <w:bottom w:w="90" w:type="dxa"/>
-              <w:right w:w="90" w:type="dxa"/>
-            </w:tcMar>
-            <w:tcBorders>
-              <w:top w:val="single" w:sz="4" w:color="D9D9D9"/>
-              <w:left w:val="single" w:sz="4" w:color="D9D9D9"/>
-              <w:bottom w:val="single" w:sz="4" w:color="D9D9D9"/>
-              <w:right w:val="single" w:sz="4" w:color="D9D9D9"/>
-            </w:tcBorders>
-            <w:vAlign w:val="center"/>
-          </w:tcPr>
-          <w:p>
-            <w:pPr>
-              <w:spacing w:after="40"/>
-            </w:pPr>
-            <w:r>
-              <w:rPr>
-                <w:sz w:val="18"/>
-              </w:rPr>
-              <w:t>[Wert]</w:t>
-            </w:r>
-          </w:p>
-        </w:tc>
-        <w:tc>
-          <w:tcPr>
-            <w:tcW w:type="dxa" w:w="1247"/>
+            <w:tcW w:type="dxa" w:w="1531"/>
             <w:shd w:fill="FFFFFF"/>
             <w:tcMar>
               <w:top w:w="90" w:type="dxa"/>
@@ -3360,7 +3484,7 @@
         </w:tc>
         <w:tc>
           <w:tcPr>
-            <w:tcW w:type="dxa" w:w="1701"/>
+            <w:tcW w:type="dxa" w:w="1814"/>
             <w:shd w:fill="FFFFFF"/>
             <w:tcMar>
               <w:top w:w="90" w:type="dxa"/>
@@ -3390,437 +3514,7 @@
         </w:tc>
         <w:tc>
           <w:tcPr>
-            <w:tcW w:type="dxa" w:w="1757"/>
-            <w:shd w:fill="FFFFFF"/>
-            <w:tcMar>
-              <w:top w:w="90" w:type="dxa"/>
-              <w:left w:w="90" w:type="dxa"/>
-              <w:bottom w:w="90" w:type="dxa"/>
-              <w:right w:w="90" w:type="dxa"/>
-            </w:tcMar>
-            <w:tcBorders>
-              <w:top w:val="single" w:sz="4" w:color="D9D9D9"/>
-              <w:left w:val="single" w:sz="4" w:color="D9D9D9"/>
-              <w:bottom w:val="single" w:sz="4" w:color="D9D9D9"/>
-              <w:right w:val="single" w:sz="4" w:color="D9D9D9"/>
-            </w:tcBorders>
-            <w:vAlign w:val="center"/>
-          </w:tcPr>
-          <w:p>
-            <w:pPr>
-              <w:spacing w:after="40"/>
-            </w:pPr>
-            <w:r>
-              <w:rPr>
-                <w:sz w:val="18"/>
-              </w:rPr>
-              <w:t>[Wert]</w:t>
-            </w:r>
-          </w:p>
-        </w:tc>
-      </w:tr>
-      <w:tr>
-        <w:trPr>
-          <w:cantSplit/>
-        </w:trPr>
-        <w:tc>
-          <w:tcPr>
-            <w:tcW w:type="dxa" w:w="1020"/>
-            <w:shd w:fill="F3F6FA"/>
-            <w:tcMar>
-              <w:top w:w="90" w:type="dxa"/>
-              <w:left w:w="90" w:type="dxa"/>
-              <w:bottom w:w="90" w:type="dxa"/>
-              <w:right w:w="90" w:type="dxa"/>
-            </w:tcMar>
-            <w:tcBorders>
-              <w:top w:val="single" w:sz="4" w:color="D9D9D9"/>
-              <w:left w:val="single" w:sz="4" w:color="D9D9D9"/>
-              <w:bottom w:val="single" w:sz="4" w:color="D9D9D9"/>
-              <w:right w:val="single" w:sz="4" w:color="D9D9D9"/>
-            </w:tcBorders>
-            <w:vAlign w:val="center"/>
-          </w:tcPr>
-          <w:p>
-            <w:pPr>
-              <w:spacing w:after="40"/>
-            </w:pPr>
-            <w:r>
-              <w:rPr>
-                <w:sz w:val="18"/>
-              </w:rPr>
-              <w:t>CN</w:t>
-            </w:r>
-          </w:p>
-        </w:tc>
-        <w:tc>
-          <w:tcPr>
-            <w:tcW w:type="dxa" w:w="1304"/>
-            <w:shd w:fill="F3F6FA"/>
-            <w:tcMar>
-              <w:top w:w="90" w:type="dxa"/>
-              <w:left w:w="90" w:type="dxa"/>
-              <w:bottom w:w="90" w:type="dxa"/>
-              <w:right w:w="90" w:type="dxa"/>
-            </w:tcMar>
-            <w:tcBorders>
-              <w:top w:val="single" w:sz="4" w:color="D9D9D9"/>
-              <w:left w:val="single" w:sz="4" w:color="D9D9D9"/>
-              <w:bottom w:val="single" w:sz="4" w:color="D9D9D9"/>
-              <w:right w:val="single" w:sz="4" w:color="D9D9D9"/>
-            </w:tcBorders>
-            <w:vAlign w:val="center"/>
-          </w:tcPr>
-          <w:p>
-            <w:pPr>
-              <w:spacing w:after="40"/>
-            </w:pPr>
-            <w:r>
-              <w:rPr>
-                <w:sz w:val="18"/>
-              </w:rPr>
-              <w:t>[Wert]</w:t>
-            </w:r>
-          </w:p>
-        </w:tc>
-        <w:tc>
-          <w:tcPr>
-            <w:tcW w:type="dxa" w:w="1417"/>
-            <w:shd w:fill="F3F6FA"/>
-            <w:tcMar>
-              <w:top w:w="90" w:type="dxa"/>
-              <w:left w:w="90" w:type="dxa"/>
-              <w:bottom w:w="90" w:type="dxa"/>
-              <w:right w:w="90" w:type="dxa"/>
-            </w:tcMar>
-            <w:tcBorders>
-              <w:top w:val="single" w:sz="4" w:color="D9D9D9"/>
-              <w:left w:val="single" w:sz="4" w:color="D9D9D9"/>
-              <w:bottom w:val="single" w:sz="4" w:color="D9D9D9"/>
-              <w:right w:val="single" w:sz="4" w:color="D9D9D9"/>
-            </w:tcBorders>
-            <w:vAlign w:val="center"/>
-          </w:tcPr>
-          <w:p>
-            <w:pPr>
-              <w:spacing w:after="40"/>
-            </w:pPr>
-            <w:r>
-              <w:rPr>
-                <w:sz w:val="18"/>
-              </w:rPr>
-              <w:t>[Wert]</w:t>
-            </w:r>
-          </w:p>
-        </w:tc>
-        <w:tc>
-          <w:tcPr>
-            <w:tcW w:type="dxa" w:w="1191"/>
-            <w:shd w:fill="F3F6FA"/>
-            <w:tcMar>
-              <w:top w:w="90" w:type="dxa"/>
-              <w:left w:w="90" w:type="dxa"/>
-              <w:bottom w:w="90" w:type="dxa"/>
-              <w:right w:w="90" w:type="dxa"/>
-            </w:tcMar>
-            <w:tcBorders>
-              <w:top w:val="single" w:sz="4" w:color="D9D9D9"/>
-              <w:left w:val="single" w:sz="4" w:color="D9D9D9"/>
-              <w:bottom w:val="single" w:sz="4" w:color="D9D9D9"/>
-              <w:right w:val="single" w:sz="4" w:color="D9D9D9"/>
-            </w:tcBorders>
-            <w:vAlign w:val="center"/>
-          </w:tcPr>
-          <w:p>
-            <w:pPr>
-              <w:spacing w:after="40"/>
-            </w:pPr>
-            <w:r>
-              <w:rPr>
-                <w:sz w:val="18"/>
-              </w:rPr>
-              <w:t>[Wert]</w:t>
-            </w:r>
-          </w:p>
-        </w:tc>
-        <w:tc>
-          <w:tcPr>
-            <w:tcW w:type="dxa" w:w="1247"/>
-            <w:shd w:fill="F3F6FA"/>
-            <w:tcMar>
-              <w:top w:w="90" w:type="dxa"/>
-              <w:left w:w="90" w:type="dxa"/>
-              <w:bottom w:w="90" w:type="dxa"/>
-              <w:right w:w="90" w:type="dxa"/>
-            </w:tcMar>
-            <w:tcBorders>
-              <w:top w:val="single" w:sz="4" w:color="D9D9D9"/>
-              <w:left w:val="single" w:sz="4" w:color="D9D9D9"/>
-              <w:bottom w:val="single" w:sz="4" w:color="D9D9D9"/>
-              <w:right w:val="single" w:sz="4" w:color="D9D9D9"/>
-            </w:tcBorders>
-            <w:vAlign w:val="center"/>
-          </w:tcPr>
-          <w:p>
-            <w:pPr>
-              <w:spacing w:after="40"/>
-            </w:pPr>
-            <w:r>
-              <w:rPr>
-                <w:sz w:val="18"/>
-              </w:rPr>
-              <w:t>[Bereich]</w:t>
-            </w:r>
-          </w:p>
-        </w:tc>
-        <w:tc>
-          <w:tcPr>
-            <w:tcW w:type="dxa" w:w="1701"/>
-            <w:shd w:fill="F3F6FA"/>
-            <w:tcMar>
-              <w:top w:w="90" w:type="dxa"/>
-              <w:left w:w="90" w:type="dxa"/>
-              <w:bottom w:w="90" w:type="dxa"/>
-              <w:right w:w="90" w:type="dxa"/>
-            </w:tcMar>
-            <w:tcBorders>
-              <w:top w:val="single" w:sz="4" w:color="D9D9D9"/>
-              <w:left w:val="single" w:sz="4" w:color="D9D9D9"/>
-              <w:bottom w:val="single" w:sz="4" w:color="D9D9D9"/>
-              <w:right w:val="single" w:sz="4" w:color="D9D9D9"/>
-            </w:tcBorders>
-            <w:vAlign w:val="center"/>
-          </w:tcPr>
-          <w:p>
-            <w:pPr>
-              <w:spacing w:after="40"/>
-            </w:pPr>
-            <w:r>
-              <w:rPr>
-                <w:sz w:val="18"/>
-              </w:rPr>
-              <w:t>[Farbe]</w:t>
-            </w:r>
-          </w:p>
-        </w:tc>
-        <w:tc>
-          <w:tcPr>
-            <w:tcW w:type="dxa" w:w="1757"/>
-            <w:shd w:fill="F3F6FA"/>
-            <w:tcMar>
-              <w:top w:w="90" w:type="dxa"/>
-              <w:left w:w="90" w:type="dxa"/>
-              <w:bottom w:w="90" w:type="dxa"/>
-              <w:right w:w="90" w:type="dxa"/>
-            </w:tcMar>
-            <w:tcBorders>
-              <w:top w:val="single" w:sz="4" w:color="D9D9D9"/>
-              <w:left w:val="single" w:sz="4" w:color="D9D9D9"/>
-              <w:bottom w:val="single" w:sz="4" w:color="D9D9D9"/>
-              <w:right w:val="single" w:sz="4" w:color="D9D9D9"/>
-            </w:tcBorders>
-            <w:vAlign w:val="center"/>
-          </w:tcPr>
-          <w:p>
-            <w:pPr>
-              <w:spacing w:after="40"/>
-            </w:pPr>
-            <w:r>
-              <w:rPr>
-                <w:sz w:val="18"/>
-              </w:rPr>
-              <w:t>[Wert]</w:t>
-            </w:r>
-          </w:p>
-        </w:tc>
-      </w:tr>
-      <w:tr>
-        <w:trPr>
-          <w:cantSplit/>
-        </w:trPr>
-        <w:tc>
-          <w:tcPr>
-            <w:tcW w:type="dxa" w:w="1020"/>
-            <w:shd w:fill="FFFFFF"/>
-            <w:tcMar>
-              <w:top w:w="90" w:type="dxa"/>
-              <w:left w:w="90" w:type="dxa"/>
-              <w:bottom w:w="90" w:type="dxa"/>
-              <w:right w:w="90" w:type="dxa"/>
-            </w:tcMar>
-            <w:tcBorders>
-              <w:top w:val="single" w:sz="4" w:color="D9D9D9"/>
-              <w:left w:val="single" w:sz="4" w:color="D9D9D9"/>
-              <w:bottom w:val="single" w:sz="4" w:color="D9D9D9"/>
-              <w:right w:val="single" w:sz="4" w:color="D9D9D9"/>
-            </w:tcBorders>
-            <w:vAlign w:val="center"/>
-          </w:tcPr>
-          <w:p>
-            <w:pPr>
-              <w:spacing w:after="40"/>
-            </w:pPr>
-            <w:r>
-              <w:rPr>
-                <w:sz w:val="18"/>
-              </w:rPr>
-              <w:t>NO₂</w:t>
-            </w:r>
-          </w:p>
-        </w:tc>
-        <w:tc>
-          <w:tcPr>
-            <w:tcW w:type="dxa" w:w="1304"/>
-            <w:shd w:fill="FFFFFF"/>
-            <w:tcMar>
-              <w:top w:w="90" w:type="dxa"/>
-              <w:left w:w="90" w:type="dxa"/>
-              <w:bottom w:w="90" w:type="dxa"/>
-              <w:right w:w="90" w:type="dxa"/>
-            </w:tcMar>
-            <w:tcBorders>
-              <w:top w:val="single" w:sz="4" w:color="D9D9D9"/>
-              <w:left w:val="single" w:sz="4" w:color="D9D9D9"/>
-              <w:bottom w:val="single" w:sz="4" w:color="D9D9D9"/>
-              <w:right w:val="single" w:sz="4" w:color="D9D9D9"/>
-            </w:tcBorders>
-            <w:vAlign w:val="center"/>
-          </w:tcPr>
-          <w:p>
-            <w:pPr>
-              <w:spacing w:after="40"/>
-            </w:pPr>
-            <w:r>
-              <w:rPr>
-                <w:sz w:val="18"/>
-              </w:rPr>
-              <w:t>[Wert]</w:t>
-            </w:r>
-          </w:p>
-        </w:tc>
-        <w:tc>
-          <w:tcPr>
-            <w:tcW w:type="dxa" w:w="1417"/>
-            <w:shd w:fill="FFFFFF"/>
-            <w:tcMar>
-              <w:top w:w="90" w:type="dxa"/>
-              <w:left w:w="90" w:type="dxa"/>
-              <w:bottom w:w="90" w:type="dxa"/>
-              <w:right w:w="90" w:type="dxa"/>
-            </w:tcMar>
-            <w:tcBorders>
-              <w:top w:val="single" w:sz="4" w:color="D9D9D9"/>
-              <w:left w:val="single" w:sz="4" w:color="D9D9D9"/>
-              <w:bottom w:val="single" w:sz="4" w:color="D9D9D9"/>
-              <w:right w:val="single" w:sz="4" w:color="D9D9D9"/>
-            </w:tcBorders>
-            <w:vAlign w:val="center"/>
-          </w:tcPr>
-          <w:p>
-            <w:pPr>
-              <w:spacing w:after="40"/>
-            </w:pPr>
-            <w:r>
-              <w:rPr>
-                <w:sz w:val="18"/>
-              </w:rPr>
-              <w:t>[Wert]</w:t>
-            </w:r>
-          </w:p>
-        </w:tc>
-        <w:tc>
-          <w:tcPr>
-            <w:tcW w:type="dxa" w:w="1191"/>
-            <w:shd w:fill="FFFFFF"/>
-            <w:tcMar>
-              <w:top w:w="90" w:type="dxa"/>
-              <w:left w:w="90" w:type="dxa"/>
-              <w:bottom w:w="90" w:type="dxa"/>
-              <w:right w:w="90" w:type="dxa"/>
-            </w:tcMar>
-            <w:tcBorders>
-              <w:top w:val="single" w:sz="4" w:color="D9D9D9"/>
-              <w:left w:val="single" w:sz="4" w:color="D9D9D9"/>
-              <w:bottom w:val="single" w:sz="4" w:color="D9D9D9"/>
-              <w:right w:val="single" w:sz="4" w:color="D9D9D9"/>
-            </w:tcBorders>
-            <w:vAlign w:val="center"/>
-          </w:tcPr>
-          <w:p>
-            <w:pPr>
-              <w:spacing w:after="40"/>
-            </w:pPr>
-            <w:r>
-              <w:rPr>
-                <w:sz w:val="18"/>
-              </w:rPr>
-              <w:t>[Wert]</w:t>
-            </w:r>
-          </w:p>
-        </w:tc>
-        <w:tc>
-          <w:tcPr>
-            <w:tcW w:type="dxa" w:w="1247"/>
-            <w:shd w:fill="FFFFFF"/>
-            <w:tcMar>
-              <w:top w:w="90" w:type="dxa"/>
-              <w:left w:w="90" w:type="dxa"/>
-              <w:bottom w:w="90" w:type="dxa"/>
-              <w:right w:w="90" w:type="dxa"/>
-            </w:tcMar>
-            <w:tcBorders>
-              <w:top w:val="single" w:sz="4" w:color="D9D9D9"/>
-              <w:left w:val="single" w:sz="4" w:color="D9D9D9"/>
-              <w:bottom w:val="single" w:sz="4" w:color="D9D9D9"/>
-              <w:right w:val="single" w:sz="4" w:color="D9D9D9"/>
-            </w:tcBorders>
-            <w:vAlign w:val="center"/>
-          </w:tcPr>
-          <w:p>
-            <w:pPr>
-              <w:spacing w:after="40"/>
-            </w:pPr>
-            <w:r>
-              <w:rPr>
-                <w:sz w:val="18"/>
-              </w:rPr>
-              <w:t>[Bereich]</w:t>
-            </w:r>
-          </w:p>
-        </w:tc>
-        <w:tc>
-          <w:tcPr>
-            <w:tcW w:type="dxa" w:w="1701"/>
-            <w:shd w:fill="FFFFFF"/>
-            <w:tcMar>
-              <w:top w:w="90" w:type="dxa"/>
-              <w:left w:w="90" w:type="dxa"/>
-              <w:bottom w:w="90" w:type="dxa"/>
-              <w:right w:w="90" w:type="dxa"/>
-            </w:tcMar>
-            <w:tcBorders>
-              <w:top w:val="single" w:sz="4" w:color="D9D9D9"/>
-              <w:left w:val="single" w:sz="4" w:color="D9D9D9"/>
-              <w:bottom w:val="single" w:sz="4" w:color="D9D9D9"/>
-              <w:right w:val="single" w:sz="4" w:color="D9D9D9"/>
-            </w:tcBorders>
-            <w:vAlign w:val="center"/>
-          </w:tcPr>
-          <w:p>
-            <w:pPr>
-              <w:spacing w:after="40"/>
-            </w:pPr>
-            <w:r>
-              <w:rPr>
-                <w:sz w:val="18"/>
-              </w:rPr>
-              <w:t>[Farbe]</w:t>
-            </w:r>
-          </w:p>
-        </w:tc>
-        <w:tc>
-          <w:tcPr>
-            <w:tcW w:type="dxa" w:w="1757"/>
+            <w:tcW w:type="dxa" w:w="2041"/>
             <w:shd w:fill="FFFFFF"/>
             <w:tcMar>
               <w:top w:w="90" w:type="dxa"/>
@@ -5203,11 +4897,10 @@
         <w:tblLook w:firstColumn="1" w:firstRow="1" w:lastColumn="0" w:lastRow="0" w:noHBand="0" w:noVBand="1" w:val="04A0"/>
       </w:tblPr>
       <w:tblGrid>
-        <w:gridCol w:w="1701"/>
-        <w:gridCol w:w="1701"/>
-        <w:gridCol w:w="1984"/>
         <w:gridCol w:w="1984"/>
         <w:gridCol w:w="2268"/>
+        <w:gridCol w:w="2551"/>
+        <w:gridCol w:w="2835"/>
       </w:tblGrid>
       <w:tr>
         <w:trPr>
@@ -5216,7 +4909,7 @@
         </w:trPr>
         <w:tc>
           <w:tcPr>
-            <w:tcW w:type="dxa" w:w="1701"/>
+            <w:tcW w:type="dxa" w:w="1984"/>
             <w:shd w:fill="102238"/>
             <w:tcMar>
               <w:top w:w="90" w:type="dxa"/>
@@ -5248,7 +4941,7 @@
         </w:tc>
         <w:tc>
           <w:tcPr>
-            <w:tcW w:type="dxa" w:w="1701"/>
+            <w:tcW w:type="dxa" w:w="2268"/>
             <w:shd w:fill="102238"/>
             <w:tcMar>
               <w:top w:w="90" w:type="dxa"/>
@@ -5280,39 +4973,7 @@
         </w:tc>
         <w:tc>
           <w:tcPr>
-            <w:tcW w:type="dxa" w:w="1984"/>
-            <w:shd w:fill="102238"/>
-            <w:tcMar>
-              <w:top w:w="90" w:type="dxa"/>
-              <w:left w:w="90" w:type="dxa"/>
-              <w:bottom w:w="90" w:type="dxa"/>
-              <w:right w:w="90" w:type="dxa"/>
-            </w:tcMar>
-            <w:tcBorders>
-              <w:top w:val="single" w:sz="4" w:color="D9D9D9"/>
-              <w:left w:val="single" w:sz="4" w:color="D9D9D9"/>
-              <w:bottom w:val="single" w:sz="4" w:color="D9D9D9"/>
-              <w:right w:val="single" w:sz="4" w:color="D9D9D9"/>
-            </w:tcBorders>
-            <w:vAlign w:val="center"/>
-          </w:tcPr>
-          <w:p>
-            <w:pPr>
-              <w:spacing w:after="40"/>
-            </w:pPr>
-            <w:r>
-              <w:rPr>
-                <w:b/>
-                <w:color w:val="FFFFFF"/>
-                <w:sz w:val="18"/>
-              </w:rPr>
-              <w:t>Wellenlänge / nm</w:t>
-            </w:r>
-          </w:p>
-        </w:tc>
-        <w:tc>
-          <w:tcPr>
-            <w:tcW w:type="dxa" w:w="1984"/>
+            <w:tcW w:type="dxa" w:w="2551"/>
             <w:shd w:fill="102238"/>
             <w:tcMar>
               <w:top w:w="90" w:type="dxa"/>
@@ -5344,7 +5005,7 @@
         </w:tc>
         <w:tc>
           <w:tcPr>
-            <w:tcW w:type="dxa" w:w="2268"/>
+            <w:tcW w:type="dxa" w:w="2835"/>
             <w:shd w:fill="102238"/>
             <w:tcMar>
               <w:top w:w="90" w:type="dxa"/>
@@ -5381,7 +5042,7 @@
         </w:trPr>
         <w:tc>
           <w:tcPr>
-            <w:tcW w:type="dxa" w:w="1701"/>
+            <w:tcW w:type="dxa" w:w="1984"/>
             <w:shd w:fill="F3F6FA"/>
             <w:tcMar>
               <w:top w:w="90" w:type="dxa"/>
@@ -5411,7 +5072,7 @@
         </w:tc>
         <w:tc>
           <w:tcPr>
-            <w:tcW w:type="dxa" w:w="1701"/>
+            <w:tcW w:type="dxa" w:w="2268"/>
             <w:shd w:fill="F3F6FA"/>
             <w:tcMar>
               <w:top w:w="90" w:type="dxa"/>
@@ -5441,37 +5102,7 @@
         </w:tc>
         <w:tc>
           <w:tcPr>
-            <w:tcW w:type="dxa" w:w="1984"/>
-            <w:shd w:fill="F3F6FA"/>
-            <w:tcMar>
-              <w:top w:w="90" w:type="dxa"/>
-              <w:left w:w="90" w:type="dxa"/>
-              <w:bottom w:w="90" w:type="dxa"/>
-              <w:right w:w="90" w:type="dxa"/>
-            </w:tcMar>
-            <w:tcBorders>
-              <w:top w:val="single" w:sz="4" w:color="D9D9D9"/>
-              <w:left w:val="single" w:sz="4" w:color="D9D9D9"/>
-              <w:bottom w:val="single" w:sz="4" w:color="D9D9D9"/>
-              <w:right w:val="single" w:sz="4" w:color="D9D9D9"/>
-            </w:tcBorders>
-            <w:vAlign w:val="center"/>
-          </w:tcPr>
-          <w:p>
-            <w:pPr>
-              <w:spacing w:after="40"/>
-            </w:pPr>
-            <w:r>
-              <w:rPr>
-                <w:sz w:val="18"/>
-              </w:rPr>
-              <w:t>[Wert]</w:t>
-            </w:r>
-          </w:p>
-        </w:tc>
-        <w:tc>
-          <w:tcPr>
-            <w:tcW w:type="dxa" w:w="1984"/>
+            <w:tcW w:type="dxa" w:w="2551"/>
             <w:shd w:fill="F3F6FA"/>
             <w:tcMar>
               <w:top w:w="90" w:type="dxa"/>
@@ -5501,7 +5132,7 @@
         </w:tc>
         <w:tc>
           <w:tcPr>
-            <w:tcW w:type="dxa" w:w="2268"/>
+            <w:tcW w:type="dxa" w:w="2835"/>
             <w:shd w:fill="F3F6FA"/>
             <w:tcMar>
               <w:top w:w="90" w:type="dxa"/>
@@ -5536,7 +5167,7 @@
         </w:trPr>
         <w:tc>
           <w:tcPr>
-            <w:tcW w:type="dxa" w:w="1701"/>
+            <w:tcW w:type="dxa" w:w="1984"/>
             <w:shd w:fill="FFFFFF"/>
             <w:tcMar>
               <w:top w:w="90" w:type="dxa"/>
@@ -5566,7 +5197,7 @@
         </w:tc>
         <w:tc>
           <w:tcPr>
-            <w:tcW w:type="dxa" w:w="1701"/>
+            <w:tcW w:type="dxa" w:w="2268"/>
             <w:shd w:fill="FFFFFF"/>
             <w:tcMar>
               <w:top w:w="90" w:type="dxa"/>
@@ -5596,37 +5227,7 @@
         </w:tc>
         <w:tc>
           <w:tcPr>
-            <w:tcW w:type="dxa" w:w="1984"/>
-            <w:shd w:fill="FFFFFF"/>
-            <w:tcMar>
-              <w:top w:w="90" w:type="dxa"/>
-              <w:left w:w="90" w:type="dxa"/>
-              <w:bottom w:w="90" w:type="dxa"/>
-              <w:right w:w="90" w:type="dxa"/>
-            </w:tcMar>
-            <w:tcBorders>
-              <w:top w:val="single" w:sz="4" w:color="D9D9D9"/>
-              <w:left w:val="single" w:sz="4" w:color="D9D9D9"/>
-              <w:bottom w:val="single" w:sz="4" w:color="D9D9D9"/>
-              <w:right w:val="single" w:sz="4" w:color="D9D9D9"/>
-            </w:tcBorders>
-            <w:vAlign w:val="center"/>
-          </w:tcPr>
-          <w:p>
-            <w:pPr>
-              <w:spacing w:after="40"/>
-            </w:pPr>
-            <w:r>
-              <w:rPr>
-                <w:sz w:val="18"/>
-              </w:rPr>
-              <w:t>[Wert]</w:t>
-            </w:r>
-          </w:p>
-        </w:tc>
-        <w:tc>
-          <w:tcPr>
-            <w:tcW w:type="dxa" w:w="1984"/>
+            <w:tcW w:type="dxa" w:w="2551"/>
             <w:shd w:fill="FFFFFF"/>
             <w:tcMar>
               <w:top w:w="90" w:type="dxa"/>
@@ -5656,7 +5257,7 @@
         </w:tc>
         <w:tc>
           <w:tcPr>
-            <w:tcW w:type="dxa" w:w="2268"/>
+            <w:tcW w:type="dxa" w:w="2835"/>
             <w:shd w:fill="FFFFFF"/>
             <w:tcMar>
               <w:top w:w="90" w:type="dxa"/>
@@ -5730,7 +5331,7 @@
         <w:rPr>
           <w:color w:val="586B80"/>
         </w:rPr>
-        <w:t>Längstwelliges Gruppenresultat: [Name und Wellenlänge]</w:t>
+        <w:t>Gruppenresultat mit der kleinsten Energie des Absorptionsmaximums: [Name und Energie]</w:t>
       </w:r>
     </w:p>
     <w:p>

</xml_diff>

<commit_message>
Keep learning goals concise and naming optional
</commit_message>
<xml_diff>
--- a/src/achprak/web/static/materials/protokollvorlage.docx
+++ b/src/achprak/web/static/materials/protokollvorlage.docx
@@ -4875,7 +4875,7 @@
     </w:p>
     <w:p>
       <w:r>
-        <w:t>Benennen und begründen Sie Ihr Substitutionsmuster anhand eines Ergebnisses aus den systematischen Reihen und notieren Sie Ihre Vermutung. Vervollständigen Sie die Tabelle für Ihr cis/trans-Paar und fügen Sie beide Spektren ein. Geben Sie an, ob das Ergebnis den zugrunde gelegten Trend stützt, ihm widerspricht oder keine eindeutige Aussage erlaubt. Notieren Sie außerdem die beiden ausgewählten Gruppenergebnisse mit Namen und dem jeweils entscheidenden Wert.</w:t>
+        <w:t>Geben Sie die Auswahlpositionen und Substituenten Ihres Derivats an, begründen Sie die Wahl anhand eines Ergebnisses aus den systematischen Reihen und notieren Sie Ihre Vermutung. Vervollständigen Sie die Tabelle für Ihr cis/trans-Paar und fügen Sie beide Spektren ein. Geben Sie an, ob das Ergebnis den zugrunde gelegten Trend stützt, ihm widerspricht oder keine eindeutige Aussage erlaubt. Notieren Sie außerdem für beide ausgewählten Gruppenergebnisse die Auswahlpositionen, Substituenten und den jeweils entscheidenden Wert.</w:t>
       </w:r>
     </w:p>
     <w:p>
@@ -4883,7 +4883,7 @@
         <w:rPr>
           <w:color w:val="586B80"/>
         </w:rPr>
-        <w:t>Name und Substitutionsmuster des eigenen Derivats: [Name]</w:t>
+        <w:t>Auswahlpositionen und Substituenten des eigenen Derivats: [Positionen und Gruppen]</w:t>
         <w:br/>
         <w:t>Bezug zur systematischen Reihe und Begründung der Auswahl: [Ergebnis und Begründung]</w:t>
         <w:br/>
@@ -5331,7 +5331,7 @@
         <w:rPr>
           <w:color w:val="586B80"/>
         </w:rPr>
-        <w:t>Gruppenresultat mit der kleinsten Energie des Absorptionsmaximums: [Name und Energie]</w:t>
+        <w:t>Gruppenresultat mit der kleinsten Energie des Absorptionsmaximums: [Positionen, Gruppen und Energie]</w:t>
       </w:r>
     </w:p>
     <w:p>
@@ -5339,7 +5339,7 @@
         <w:rPr>
           <w:color w:val="586B80"/>
         </w:rPr>
-        <w:t>Stärkster vorhergesagter cis/trans-Farbunterschied: [Name und Farben]</w:t>
+        <w:t>Stärkster vorhergesagter cis/trans-Farbunterschied: [Positionen, Gruppen und Farben]</w:t>
       </w:r>
     </w:p>
     <w:sectPr>

</xml_diff>